<commit_message>
Updates, 5 DEC PM
</commit_message>
<xml_diff>
--- a/Watters_Rebutt_Suppl_Mat.docx
+++ b/Watters_Rebutt_Suppl_Mat.docx
@@ -15,7 +15,7 @@
         <w:pStyle w:val="Fecha"/>
       </w:pPr>
       <w:r>
-        <w:t>2025-12-03</w:t>
+        <w:t>2025-12-04</w:t>
       </w:r>
     </w:p>
     <w:p>
@@ -36,8 +36,8 @@
           <w:noProof/>
         </w:rPr>
         <w:drawing>
-          <wp:inline distT="0" distB="0" distL="0" distR="0" wp14:anchorId="46594C3F" wp14:editId="46594C40">
-            <wp:extent cx="4267200" cy="2981569"/>
+          <wp:inline distT="0" distB="0" distL="0" distR="0" wp14:anchorId="4CF62271" wp14:editId="4CF62272">
+            <wp:extent cx="4267200" cy="2560320"/>
             <wp:effectExtent l="0" t="0" r="0" b="0"/>
             <wp:docPr id="21" name="Picture" descr="Figure S1: Survey coverage (total transect length surveyed) by gSSMU and year (up). Frequency distribution of total transect length, including the 10th percentile (dashed line) is shown below."/>
             <wp:cNvGraphicFramePr/>
@@ -59,7 +59,7 @@
                   <pic:spPr bwMode="auto">
                     <a:xfrm>
                       <a:off x="0" y="0"/>
-                      <a:ext cx="4267200" cy="2981569"/>
+                      <a:ext cx="4267200" cy="2560320"/>
                     </a:xfrm>
                     <a:prstGeom prst="rect">
                       <a:avLst/>
@@ -82,8 +82,8 @@
           <w:noProof/>
         </w:rPr>
         <w:drawing>
-          <wp:inline distT="0" distB="0" distL="0" distR="0" wp14:anchorId="46594C41" wp14:editId="46594C42">
-            <wp:extent cx="4267200" cy="2981569"/>
+          <wp:inline distT="0" distB="0" distL="0" distR="0" wp14:anchorId="4CF62273" wp14:editId="4CF62274">
+            <wp:extent cx="4267200" cy="2560320"/>
             <wp:effectExtent l="0" t="0" r="0" b="0"/>
             <wp:docPr id="24" name="Picture" descr="Figure S1: Survey coverage (total transect length surveyed) by gSSMU and year (up). Frequency distribution of total transect length, including the 10th percentile (dashed line) is shown below."/>
             <wp:cNvGraphicFramePr/>
@@ -105,7 +105,7 @@
                   <pic:spPr bwMode="auto">
                     <a:xfrm>
                       <a:off x="0" y="0"/>
-                      <a:ext cx="4267200" cy="2981569"/>
+                      <a:ext cx="4267200" cy="2560320"/>
                     </a:xfrm>
                     <a:prstGeom prst="rect">
                       <a:avLst/>
@@ -129,7 +129,6 @@
         <w:pStyle w:val="Textoindependiente"/>
       </w:pPr>
       <w:r>
-        <w:lastRenderedPageBreak/>
         <w:t>Figure S1. Survey coverage (total transect length surveyed) by gSSMU and year (up). Frequency distribution of total transect length, including the 10th percentile (dashed line) is shown below.</w:t>
       </w:r>
     </w:p>
@@ -140,6 +139,7 @@
       <w:bookmarkStart w:id="1" w:name="b.-imputed-summer-lkb-values"/>
       <w:bookmarkEnd w:id="0"/>
       <w:r>
+        <w:lastRenderedPageBreak/>
         <w:t>B. Imputed summer LKB values</w:t>
       </w:r>
     </w:p>
@@ -172,6 +172,7 @@
         <w:gridCol w:w="930"/>
         <w:gridCol w:w="797"/>
         <w:gridCol w:w="983"/>
+        <w:gridCol w:w="1329"/>
       </w:tblGrid>
       <w:tr>
         <w:trPr>
@@ -261,6 +262,20 @@
             </w:r>
           </w:p>
         </w:tc>
+        <w:tc>
+          <w:tcPr>
+            <w:tcW w:w="0" w:type="auto"/>
+          </w:tcPr>
+          <w:p>
+            <w:pPr>
+              <w:pStyle w:val="Compact"/>
+              <w:jc w:val="right"/>
+            </w:pPr>
+            <w:r>
+              <w:t>Mean_LKB</w:t>
+            </w:r>
+          </w:p>
+        </w:tc>
       </w:tr>
       <w:tr>
         <w:tc>
@@ -342,7 +357,21 @@
               <w:jc w:val="right"/>
             </w:pPr>
             <w:r>
-              <w:t>0.270</w:t>
+              <w:t>0.260</w:t>
+            </w:r>
+          </w:p>
+        </w:tc>
+        <w:tc>
+          <w:tcPr>
+            <w:tcW w:w="0" w:type="auto"/>
+          </w:tcPr>
+          <w:p>
+            <w:pPr>
+              <w:pStyle w:val="Compact"/>
+              <w:jc w:val="right"/>
+            </w:pPr>
+            <w:r>
+              <w:t>841401.3</w:t>
             </w:r>
           </w:p>
         </w:tc>
@@ -431,6 +460,20 @@
             </w:r>
           </w:p>
         </w:tc>
+        <w:tc>
+          <w:tcPr>
+            <w:tcW w:w="0" w:type="auto"/>
+          </w:tcPr>
+          <w:p>
+            <w:pPr>
+              <w:pStyle w:val="Compact"/>
+              <w:jc w:val="right"/>
+            </w:pPr>
+            <w:r>
+              <w:t>1647467.9</w:t>
+            </w:r>
+          </w:p>
+        </w:tc>
       </w:tr>
       <w:tr>
         <w:tc>
@@ -512,7 +555,21 @@
               <w:jc w:val="right"/>
             </w:pPr>
             <w:r>
-              <w:t>0.096</w:t>
+              <w:t>0.092</w:t>
+            </w:r>
+          </w:p>
+        </w:tc>
+        <w:tc>
+          <w:tcPr>
+            <w:tcW w:w="0" w:type="auto"/>
+          </w:tcPr>
+          <w:p>
+            <w:pPr>
+              <w:pStyle w:val="Compact"/>
+              <w:jc w:val="right"/>
+            </w:pPr>
+            <w:r>
+              <w:t>2701181.9</w:t>
             </w:r>
           </w:p>
         </w:tc>
@@ -598,6 +655,20 @@
             </w:pPr>
             <w:r>
               <w:t>NA</w:t>
+            </w:r>
+          </w:p>
+        </w:tc>
+        <w:tc>
+          <w:tcPr>
+            <w:tcW w:w="0" w:type="auto"/>
+          </w:tcPr>
+          <w:p>
+            <w:pPr>
+              <w:pStyle w:val="Compact"/>
+              <w:jc w:val="right"/>
+            </w:pPr>
+            <w:r>
+              <w:t>5456188.0</w:t>
             </w:r>
           </w:p>
         </w:tc>
@@ -611,10 +682,9 @@
         <w:rPr>
           <w:noProof/>
         </w:rPr>
-        <w:lastRenderedPageBreak/>
         <w:drawing>
-          <wp:inline distT="0" distB="0" distL="0" distR="0" wp14:anchorId="46594C43" wp14:editId="46594C44">
-            <wp:extent cx="4267200" cy="2981569"/>
+          <wp:inline distT="0" distB="0" distL="0" distR="0" wp14:anchorId="4CF62275" wp14:editId="4CF62276">
+            <wp:extent cx="4267200" cy="2560320"/>
             <wp:effectExtent l="0" t="0" r="0" b="0"/>
             <wp:docPr id="28" name="Picture"/>
             <wp:cNvGraphicFramePr/>
@@ -636,7 +706,7 @@
                   <pic:spPr bwMode="auto">
                     <a:xfrm>
                       <a:off x="0" y="0"/>
-                      <a:ext cx="4267200" cy="2981569"/>
+                      <a:ext cx="4267200" cy="2560320"/>
                     </a:xfrm>
                     <a:prstGeom prst="rect">
                       <a:avLst/>
@@ -659,8 +729,8 @@
           <w:noProof/>
         </w:rPr>
         <w:drawing>
-          <wp:inline distT="0" distB="0" distL="0" distR="0" wp14:anchorId="46594C45" wp14:editId="46594C46">
-            <wp:extent cx="4267200" cy="2981569"/>
+          <wp:inline distT="0" distB="0" distL="0" distR="0" wp14:anchorId="4CF62277" wp14:editId="4CF62278">
+            <wp:extent cx="4267200" cy="2560320"/>
             <wp:effectExtent l="0" t="0" r="0" b="0"/>
             <wp:docPr id="31" name="Picture"/>
             <wp:cNvGraphicFramePr/>
@@ -682,7 +752,7 @@
                   <pic:spPr bwMode="auto">
                     <a:xfrm>
                       <a:off x="0" y="0"/>
-                      <a:ext cx="4267200" cy="2981569"/>
+                      <a:ext cx="4267200" cy="2560320"/>
                     </a:xfrm>
                     <a:prstGeom prst="rect">
                       <a:avLst/>
@@ -706,7 +776,11 @@
         <w:pStyle w:val="Textoindependiente"/>
       </w:pPr>
       <w:r>
-        <w:t>Figure S2. Krill survey estimates (LKB) for the study period. Top: gSSMU #2 (SSIW-EI); Bottm:gSSMU #1 (BS). Filled circles: Survey data from Watters et al. (2020); Open circles: mean imputed median LKB-value for -/+ SAM; filled triangles: survey data from Wang et al. (2025).</w:t>
+        <w:t xml:space="preserve">Figure S2. Krill survey estimates (LKB) for the study period. Top: gSSMU #2 (SSIW-EI); Bottom:gSSMU #1 (BS). Filled circles: Survey data from Watters et al. (2020); Open circles: </w:t>
+      </w:r>
+      <w:r>
+        <w:lastRenderedPageBreak/>
+        <w:t>mean imputed median LKB-value for -/+ SAM; filled triangles: survey data from Wang et al. (2025).</w:t>
       </w:r>
     </w:p>
     <w:p>
@@ -717,10 +791,9 @@
         <w:rPr>
           <w:noProof/>
         </w:rPr>
-        <w:lastRenderedPageBreak/>
         <w:drawing>
-          <wp:inline distT="0" distB="0" distL="0" distR="0" wp14:anchorId="46594C47" wp14:editId="46594C48">
-            <wp:extent cx="4267200" cy="2981569"/>
+          <wp:inline distT="0" distB="0" distL="0" distR="0" wp14:anchorId="4CF62279" wp14:editId="4CF6227A">
+            <wp:extent cx="4267200" cy="2987040"/>
             <wp:effectExtent l="0" t="0" r="0" b="0"/>
             <wp:docPr id="34" name="Picture"/>
             <wp:cNvGraphicFramePr/>
@@ -742,7 +815,7 @@
                   <pic:spPr bwMode="auto">
                     <a:xfrm>
                       <a:off x="0" y="0"/>
-                      <a:ext cx="4267200" cy="2981569"/>
+                      <a:ext cx="4267200" cy="2987040"/>
                     </a:xfrm>
                     <a:prstGeom prst="rect">
                       <a:avLst/>
@@ -778,8 +851,8 @@
           <w:noProof/>
         </w:rPr>
         <w:drawing>
-          <wp:inline distT="0" distB="0" distL="0" distR="0" wp14:anchorId="46594C49" wp14:editId="46594C4A">
-            <wp:extent cx="4267200" cy="2981569"/>
+          <wp:inline distT="0" distB="0" distL="0" distR="0" wp14:anchorId="4CF6227B" wp14:editId="4CF6227C">
+            <wp:extent cx="4267200" cy="2987040"/>
             <wp:effectExtent l="0" t="0" r="0" b="0"/>
             <wp:docPr id="37" name="Picture"/>
             <wp:cNvGraphicFramePr/>
@@ -801,7 +874,7 @@
                   <pic:spPr bwMode="auto">
                     <a:xfrm>
                       <a:off x="0" y="0"/>
-                      <a:ext cx="4267200" cy="2981569"/>
+                      <a:ext cx="4267200" cy="2987040"/>
                     </a:xfrm>
                     <a:prstGeom prst="rect">
                       <a:avLst/>
@@ -833,7 +906,11 @@
         <w:pStyle w:val="Textoindependiente"/>
       </w:pPr>
       <w:r>
-        <w:t>Watters et al. extracted the mean ln(K) from a uniform distribution, ranging from 0.1k to 10k. If applied to the mean-ln(LKB) for gSSMU #1 and -SAM (Table S1), the values range from 1.364-136.43 [ln(LKB) ~ U(0.1k, 10k); k = 13.643]. At the same time, the imputed LKB were truncated, so the minimum LKB = 10,000 tonnes (ln(k) = 9.2103) and maximum LKB = 100,000,000 tonnes (ln(lkb) = 18.4207. This means that imputed mean-ln(LKB) will be larger than the maximum, thus, 1x10^8 tonnes. Same goes for sd(lkb). As result, the distribution of the imputed ln(LKB) values are skewed up (Figure S4).</w:t>
+        <w:t xml:space="preserve">Watters et al. extracted the mean ln(K) from a uniform distribution, ranging from 0.1k to 10k. If applied to the mean-ln(LKB) for gSSMU #1 and -SAM (Table S1), the values range from 1.364-136.43 [ln(LKB) ~ U(0.1k, 10k); k = 13.643]. At the same time, the imputed LKB were truncated, so the minimum LKB = 10,000 tonnes (ln(k) = 9.2103) and maximum LKB </w:t>
+      </w:r>
+      <w:r>
+        <w:lastRenderedPageBreak/>
+        <w:t>= 100,000,000 tonnes (ln(lkb) = 18.4207. This means that imputed mean-ln(LKB) will be larger than the maximum, thus, 1x10^8 tonnes. Same goes for sd(lkb). As result, the distribution of the imputed ln(LKB) values are skewed up (Figure S4).</w:t>
       </w:r>
     </w:p>
     <w:p>
@@ -844,10 +921,9 @@
         <w:rPr>
           <w:noProof/>
         </w:rPr>
-        <w:lastRenderedPageBreak/>
         <w:drawing>
-          <wp:inline distT="0" distB="0" distL="0" distR="0" wp14:anchorId="46594C4B" wp14:editId="46594C4C">
-            <wp:extent cx="4267200" cy="2981569"/>
+          <wp:inline distT="0" distB="0" distL="0" distR="0" wp14:anchorId="4CF6227D" wp14:editId="4CF6227E">
+            <wp:extent cx="4267200" cy="2987040"/>
             <wp:effectExtent l="0" t="0" r="0" b="0"/>
             <wp:docPr id="40" name="Picture"/>
             <wp:cNvGraphicFramePr/>
@@ -869,7 +945,7 @@
                   <pic:spPr bwMode="auto">
                     <a:xfrm>
                       <a:off x="0" y="0"/>
-                      <a:ext cx="4267200" cy="2981569"/>
+                      <a:ext cx="4267200" cy="2987040"/>
                     </a:xfrm>
                     <a:prstGeom prst="rect">
                       <a:avLst/>
@@ -898,6 +974,14 @@
     </w:p>
     <w:p>
       <w:pPr>
+        <w:pStyle w:val="Textoindependiente"/>
+      </w:pPr>
+      <w:r>
+        <w:t>The removal of the equation (2), K ~ U(0.1k, 10k), corrects the issue observed in figure S4.</w:t>
+      </w:r>
+    </w:p>
+    <w:p>
+      <w:pPr>
         <w:pStyle w:val="Ttulo1"/>
       </w:pPr>
       <w:bookmarkStart w:id="2" w:name="citations"/>
@@ -965,7 +1049,7 @@
   <w:abstractNum w:abstractNumId="0" w15:restartNumberingAfterBreak="0">
     <w:nsid w:val="0000A990"/>
     <w:multiLevelType w:val="multilevel"/>
-    <w:tmpl w:val="3EB28068"/>
+    <w:tmpl w:val="33161CC2"/>
     <w:lvl w:ilvl="0">
       <w:numFmt w:val="bullet"/>
       <w:lvlText w:val=" "/>
@@ -1039,7 +1123,7 @@
       </w:pPr>
     </w:lvl>
   </w:abstractNum>
-  <w:num w:numId="1" w16cid:durableId="1819762289">
+  <w:num w:numId="1" w16cid:durableId="1127891179">
     <w:abstractNumId w:val="0"/>
   </w:num>
 </w:numbering>

</xml_diff>

<commit_message>
Updates to 29 JAN 2026
</commit_message>
<xml_diff>
--- a/Watters_Rebutt_Suppl_Mat.docx
+++ b/Watters_Rebutt_Suppl_Mat.docx
@@ -1232,7 +1232,10 @@
         <w:pStyle w:val="Textoindependiente"/>
       </w:pPr>
       <w:r>
-        <w:t>Across supported cases, penguin performance varied most strongly among ONI categories. Comparisons between otherwise identical cases differing only in ONI (e.g., cases 1–2, 7–8, and 13–14) showed consistently higher performance under negative ONI conditions and lower performance under intermediate ONI conditions, based on summer-derived indices. Winter observations were sparse but included the lowest performance values observed, particularly for the combination −0.5 &lt; ONI &lt; 0.5, LKB &gt; 1 Mt, and 0.01 &lt; LHR &lt; 0.10 (case 10).</w:t>
+        <w:t>Across supported cases, penguin performance varied most strongly among ONI categories. Comparisons between otherwise identical cases differing only in ONI (e.g., cases 1–2, 7–8, and 13–14) showed consistently higher performance under negative ONI conditions and lower performance under intermediate ONI conditions, based on summer-derived indices. Winter observations were sparse but included the lowest performance values observed, particularly for the combination −0.5 &lt; ONI &lt; 0.5, LKB &gt; 1 Mt, and 0.01 &lt; LHR &lt;</w:t>
+      </w:r>
+      <w:r>
+        <w:t xml:space="preserve"> 0.10 (case 10).</w:t>
       </w:r>
     </w:p>
     <w:p>
@@ -1248,7 +1251,10 @@
         <w:pStyle w:val="Textoindependiente"/>
       </w:pPr>
       <w:r>
-        <w:t>Posterior expectations of penguin performance after filtering for survey coverage (Figure S5) were broadly similar to those reported by Watters et al. (2020, Supplementary Figure S8), but differed in three key respects. First, the nominal "worst case" scenario no longer produced the lowest expected performance and instead lay close to the long-term mean. Second, scenarios with high harvest rates (LHR ≥0.10) exhibited median performance comparable to the "best case." Third, the lowest median performance was associated with intermediate harvest rates (0.01 &lt; LHR &lt; 0.10; equivalent to case 3), followed by intermediate ONI conditions (equivalent to case 7; Figure S5). These patterns were maintained, and further accentuated, when missing summer LKB values were imputed (Figure S7). Consistent with Watters et al. (2020), variation in LKB (&lt;1 Mt versus &gt;1 Mt) exhibited the weakest association with penguin performance.</w:t>
+        <w:t xml:space="preserve">Posterior expectations of penguin performance after filtering for survey coverage (Figure S5) were broadly similar to those reported by Watters et al. (2020, Supplementary Figure S8), but differed in three key respects. First, the nominal "worst case" scenario no longer produced the lowest expected performance and instead lay close to the long-term mean. Second, scenarios with high harvest rates (LHR ≥0.10) exhibited median performance comparable to the "best case." Third, the lowest median performance was </w:t>
+      </w:r>
+      <w:r>
+        <w:t>associated with intermediate harvest rates (0.01 &lt; LHR &lt; 0.10; equivalent to case 3), followed by intermediate ONI conditions (equivalent to case 7; Figure S5). These patterns were maintained, and further accentuated, when missing summer LKB values were imputed (Figure S7). Consistent with Watters et al. (2020), variation in LKB (&lt;1 Mt versus &gt;1 Mt) exhibited the weakest association with penguin performance.</w:t>
       </w:r>
     </w:p>
     <w:p>
@@ -2004,7 +2010,10 @@
       </w:r>
       <w:r>
         <w:lastRenderedPageBreak/>
-        <w:t>summer LKB were not imputed. Case 1 is ONI ≤ -0.5°C; LKB ≤ 1 Mt; and LHR ≤ 0.01 (the “best case”). Case 2 is ONI ≤ -0.5°C; LKB &gt; 1 Mt; and LHR ≤ 0.01. Case 3 is ONI ≤ -0.5°C; LKB ≤ 1 Mt; and 0.01 &lt; LHR &lt; 0.1. Case 4 is ONI ≤ -0.5°C; LKB &gt; 1 Mt; and 0.01 &lt; LHR &lt; 0.1. Case 5 is ONI ≤ -0.5°C; LKB ≤ 1 Mt; and LHR ≥ 0.1. Case 6 is ONI ≤ -0.5°C; LKB &gt; 1 Mt; and LHR ≥ 0.1. Cases 7-12 are the same as Cases 1-6 except -0.5°C &lt; ONI &lt; 0.5°C; Case 12 is the “worst case.” Cases 13-18 are the same as Cases 1-6 except ONI ≥ 0.5°C. Filled red circles represent summer observations from krill surveys. Blue circles represent winter observations. Boxes characterize interquartile ranges with medians indicated by bold horizontal lines and whiskers extending to 1.5 times these ranges.</w:t>
+        <w:t>summer LKB were not imputed. Case 1 is ONI ≤ -0.5°C; LKB ≤ 1 Mt; and LHR ≤ 0.01 (the “best case”). Case 2 is ONI ≤ -0.5°C; LKB &gt; 1 Mt; and LHR ≤ 0.01. Case 3 is ONI ≤ -0.5°C; LKB ≤ 1 Mt; and 0.01 &lt; LHR &lt; 0.1. Case 4 is ONI ≤ -0.5°C; LKB &gt; 1 Mt; and 0.01 &lt; LHR &lt; 0.1. Case 5 is ONI ≤ -0.5°C; LKB ≤ 1 Mt; and LHR ≥ 0.1. Case 6 is ONI ≤ -0.5°C; LKB &gt; 1 Mt; and LHR ≥ 0.1. Cases 7-12 are the same as Cases 1-6 except -0.5°C &lt; ONI &lt; 0.5°C; Case 12 is the “worst case.” Cases 13-18 are the same as Cases 1-6 except ONI</w:t>
+      </w:r>
+      <w:r>
+        <w:t xml:space="preserve"> ≥ 0.5°C. Filled red circles represent summer observations from krill surveys. Blue circles represent winter observations. Boxes characterize interquartile ranges with medians indicated by bold horizontal lines and whiskers extending to 1.5 times these ranges.</w:t>
       </w:r>
     </w:p>
     <w:p>
@@ -2063,7 +2072,10 @@
         <w:pStyle w:val="Textoindependiente"/>
       </w:pPr>
       <w:r>
-        <w:t>Figure S5. Posterior expectations of penguin performance from the sensitivity test in which: low coverage survey data was removed, and missing summer LKB were not imputed. The “best case” is ONI ≤ -0.5; LKB ≤ 1 Mt; and LHR ≤ 0.01. The “worst case” is -0.5 &lt; ONI &lt; 0.5; LKB &gt; 1 Mt, and LHR ≥ 0.1. All other cases are marginal deviations from the best case. The median, interquartile range, and range of the posterior expectations are provided for each boxplot. Reference lines respectively indicate the median expected performance in the best case (dashed line) and the long-term mean performance (solid line). As per Supplementary Fig. S8, Watters et al. (2020).</w:t>
+        <w:t>Figure S5. Posterior expectations of penguin performance from the sensitivity test in which: low coverage survey data was removed, and missing summer LKB were not imputed. The “best case” is ONI ≤ -0.5; LKB ≤ 1 Mt; and LHR ≤ 0.01. The “worst case” is -0.5 &lt; ONI &lt; 0.5; LKB &gt; 1 Mt, and LHR ≥ 0.1. All other cases are marginal deviations from the best case. The median, interquartile range, and range of the posterior expectations are provided for each boxplot. Reference lines respectively indicate the median exp</w:t>
+      </w:r>
+      <w:r>
+        <w:t>ected performance in the best case (dashed line) and the long-term mean performance (solid line). As per Supplementary Fig. S8, Watters et al. (2020).</w:t>
       </w:r>
     </w:p>
     <w:p>
@@ -2123,7 +2135,10 @@
         <w:pStyle w:val="Textoindependiente"/>
       </w:pPr>
       <w:r>
-        <w:t>Figure S6. Posterior predictive distributions (boxplots) and jittered observations (colored circles) of penguin performance, after removing low coverage survey data; missing summer LKB were imputed according to values in Table 1. Case 1 is ONI ≤ -0.5°C; LKB ≤ 1 Mt; and LHR ≤ 0.01 (the “best case”). Case 2 is ONI ≤ -0.5°C; LKB &gt; 1 Mt; and LHR ≤ 0.01. Case 3 is ONI ≤ -0.5°C; LKB ≤ 1 Mt; and 0.01 &lt; LHR &lt; 0.1. Case 4 is ONI ≤ -0.5°C; LKB &gt; 1 Mt; and 0.01 &lt; LHR &lt; 0.1. Case 5 is ONI ≤ -0.5°C; LKB ≤ 1 Mt; and LHR ≥ 0.1. Case 6 is ONI ≤ -0.5°C; LKB &gt; 1 Mt; and LHR ≥ 0.1. Cases 7-12 are the same as Cases 1-6 except -0.5°C &lt; ONI &lt; 0.5°C; Case 12 is the “worst case.” Cases 13-18 are the same as Cases 1-6 except ONI ≥ 0.5°C. Filled red circles represent summer observations from krill surveys. Blue circles represent winter observations. Boxes characterize interquartile ranges with medians indicated by bold horizontal lines and whiskers extending to 1.5 times these ranges.</w:t>
+        <w:t xml:space="preserve">Figure S6. Posterior predictive distributions (boxplots) and jittered observations (colored circles) of penguin performance, after removing low coverage survey data; missing summer LKB were imputed according to values in Table 1. Case 1 is ONI ≤ -0.5°C; LKB ≤ 1 Mt; and LHR ≤ 0.01 (the “best case”). Case 2 is ONI ≤ -0.5°C; LKB &gt; 1 Mt; and LHR ≤ 0.01. Case 3 is ONI ≤ -0.5°C; LKB ≤ 1 Mt; and 0.01 &lt; LHR &lt; 0.1. Case 4 is ONI ≤ -0.5°C; LKB &gt; 1 Mt; and 0.01 &lt; LHR &lt; 0.1. Case 5 is ONI ≤ -0.5°C; LKB ≤ 1 Mt; and LHR </w:t>
+      </w:r>
+      <w:r>
+        <w:t>≥ 0.1. Case 6 is ONI ≤ -0.5°C; LKB &gt; 1 Mt; and LHR ≥ 0.1. Cases 7-12 are the same as Cases 1-6 except -0.5°C &lt; ONI &lt; 0.5°C; Case 12 is the “worst case.” Cases 13-18 are the same as Cases 1-6 except ONI ≥ 0.5°C. Filled red circles represent summer observations from krill surveys. Blue circles represent winter observations. Boxes characterize interquartile ranges with medians indicated by bold horizontal lines and whiskers extending to 1.5 times these ranges.</w:t>
       </w:r>
     </w:p>
     <w:p>
@@ -2183,7 +2198,10 @@
         <w:pStyle w:val="Textoindependiente"/>
       </w:pPr>
       <w:r>
-        <w:t>Figure S7. Posterior expectations of penguin performance from the sensitivity test in which: low coverage survey data was removed; missing summer LKB were imputed according to values in Table 1. The “best case” is ONI ≤ -0.5; LKB ≤ 1 Mt; and LHR ≤ 0.01. The “worst case” is -0.5 &lt; ONI &lt; 0.5; LKB &gt; 1 Mt, and LHR ≥ 0.1. All other cases are marginal deviations from the best case. The median, interquartile range, and range of the posterior expectations are provided for each boxplot. Reference lines respectively indicate the median expected performance in the best case (dashed line) and the long-term mean performance (solid line). As per Supplementary Fig. S8, Watters et al. (2020).</w:t>
+        <w:t xml:space="preserve">Figure S7. Posterior expectations of penguin performance from the sensitivity test in which: low coverage survey data was removed; missing summer LKB were imputed according to values in Table 1. The “best case” is ONI ≤ -0.5; LKB ≤ 1 Mt; and LHR ≤ 0.01. The “worst case” is -0.5 &lt; ONI &lt; 0.5; LKB &gt; 1 Mt, and LHR ≥ 0.1. All other cases are marginal deviations from the best case. The median, interquartile range, and range of the posterior expectations are provided for each boxplot. Reference lines respectively </w:t>
+      </w:r>
+      <w:r>
+        <w:t>indicate the median expected performance in the best case (dashed line) and the long-term mean performance (solid line). As per Supplementary Fig. S8, Watters et al. (2020).</w:t>
       </w:r>
     </w:p>
     <w:p>
@@ -2201,7 +2219,10 @@
         <w:pStyle w:val="FirstParagraph"/>
       </w:pPr>
       <w:r>
-        <w:t>Estimates of krill consumption by major predator groups during the study period have been previously summarized by Hill et al. (2007). During summer, fish accounted for the largest proportion of krill consumption, with estimated removals of 1,425,193 in the Bransfield Strait (gSMSMU #1: APBSW + APBSE) and 845,772 in the Drake Passage (gSSMU #2: APDPW + APDPE). Combined summer consumption by penguins and whales was estimated at 444,674 in the Bransfield Strait and 328,774 in the Drake Passage. Total summer krill consumption therefore exceeded 1 Mt in both gSSMU 1 and gSSMU 2.</w:t>
+        <w:t>Estimates of krill consumption by major predator groups during the study period have been previously summarized by Hill et al. (2007). During summer, fish accounted for the largest proportion of krill consumption, with estimated removals of 1,425,193 in the Bransfield Strait (gSMSMU #1: APBSW + APBSE) and 845,772 in the Drake Passage (gSSMU #2: APDPW + APDPE). Combined summer consumption by penguins and whales was estimated at 444,674 in the Bransfield Strait and 328,774 in the Drake Passage. Total summer k</w:t>
+      </w:r>
+      <w:r>
+        <w:t>rill consumption therefore exceeded 1 Mt in both gSSMU 1 and gSSMU 2.</w:t>
       </w:r>
     </w:p>
     <w:p>

</xml_diff>

<commit_message>
update 29 JAN 2026
</commit_message>
<xml_diff>
--- a/Watters_Rebutt_Suppl_Mat.docx
+++ b/Watters_Rebutt_Suppl_Mat.docx
@@ -15,7 +15,7 @@
         <w:pStyle w:val="Fecha"/>
       </w:pPr>
       <w:r>
-        <w:t>2026-01-12</w:t>
+        <w:t>2026-01-29</w:t>
       </w:r>
     </w:p>
     <w:p>
@@ -53,7 +53,7 @@
         </w:rPr>
         <w:lastRenderedPageBreak/>
         <w:drawing>
-          <wp:inline distT="0" distB="0" distL="0" distR="0" wp14:anchorId="36490B82" wp14:editId="36490B83">
+          <wp:inline distT="0" distB="0" distL="0" distR="0" wp14:anchorId="6D3B25F0" wp14:editId="6D3B25F1">
             <wp:extent cx="4267200" cy="2560320"/>
             <wp:effectExtent l="0" t="0" r="0" b="0"/>
             <wp:docPr id="21" name="Picture"/>
@@ -99,7 +99,7 @@
           <w:noProof/>
         </w:rPr>
         <w:drawing>
-          <wp:inline distT="0" distB="0" distL="0" distR="0" wp14:anchorId="36490B84" wp14:editId="36490B85">
+          <wp:inline distT="0" distB="0" distL="0" distR="0" wp14:anchorId="6D3B25F2" wp14:editId="6D3B25F3">
             <wp:extent cx="4267200" cy="2560320"/>
             <wp:effectExtent l="0" t="0" r="0" b="0"/>
             <wp:docPr id="24" name="Picture"/>
@@ -1082,7 +1082,7 @@
         </w:rPr>
         <w:lastRenderedPageBreak/>
         <w:drawing>
-          <wp:inline distT="0" distB="0" distL="0" distR="0" wp14:anchorId="36490B86" wp14:editId="36490B87">
+          <wp:inline distT="0" distB="0" distL="0" distR="0" wp14:anchorId="6D3B25F4" wp14:editId="6D3B25F5">
             <wp:extent cx="4267200" cy="2983706"/>
             <wp:effectExtent l="0" t="0" r="0" b="0"/>
             <wp:docPr id="28" name="Picture"/>
@@ -1141,7 +1141,7 @@
           <w:noProof/>
         </w:rPr>
         <w:drawing>
-          <wp:inline distT="0" distB="0" distL="0" distR="0" wp14:anchorId="36490B88" wp14:editId="36490B89">
+          <wp:inline distT="0" distB="0" distL="0" distR="0" wp14:anchorId="6D3B25F6" wp14:editId="6D3B25F7">
             <wp:extent cx="4267200" cy="2769576"/>
             <wp:effectExtent l="0" t="0" r="0" b="0"/>
             <wp:docPr id="31" name="Picture"/>
@@ -1215,16 +1215,7 @@
         <w:pStyle w:val="Textoindependiente"/>
       </w:pPr>
       <w:r>
-        <w:t>Posterior predictive distributions showed that only a subset of the possible ONI–LKB–LHR combinations were supported by empirical observations (Figure S4; Table S3). Most data were concentrated in summer cases with low harvest rates (LHR ≤0.01) across all ONI categories and both LKB classes, together with a limited number of winter cases characterized by intermediate or high harvest rates. Several combinations, including the nominal "worst case" scenario (−0.5 &lt; ONI &lt; 0.5; LKB &gt; 1 Mt; LHR ≥0.10)</w:t>
-      </w:r>
-      <w:r>
-        <w:t xml:space="preserve"> had </w:t>
-      </w:r>
-      <w:r>
-        <w:t>no</w:t>
-      </w:r>
-      <w:r>
-        <w:t xml:space="preserve"> empirical observations.</w:t>
+        <w:t>Posterior predictive distributions showed that only a subset of the possible ONI–LKB–LHR combinations were supported by empirical observations (Figure S4; Table S3). Most data were concentrated in summer cases with low harvest rates (LHR ≤0.01) across all ONI categories and both LKB classes, together with a limited number of winter cases characterized by intermediate or high harvest rates. Several combinations, including the nominal “worst case” scenario (−0.5 &lt; ONI &lt; 0.5; LKB &gt; 1 Mt; LHR ≥0.10), had no empirical observations.</w:t>
       </w:r>
     </w:p>
     <w:p>
@@ -1232,10 +1223,7 @@
         <w:pStyle w:val="Textoindependiente"/>
       </w:pPr>
       <w:r>
-        <w:t>Across supported cases, penguin performance varied most strongly among ONI categories. Comparisons between otherwise identical cases differing only in ONI (e.g., cases 1–2, 7–8, and 13–14) showed consistently higher performance under negative ONI conditions and lower performance under intermediate ONI conditions, based on summer-derived indices. Winter observations were sparse but included the lowest performance values observed, particularly for the combination −0.5 &lt; ONI &lt; 0.5, LKB &gt; 1 Mt, and 0.01 &lt; LHR &lt;</w:t>
-      </w:r>
-      <w:r>
-        <w:t xml:space="preserve"> 0.10 (case 10).</w:t>
+        <w:t>Across supported cases, penguin performance varied most strongly among ONI categories. Comparisons between otherwise identical cases differing only in ONI (e.g., cases 1–2, 7–8, and 13–14) showed consistently higher performance under negative ONI conditions and lower performance under intermediate ONI conditions, based on summer-derived indices. Winter observations were sparse but included the lowest performance values observed, particularly for the combination −0.5 &lt; ONI &lt; 0.5, LKB &gt; 1 Mt, and 0.01 &lt; LHR &lt; 0.10 (case 10).</w:t>
       </w:r>
     </w:p>
     <w:p>
@@ -1243,7 +1231,7 @@
         <w:pStyle w:val="Textoindependiente"/>
       </w:pPr>
       <w:r>
-        <w:t>Imputing missing summer LKB values resulted in only minor changes to posterior predictive distributions of penguin performance (Figure S6). The primary effect was increased support for reduced performance in case 9 (−0.5 &lt; ONI &lt; 0.5; LKB ≤ 1 Mt; 0.01 &lt; LHR &lt; 0.10). The nominal "worst case" scenario (case 12) remained unsupported by either observed or imputed data.</w:t>
+        <w:t>Imputing missing summer LKB values resulted in only minor changes to posterior predictive distributions of penguin performance (Figure S6). The primary effect was increased support for reduced performance in case 9 (−0.5 &lt; ONI &lt; 0.5; LKB ≤ 1 Mt; 0.01 &lt; LHR &lt; 0.10). The nominal “worst case” scenario (case 12) remained unsupported by either observed or imputed data.</w:t>
       </w:r>
     </w:p>
     <w:p>
@@ -1251,10 +1239,7 @@
         <w:pStyle w:val="Textoindependiente"/>
       </w:pPr>
       <w:r>
-        <w:t xml:space="preserve">Posterior expectations of penguin performance after filtering for survey coverage (Figure S5) were broadly similar to those reported by Watters et al. (2020, Supplementary Figure S8), but differed in three key respects. First, the nominal "worst case" scenario no longer produced the lowest expected performance and instead lay close to the long-term mean. Second, scenarios with high harvest rates (LHR ≥0.10) exhibited median performance comparable to the "best case." Third, the lowest median performance was </w:t>
-      </w:r>
-      <w:r>
-        <w:t>associated with intermediate harvest rates (0.01 &lt; LHR &lt; 0.10; equivalent to case 3), followed by intermediate ONI conditions (equivalent to case 7; Figure S5). These patterns were maintained, and further accentuated, when missing summer LKB values were imputed (Figure S7). Consistent with Watters et al. (2020), variation in LKB (&lt;1 Mt versus &gt;1 Mt) exhibited the weakest association with penguin performance.</w:t>
+        <w:t>Posterior expectations of penguin performance after filtering for survey coverage (Figure S5) were broadly similar to those reported by Watters et al. (2020, Supplementary Figure S8), but differed in three key respects. First, the nominal “worst case” scenario no longer produced the lowest expected performance and instead lay close to the long-term mean. Second, scenarios with high harvest rates (LHR ≥0.10) exhibited median performance comparable to the “best case.” Third, the lowest median performance was associated with intermediate harvest rates (0.01 &lt; LHR &lt; 0.10; equivalent to case 3), followed by intermediate ONI conditions (equivalent to case 7; Figure S5). These patterns were maintained, and further accentuated, when missing summer LKB values were imputed (Figure S7). Consistent with Watters et al. (2020), variation in LKB (&lt;1 Mt versus &gt;1 Mt) exhibited the weakest association with penguin performance.</w:t>
       </w:r>
     </w:p>
     <w:p>
@@ -1266,7 +1251,7 @@
       </w:r>
       <w:r>
         <w:lastRenderedPageBreak/>
-        <w:t>limited influence on expected performance, and the nominal "worst case" scenario remains close to the long-term mean (Figures S5 &amp; S7) and unsupported by empirical data (Figures S4 and S6).</w:t>
+        <w:t>limited influence on expected performance, and the nominal “worst case” scenario remains close to the long-term mean (Figures S5 &amp; S7) and unsupported by empirical data (Figures S4 and S6).</w:t>
       </w:r>
     </w:p>
     <w:p>
@@ -1897,58 +1882,6 @@
           </w:p>
         </w:tc>
       </w:tr>
-      <w:tr>
-        <w:tc>
-          <w:tcPr>
-            <w:tcW w:w="0" w:type="auto"/>
-          </w:tcPr>
-          <w:p>
-            <w:pPr>
-              <w:pStyle w:val="Compact"/>
-            </w:pPr>
-          </w:p>
-        </w:tc>
-        <w:tc>
-          <w:tcPr>
-            <w:tcW w:w="0" w:type="auto"/>
-          </w:tcPr>
-          <w:p>
-            <w:pPr>
-              <w:pStyle w:val="Compact"/>
-            </w:pPr>
-          </w:p>
-        </w:tc>
-        <w:tc>
-          <w:tcPr>
-            <w:tcW w:w="0" w:type="auto"/>
-          </w:tcPr>
-          <w:p>
-            <w:pPr>
-              <w:pStyle w:val="Compact"/>
-            </w:pPr>
-          </w:p>
-        </w:tc>
-        <w:tc>
-          <w:tcPr>
-            <w:tcW w:w="0" w:type="auto"/>
-          </w:tcPr>
-          <w:p>
-            <w:pPr>
-              <w:pStyle w:val="Compact"/>
-            </w:pPr>
-          </w:p>
-        </w:tc>
-        <w:tc>
-          <w:tcPr>
-            <w:tcW w:w="0" w:type="auto"/>
-          </w:tcPr>
-          <w:p>
-            <w:pPr>
-              <w:pStyle w:val="Compact"/>
-            </w:pPr>
-          </w:p>
-        </w:tc>
-      </w:tr>
     </w:tbl>
     <w:p>
       <w:pPr>
@@ -1959,7 +1892,7 @@
           <w:noProof/>
         </w:rPr>
         <w:drawing>
-          <wp:inline distT="0" distB="0" distL="0" distR="0" wp14:anchorId="36490B8A" wp14:editId="36490B8B">
+          <wp:inline distT="0" distB="0" distL="0" distR="0" wp14:anchorId="6D3B25F8" wp14:editId="6D3B25F9">
             <wp:extent cx="5334000" cy="4000499"/>
             <wp:effectExtent l="0" t="0" r="0" b="0"/>
             <wp:docPr id="35" name="Picture"/>
@@ -2006,14 +1939,11 @@
         <w:pStyle w:val="Textoindependiente"/>
       </w:pPr>
       <w:r>
-        <w:t xml:space="preserve">Figure S4. Posterior predictive distributions (boxplots) and jittered observations (colored circles) of penguin performance, after removing low coverage survey data; missing </w:t>
+        <w:t xml:space="preserve">Figure S4. Posterior predictive distributions (boxplots) and jittered observations (colored circles) of penguin performance, after removing low coverage survey data; missing summer LKB were not imputed. Case 1 is ONI ≤ -0.5°C; LKB ≤ 1 Mt; and LHR ≤ 0.01 (the </w:t>
       </w:r>
       <w:r>
         <w:lastRenderedPageBreak/>
-        <w:t>summer LKB were not imputed. Case 1 is ONI ≤ -0.5°C; LKB ≤ 1 Mt; and LHR ≤ 0.01 (the “best case”). Case 2 is ONI ≤ -0.5°C; LKB &gt; 1 Mt; and LHR ≤ 0.01. Case 3 is ONI ≤ -0.5°C; LKB ≤ 1 Mt; and 0.01 &lt; LHR &lt; 0.1. Case 4 is ONI ≤ -0.5°C; LKB &gt; 1 Mt; and 0.01 &lt; LHR &lt; 0.1. Case 5 is ONI ≤ -0.5°C; LKB ≤ 1 Mt; and LHR ≥ 0.1. Case 6 is ONI ≤ -0.5°C; LKB &gt; 1 Mt; and LHR ≥ 0.1. Cases 7-12 are the same as Cases 1-6 except -0.5°C &lt; ONI &lt; 0.5°C; Case 12 is the “worst case.” Cases 13-18 are the same as Cases 1-6 except ONI</w:t>
-      </w:r>
-      <w:r>
-        <w:t xml:space="preserve"> ≥ 0.5°C. Filled red circles represent summer observations from krill surveys. Blue circles represent winter observations. Boxes characterize interquartile ranges with medians indicated by bold horizontal lines and whiskers extending to 1.5 times these ranges.</w:t>
+        <w:t>“best case”). Case 2 is ONI ≤ -0.5°C; LKB &gt; 1 Mt; and LHR ≤ 0.01. Case 3 is ONI ≤ -0.5°C; LKB ≤ 1 Mt; and 0.01 &lt; LHR &lt; 0.1. Case 4 is ONI ≤ -0.5°C; LKB &gt; 1 Mt; and 0.01 &lt; LHR &lt; 0.1. Case 5 is ONI ≤ -0.5°C; LKB ≤ 1 Mt; and LHR ≥ 0.1. Case 6 is ONI ≤ -0.5°C; LKB &gt; 1 Mt; and LHR ≥ 0.1. Cases 7-12 are the same as Cases 1-6 except -0.5°C &lt; ONI &lt; 0.5°C; Case 12 is the “worst case.” Cases 13-18 are the same as Cases 1-6 except ONI ≥ 0.5°C. Filled red circles represent summer observations from krill surveys. Blue circles represent winter observations. Boxes characterize interquartile ranges with medians indicated by bold horizontal lines and whiskers extending to 1.5 times these ranges.</w:t>
       </w:r>
     </w:p>
     <w:p>
@@ -2025,7 +1955,7 @@
           <w:noProof/>
         </w:rPr>
         <w:drawing>
-          <wp:inline distT="0" distB="0" distL="0" distR="0" wp14:anchorId="36490B8C" wp14:editId="36490B8D">
+          <wp:inline distT="0" distB="0" distL="0" distR="0" wp14:anchorId="6D3B25FA" wp14:editId="6D3B25FB">
             <wp:extent cx="5334000" cy="4000499"/>
             <wp:effectExtent l="0" t="0" r="0" b="0"/>
             <wp:docPr id="38" name="Picture"/>
@@ -2072,10 +2002,7 @@
         <w:pStyle w:val="Textoindependiente"/>
       </w:pPr>
       <w:r>
-        <w:t>Figure S5. Posterior expectations of penguin performance from the sensitivity test in which: low coverage survey data was removed, and missing summer LKB were not imputed. The “best case” is ONI ≤ -0.5; LKB ≤ 1 Mt; and LHR ≤ 0.01. The “worst case” is -0.5 &lt; ONI &lt; 0.5; LKB &gt; 1 Mt, and LHR ≥ 0.1. All other cases are marginal deviations from the best case. The median, interquartile range, and range of the posterior expectations are provided for each boxplot. Reference lines respectively indicate the median exp</w:t>
-      </w:r>
-      <w:r>
-        <w:t>ected performance in the best case (dashed line) and the long-term mean performance (solid line). As per Supplementary Fig. S8, Watters et al. (2020).</w:t>
+        <w:t>Figure S5. Posterior expectations of penguin performance from the sensitivity test in which: low coverage survey data was removed, and missing summer LKB were not imputed. The “best case” is ONI ≤ -0.5; LKB ≤ 1 Mt; and LHR ≤ 0.01. The “worst case” is -0.5 &lt; ONI &lt; 0.5; LKB &gt; 1 Mt, and LHR ≥ 0.1. All other cases are marginal deviations from the best case. The median, interquartile range, and range of the posterior expectations are provided for each boxplot. Reference lines respectively indicate the median expected performance in the best case (dashed line) and the long-term mean performance (solid line). As per Supplementary Fig. S8, Watters et al. (2020).</w:t>
       </w:r>
     </w:p>
     <w:p>
@@ -2088,7 +2015,7 @@
         </w:rPr>
         <w:lastRenderedPageBreak/>
         <w:drawing>
-          <wp:inline distT="0" distB="0" distL="0" distR="0" wp14:anchorId="36490B8E" wp14:editId="36490B8F">
+          <wp:inline distT="0" distB="0" distL="0" distR="0" wp14:anchorId="6D3B25FC" wp14:editId="6D3B25FD">
             <wp:extent cx="5334000" cy="4000499"/>
             <wp:effectExtent l="0" t="0" r="0" b="0"/>
             <wp:docPr id="41" name="Picture"/>
@@ -2135,10 +2062,7 @@
         <w:pStyle w:val="Textoindependiente"/>
       </w:pPr>
       <w:r>
-        <w:t xml:space="preserve">Figure S6. Posterior predictive distributions (boxplots) and jittered observations (colored circles) of penguin performance, after removing low coverage survey data; missing summer LKB were imputed according to values in Table 1. Case 1 is ONI ≤ -0.5°C; LKB ≤ 1 Mt; and LHR ≤ 0.01 (the “best case”). Case 2 is ONI ≤ -0.5°C; LKB &gt; 1 Mt; and LHR ≤ 0.01. Case 3 is ONI ≤ -0.5°C; LKB ≤ 1 Mt; and 0.01 &lt; LHR &lt; 0.1. Case 4 is ONI ≤ -0.5°C; LKB &gt; 1 Mt; and 0.01 &lt; LHR &lt; 0.1. Case 5 is ONI ≤ -0.5°C; LKB ≤ 1 Mt; and LHR </w:t>
-      </w:r>
-      <w:r>
-        <w:t>≥ 0.1. Case 6 is ONI ≤ -0.5°C; LKB &gt; 1 Mt; and LHR ≥ 0.1. Cases 7-12 are the same as Cases 1-6 except -0.5°C &lt; ONI &lt; 0.5°C; Case 12 is the “worst case.” Cases 13-18 are the same as Cases 1-6 except ONI ≥ 0.5°C. Filled red circles represent summer observations from krill surveys. Blue circles represent winter observations. Boxes characterize interquartile ranges with medians indicated by bold horizontal lines and whiskers extending to 1.5 times these ranges.</w:t>
+        <w:t>Figure S6. Posterior predictive distributions (boxplots) and jittered observations (colored circles) of penguin performance, after removing low coverage survey data; missing summer LKB were imputed according to values in Table 1. Case 1 is ONI ≤ -0.5°C; LKB ≤ 1 Mt; and LHR ≤ 0.01 (the “best case”). Case 2 is ONI ≤ -0.5°C; LKB &gt; 1 Mt; and LHR ≤ 0.01. Case 3 is ONI ≤ -0.5°C; LKB ≤ 1 Mt; and 0.01 &lt; LHR &lt; 0.1. Case 4 is ONI ≤ -0.5°C; LKB &gt; 1 Mt; and 0.01 &lt; LHR &lt; 0.1. Case 5 is ONI ≤ -0.5°C; LKB ≤ 1 Mt; and LHR ≥ 0.1. Case 6 is ONI ≤ -0.5°C; LKB &gt; 1 Mt; and LHR ≥ 0.1. Cases 7-12 are the same as Cases 1-6 except -0.5°C &lt; ONI &lt; 0.5°C; Case 12 is the “worst case.” Cases 13-18 are the same as Cases 1-6 except ONI ≥ 0.5°C. Filled red circles represent summer observations from krill surveys. Blue circles represent winter observations. Boxes characterize interquartile ranges with medians indicated by bold horizontal lines and whiskers extending to 1.5 times these ranges.</w:t>
       </w:r>
     </w:p>
     <w:p>
@@ -2151,7 +2075,7 @@
         </w:rPr>
         <w:lastRenderedPageBreak/>
         <w:drawing>
-          <wp:inline distT="0" distB="0" distL="0" distR="0" wp14:anchorId="36490B90" wp14:editId="36490B91">
+          <wp:inline distT="0" distB="0" distL="0" distR="0" wp14:anchorId="6D3B25FE" wp14:editId="6D3B25FF">
             <wp:extent cx="5334000" cy="4000499"/>
             <wp:effectExtent l="0" t="0" r="0" b="0"/>
             <wp:docPr id="44" name="Picture"/>
@@ -2198,20 +2122,33 @@
         <w:pStyle w:val="Textoindependiente"/>
       </w:pPr>
       <w:r>
-        <w:t xml:space="preserve">Figure S7. Posterior expectations of penguin performance from the sensitivity test in which: low coverage survey data was removed; missing summer LKB were imputed according to values in Table 1. The “best case” is ONI ≤ -0.5; LKB ≤ 1 Mt; and LHR ≤ 0.01. The “worst case” is -0.5 &lt; ONI &lt; 0.5; LKB &gt; 1 Mt, and LHR ≥ 0.1. All other cases are marginal deviations from the best case. The median, interquartile range, and range of the posterior expectations are provided for each boxplot. Reference lines respectively </w:t>
+        <w:t>Figure S7. Posterior expectations of penguin performance from the sensitivity test in which: low coverage survey data was removed; missing summer LKB were imputed according to values in Table 1. The “best case” is ONI ≤ -0.5; LKB ≤ 1 Mt; and LHR ≤ 0.01. The “worst case” is -0.5 &lt; ONI &lt; 0.5; LKB &gt; 1 Mt, and LHR ≥ 0.1. All other cases are marginal deviations from the best case. The median, interquartile range, and range of the posterior expectations are provided for each boxplot. Reference lines respectively indicate the median expected performance in the best case (dashed line) and the long-term mean performance (solid line). As per Supplementary Fig. S8, Watters et al. (2020).</w:t>
       </w:r>
+    </w:p>
+    <w:p>
+      <w:pPr>
+        <w:rPr>
+          <w:rFonts w:asciiTheme="majorHAnsi" w:eastAsiaTheme="majorEastAsia" w:hAnsiTheme="majorHAnsi" w:cstheme="majorBidi"/>
+          <w:b/>
+          <w:bCs/>
+          <w:color w:val="4F81BD" w:themeColor="accent1"/>
+          <w:sz w:val="32"/>
+          <w:szCs w:val="32"/>
+        </w:rPr>
+      </w:pPr>
+      <w:bookmarkStart w:id="3" w:name="X19f95fdfba7755b8a0aa9c8458ecd24d9376a21"/>
+      <w:bookmarkEnd w:id="2"/>
       <w:r>
-        <w:t>indicate the median expected performance in the best case (dashed line) and the long-term mean performance (solid line). As per Supplementary Fig. S8, Watters et al. (2020).</w:t>
+        <w:br w:type="page"/>
       </w:r>
     </w:p>
     <w:p>
       <w:pPr>
         <w:pStyle w:val="Ttulo1"/>
       </w:pPr>
-      <w:bookmarkStart w:id="3" w:name="Xba250db6147939e267af2d9e82d86f77cf69c4e"/>
-      <w:bookmarkEnd w:id="2"/>
       <w:r>
-        <w:t>D. Krill consumption by main predator taxa</w:t>
+        <w:lastRenderedPageBreak/>
+        <w:t>D. Continuing spatial and temporal mismatches</w:t>
       </w:r>
     </w:p>
     <w:p>
@@ -2219,10 +2156,572 @@
         <w:pStyle w:val="FirstParagraph"/>
       </w:pPr>
       <w:r>
-        <w:t>Estimates of krill consumption by major predator groups during the study period have been previously summarized by Hill et al. (2007). During summer, fish accounted for the largest proportion of krill consumption, with estimated removals of 1,425,193 in the Bransfield Strait (gSMSMU #1: APBSW + APBSE) and 845,772 in the Drake Passage (gSSMU #2: APDPW + APDPE). Combined summer consumption by penguins and whales was estimated at 444,674 in the Bransfield Strait and 328,774 in the Drake Passage. Total summer k</w:t>
+        <w:t>Table S4. Size of SSMUs for Subarea 48.1. CCAMLR Small-Scale Management Units (SSMUs) were download from CCAMLR Public repository (</w:t>
       </w:r>
+      <w:hyperlink r:id="rId15">
+        <w:r>
+          <w:rPr>
+            <w:rStyle w:val="Hipervnculo"/>
+          </w:rPr>
+          <w:t>https://github.com/ccamlr/data</w:t>
+        </w:r>
+      </w:hyperlink>
       <w:r>
-        <w:t>rill consumption therefore exceeded 1 Mt in both gSSMU 1 and gSSMU 2.</w:t>
+        <w:t xml:space="preserve">). CCAMLR. 2022. Geographical data layer: CCAMLR Fishery Small-Scale Management Units. Version 0.9, URL: </w:t>
+      </w:r>
+      <w:hyperlink r:id="rId16">
+        <w:r>
+          <w:rPr>
+            <w:rStyle w:val="Hipervnculo"/>
+          </w:rPr>
+          <w:t>https://github.com/ccamlr/data/tree/main/geographical_data/ssmu/versions/v0.9</w:t>
+        </w:r>
+      </w:hyperlink>
+      <w:r>
+        <w:t>.</w:t>
+      </w:r>
+    </w:p>
+    <w:tbl>
+      <w:tblPr>
+        <w:tblStyle w:val="Table"/>
+        <w:tblW w:w="0" w:type="auto"/>
+        <w:tblLook w:val="0020" w:firstRow="1" w:lastRow="0" w:firstColumn="0" w:lastColumn="0" w:noHBand="0" w:noVBand="0"/>
+      </w:tblPr>
+      <w:tblGrid>
+        <w:gridCol w:w="1019"/>
+        <w:gridCol w:w="1329"/>
+        <w:gridCol w:w="924"/>
+        <w:gridCol w:w="1553"/>
+      </w:tblGrid>
+      <w:tr>
+        <w:trPr>
+          <w:cnfStyle w:val="100000000000" w:firstRow="1" w:lastRow="0" w:firstColumn="0" w:lastColumn="0" w:oddVBand="0" w:evenVBand="0" w:oddHBand="0" w:evenHBand="0" w:firstRowFirstColumn="0" w:firstRowLastColumn="0" w:lastRowFirstColumn="0" w:lastRowLastColumn="0"/>
+          <w:tblHeader/>
+        </w:trPr>
+        <w:tc>
+          <w:tcPr>
+            <w:tcW w:w="0" w:type="auto"/>
+          </w:tcPr>
+          <w:p>
+            <w:pPr>
+              <w:pStyle w:val="Compact"/>
+            </w:pPr>
+            <w:r>
+              <w:t>SSMU</w:t>
+            </w:r>
+          </w:p>
+        </w:tc>
+        <w:tc>
+          <w:tcPr>
+            <w:tcW w:w="0" w:type="auto"/>
+          </w:tcPr>
+          <w:p>
+            <w:pPr>
+              <w:pStyle w:val="Compact"/>
+              <w:jc w:val="right"/>
+            </w:pPr>
+            <w:r>
+              <w:t>Area..km2.</w:t>
+            </w:r>
+          </w:p>
+        </w:tc>
+        <w:tc>
+          <w:tcPr>
+            <w:tcW w:w="0" w:type="auto"/>
+          </w:tcPr>
+          <w:p>
+            <w:pPr>
+              <w:pStyle w:val="Compact"/>
+              <w:jc w:val="right"/>
+            </w:pPr>
+            <w:r>
+              <w:t>gSSMU</w:t>
+            </w:r>
+          </w:p>
+        </w:tc>
+        <w:tc>
+          <w:tcPr>
+            <w:tcW w:w="0" w:type="auto"/>
+          </w:tcPr>
+          <w:p>
+            <w:pPr>
+              <w:pStyle w:val="Compact"/>
+              <w:jc w:val="right"/>
+            </w:pPr>
+            <w:r>
+              <w:t>Area.fraction</w:t>
+            </w:r>
+          </w:p>
+        </w:tc>
+      </w:tr>
+      <w:tr>
+        <w:tc>
+          <w:tcPr>
+            <w:tcW w:w="0" w:type="auto"/>
+          </w:tcPr>
+          <w:p>
+            <w:pPr>
+              <w:pStyle w:val="Compact"/>
+            </w:pPr>
+            <w:r>
+              <w:t>APBSE</w:t>
+            </w:r>
+          </w:p>
+        </w:tc>
+        <w:tc>
+          <w:tcPr>
+            <w:tcW w:w="0" w:type="auto"/>
+          </w:tcPr>
+          <w:p>
+            <w:pPr>
+              <w:pStyle w:val="Compact"/>
+              <w:jc w:val="right"/>
+            </w:pPr>
+            <w:r>
+              <w:t>28814.69</w:t>
+            </w:r>
+          </w:p>
+        </w:tc>
+        <w:tc>
+          <w:tcPr>
+            <w:tcW w:w="0" w:type="auto"/>
+          </w:tcPr>
+          <w:p>
+            <w:pPr>
+              <w:pStyle w:val="Compact"/>
+              <w:jc w:val="right"/>
+            </w:pPr>
+            <w:r>
+              <w:t>1</w:t>
+            </w:r>
+          </w:p>
+        </w:tc>
+        <w:tc>
+          <w:tcPr>
+            <w:tcW w:w="0" w:type="auto"/>
+          </w:tcPr>
+          <w:p>
+            <w:pPr>
+              <w:pStyle w:val="Compact"/>
+              <w:jc w:val="right"/>
+            </w:pPr>
+            <w:r>
+              <w:t>0.5653320</w:t>
+            </w:r>
+          </w:p>
+        </w:tc>
+      </w:tr>
+      <w:tr>
+        <w:tc>
+          <w:tcPr>
+            <w:tcW w:w="0" w:type="auto"/>
+          </w:tcPr>
+          <w:p>
+            <w:pPr>
+              <w:pStyle w:val="Compact"/>
+            </w:pPr>
+            <w:r>
+              <w:t>APBSW</w:t>
+            </w:r>
+          </w:p>
+        </w:tc>
+        <w:tc>
+          <w:tcPr>
+            <w:tcW w:w="0" w:type="auto"/>
+          </w:tcPr>
+          <w:p>
+            <w:pPr>
+              <w:pStyle w:val="Compact"/>
+              <w:jc w:val="right"/>
+            </w:pPr>
+            <w:r>
+              <w:t>22154.82</w:t>
+            </w:r>
+          </w:p>
+        </w:tc>
+        <w:tc>
+          <w:tcPr>
+            <w:tcW w:w="0" w:type="auto"/>
+          </w:tcPr>
+          <w:p>
+            <w:pPr>
+              <w:pStyle w:val="Compact"/>
+              <w:jc w:val="right"/>
+            </w:pPr>
+            <w:r>
+              <w:t>1</w:t>
+            </w:r>
+          </w:p>
+        </w:tc>
+        <w:tc>
+          <w:tcPr>
+            <w:tcW w:w="0" w:type="auto"/>
+          </w:tcPr>
+          <w:p>
+            <w:pPr>
+              <w:pStyle w:val="Compact"/>
+              <w:jc w:val="right"/>
+            </w:pPr>
+            <w:r>
+              <w:t>0.4346680</w:t>
+            </w:r>
+          </w:p>
+        </w:tc>
+      </w:tr>
+      <w:tr>
+        <w:tc>
+          <w:tcPr>
+            <w:tcW w:w="0" w:type="auto"/>
+          </w:tcPr>
+          <w:p>
+            <w:pPr>
+              <w:pStyle w:val="Compact"/>
+            </w:pPr>
+            <w:r>
+              <w:t>APEI</w:t>
+            </w:r>
+          </w:p>
+        </w:tc>
+        <w:tc>
+          <w:tcPr>
+            <w:tcW w:w="0" w:type="auto"/>
+          </w:tcPr>
+          <w:p>
+            <w:pPr>
+              <w:pStyle w:val="Compact"/>
+              <w:jc w:val="right"/>
+            </w:pPr>
+            <w:r>
+              <w:t>36407.41</w:t>
+            </w:r>
+          </w:p>
+        </w:tc>
+        <w:tc>
+          <w:tcPr>
+            <w:tcW w:w="0" w:type="auto"/>
+          </w:tcPr>
+          <w:p>
+            <w:pPr>
+              <w:pStyle w:val="Compact"/>
+              <w:jc w:val="right"/>
+            </w:pPr>
+            <w:r>
+              <w:t>2</w:t>
+            </w:r>
+          </w:p>
+        </w:tc>
+        <w:tc>
+          <w:tcPr>
+            <w:tcW w:w="0" w:type="auto"/>
+          </w:tcPr>
+          <w:p>
+            <w:pPr>
+              <w:pStyle w:val="Compact"/>
+              <w:jc w:val="right"/>
+            </w:pPr>
+            <w:r>
+              <w:t>0.5282773</w:t>
+            </w:r>
+          </w:p>
+        </w:tc>
+      </w:tr>
+      <w:tr>
+        <w:tc>
+          <w:tcPr>
+            <w:tcW w:w="0" w:type="auto"/>
+          </w:tcPr>
+          <w:p>
+            <w:pPr>
+              <w:pStyle w:val="Compact"/>
+            </w:pPr>
+            <w:r>
+              <w:t>APDPE</w:t>
+            </w:r>
+          </w:p>
+        </w:tc>
+        <w:tc>
+          <w:tcPr>
+            <w:tcW w:w="0" w:type="auto"/>
+          </w:tcPr>
+          <w:p>
+            <w:pPr>
+              <w:pStyle w:val="Compact"/>
+              <w:jc w:val="right"/>
+            </w:pPr>
+            <w:r>
+              <w:t>16554.09</w:t>
+            </w:r>
+          </w:p>
+        </w:tc>
+        <w:tc>
+          <w:tcPr>
+            <w:tcW w:w="0" w:type="auto"/>
+          </w:tcPr>
+          <w:p>
+            <w:pPr>
+              <w:pStyle w:val="Compact"/>
+              <w:jc w:val="right"/>
+            </w:pPr>
+            <w:r>
+              <w:t>2</w:t>
+            </w:r>
+          </w:p>
+        </w:tc>
+        <w:tc>
+          <w:tcPr>
+            <w:tcW w:w="0" w:type="auto"/>
+          </w:tcPr>
+          <w:p>
+            <w:pPr>
+              <w:pStyle w:val="Compact"/>
+              <w:jc w:val="right"/>
+            </w:pPr>
+            <w:r>
+              <w:t>0.2402025</w:t>
+            </w:r>
+          </w:p>
+        </w:tc>
+      </w:tr>
+      <w:tr>
+        <w:tc>
+          <w:tcPr>
+            <w:tcW w:w="0" w:type="auto"/>
+          </w:tcPr>
+          <w:p>
+            <w:pPr>
+              <w:pStyle w:val="Compact"/>
+            </w:pPr>
+            <w:r>
+              <w:t>APDPW</w:t>
+            </w:r>
+          </w:p>
+        </w:tc>
+        <w:tc>
+          <w:tcPr>
+            <w:tcW w:w="0" w:type="auto"/>
+          </w:tcPr>
+          <w:p>
+            <w:pPr>
+              <w:pStyle w:val="Compact"/>
+              <w:jc w:val="right"/>
+            </w:pPr>
+            <w:r>
+              <w:t>15955.73</w:t>
+            </w:r>
+          </w:p>
+        </w:tc>
+        <w:tc>
+          <w:tcPr>
+            <w:tcW w:w="0" w:type="auto"/>
+          </w:tcPr>
+          <w:p>
+            <w:pPr>
+              <w:pStyle w:val="Compact"/>
+              <w:jc w:val="right"/>
+            </w:pPr>
+            <w:r>
+              <w:t>2</w:t>
+            </w:r>
+          </w:p>
+        </w:tc>
+        <w:tc>
+          <w:tcPr>
+            <w:tcW w:w="0" w:type="auto"/>
+          </w:tcPr>
+          <w:p>
+            <w:pPr>
+              <w:pStyle w:val="Compact"/>
+              <w:jc w:val="right"/>
+            </w:pPr>
+            <w:r>
+              <w:t>0.2315201</w:t>
+            </w:r>
+          </w:p>
+        </w:tc>
+      </w:tr>
+      <w:tr>
+        <w:tc>
+          <w:tcPr>
+            <w:tcW w:w="0" w:type="auto"/>
+          </w:tcPr>
+          <w:p>
+            <w:pPr>
+              <w:pStyle w:val="Compact"/>
+            </w:pPr>
+            <w:r>
+              <w:t>APPA</w:t>
+            </w:r>
+          </w:p>
+        </w:tc>
+        <w:tc>
+          <w:tcPr>
+            <w:tcW w:w="0" w:type="auto"/>
+          </w:tcPr>
+          <w:p>
+            <w:pPr>
+              <w:pStyle w:val="Compact"/>
+              <w:jc w:val="right"/>
+            </w:pPr>
+            <w:r>
+              <w:t>441639.72</w:t>
+            </w:r>
+          </w:p>
+        </w:tc>
+        <w:tc>
+          <w:tcPr>
+            <w:tcW w:w="0" w:type="auto"/>
+          </w:tcPr>
+          <w:p>
+            <w:pPr>
+              <w:pStyle w:val="Compact"/>
+              <w:jc w:val="right"/>
+            </w:pPr>
+            <w:r>
+              <w:t>3</w:t>
+            </w:r>
+          </w:p>
+        </w:tc>
+        <w:tc>
+          <w:tcPr>
+            <w:tcW w:w="0" w:type="auto"/>
+          </w:tcPr>
+          <w:p>
+            <w:pPr>
+              <w:pStyle w:val="Compact"/>
+              <w:jc w:val="right"/>
+            </w:pPr>
+            <w:r>
+              <w:t>1.0000000</w:t>
+            </w:r>
+          </w:p>
+        </w:tc>
+      </w:tr>
+      <w:tr>
+        <w:tc>
+          <w:tcPr>
+            <w:tcW w:w="0" w:type="auto"/>
+          </w:tcPr>
+          <w:p>
+            <w:pPr>
+              <w:pStyle w:val="Compact"/>
+            </w:pPr>
+            <w:r>
+              <w:t>APE</w:t>
+            </w:r>
+          </w:p>
+        </w:tc>
+        <w:tc>
+          <w:tcPr>
+            <w:tcW w:w="0" w:type="auto"/>
+          </w:tcPr>
+          <w:p>
+            <w:pPr>
+              <w:pStyle w:val="Compact"/>
+              <w:jc w:val="right"/>
+            </w:pPr>
+            <w:r>
+              <w:t>63331.00</w:t>
+            </w:r>
+          </w:p>
+        </w:tc>
+        <w:tc>
+          <w:tcPr>
+            <w:tcW w:w="0" w:type="auto"/>
+          </w:tcPr>
+          <w:p>
+            <w:pPr>
+              <w:pStyle w:val="Compact"/>
+              <w:jc w:val="right"/>
+            </w:pPr>
+            <w:r>
+              <w:t>4</w:t>
+            </w:r>
+          </w:p>
+        </w:tc>
+        <w:tc>
+          <w:tcPr>
+            <w:tcW w:w="0" w:type="auto"/>
+          </w:tcPr>
+          <w:p>
+            <w:pPr>
+              <w:pStyle w:val="Compact"/>
+              <w:jc w:val="right"/>
+            </w:pPr>
+            <w:r>
+              <w:t>0.6289206</w:t>
+            </w:r>
+          </w:p>
+        </w:tc>
+      </w:tr>
+      <w:tr>
+        <w:tc>
+          <w:tcPr>
+            <w:tcW w:w="0" w:type="auto"/>
+          </w:tcPr>
+          <w:p>
+            <w:pPr>
+              <w:pStyle w:val="Compact"/>
+            </w:pPr>
+            <w:r>
+              <w:t>APW</w:t>
+            </w:r>
+          </w:p>
+        </w:tc>
+        <w:tc>
+          <w:tcPr>
+            <w:tcW w:w="0" w:type="auto"/>
+          </w:tcPr>
+          <w:p>
+            <w:pPr>
+              <w:pStyle w:val="Compact"/>
+              <w:jc w:val="right"/>
+            </w:pPr>
+            <w:r>
+              <w:t>37366.93</w:t>
+            </w:r>
+          </w:p>
+        </w:tc>
+        <w:tc>
+          <w:tcPr>
+            <w:tcW w:w="0" w:type="auto"/>
+          </w:tcPr>
+          <w:p>
+            <w:pPr>
+              <w:pStyle w:val="Compact"/>
+              <w:jc w:val="right"/>
+            </w:pPr>
+            <w:r>
+              <w:t>4</w:t>
+            </w:r>
+          </w:p>
+        </w:tc>
+        <w:tc>
+          <w:tcPr>
+            <w:tcW w:w="0" w:type="auto"/>
+          </w:tcPr>
+          <w:p>
+            <w:pPr>
+              <w:pStyle w:val="Compact"/>
+              <w:jc w:val="right"/>
+            </w:pPr>
+            <w:r>
+              <w:t>0.3710794</w:t>
+            </w:r>
+          </w:p>
+        </w:tc>
+      </w:tr>
+    </w:tbl>
+    <w:p>
+      <w:pPr>
+        <w:pStyle w:val="Textoindependiente"/>
+      </w:pPr>
+      <w:r>
+        <w:t>Effect of Spatial and temporal mismatches in penguin performance.</w:t>
+      </w:r>
+    </w:p>
+    <w:p>
+      <w:r>
+        <w:br w:type="page"/>
       </w:r>
     </w:p>
     <w:p>
@@ -2230,11 +2729,240 @@
         <w:pStyle w:val="Textoindependiente"/>
       </w:pPr>
       <w:r>
-        <w:t xml:space="preserve">Watters et al. (2020) noted “krill biomass in the Antarctic Peninsula is generally sufficient to support penguin production.” Consistent with this, no evidence of acute adult penguin mortality or complete lack of bird attending nesting grounds has been documented in the </w:t>
+        <w:rPr>
+          <w:noProof/>
+        </w:rPr>
+        <w:lastRenderedPageBreak/>
+        <w:drawing>
+          <wp:inline distT="0" distB="0" distL="0" distR="0" wp14:anchorId="6D3B2600" wp14:editId="01143BB1">
+            <wp:extent cx="3465830" cy="1906176"/>
+            <wp:effectExtent l="0" t="0" r="0" b="0"/>
+            <wp:docPr id="50" name="Picture"/>
+            <wp:cNvGraphicFramePr/>
+            <a:graphic xmlns:a="http://schemas.openxmlformats.org/drawingml/2006/main">
+              <a:graphicData uri="http://schemas.openxmlformats.org/drawingml/2006/picture">
+                <pic:pic xmlns:pic="http://schemas.openxmlformats.org/drawingml/2006/picture">
+                  <pic:nvPicPr>
+                    <pic:cNvPr id="51" name="Picture" descr="./A_Results/Watters_model/Imputed/Watters_Posterior_predictive_dist_imputed.png"/>
+                    <pic:cNvPicPr>
+                      <a:picLocks noChangeAspect="1" noChangeArrowheads="1"/>
+                    </pic:cNvPicPr>
+                  </pic:nvPicPr>
+                  <pic:blipFill rotWithShape="1">
+                    <a:blip r:embed="rId17"/>
+                    <a:srcRect t="8960" b="17707"/>
+                    <a:stretch>
+                      <a:fillRect/>
+                    </a:stretch>
+                  </pic:blipFill>
+                  <pic:spPr bwMode="auto">
+                    <a:xfrm>
+                      <a:off x="0" y="0"/>
+                      <a:ext cx="3467100" cy="1906874"/>
+                    </a:xfrm>
+                    <a:prstGeom prst="rect">
+                      <a:avLst/>
+                    </a:prstGeom>
+                    <a:noFill/>
+                    <a:ln>
+                      <a:noFill/>
+                    </a:ln>
+                    <a:extLst>
+                      <a:ext uri="{53640926-AAD7-44D8-BBD7-CCE9431645EC}">
+                        <a14:shadowObscured xmlns:a14="http://schemas.microsoft.com/office/drawing/2010/main"/>
+                      </a:ext>
+                    </a:extLst>
+                  </pic:spPr>
+                </pic:pic>
+              </a:graphicData>
+            </a:graphic>
+          </wp:inline>
+        </w:drawing>
       </w:r>
       <w:r>
+        <w:rPr>
+          <w:noProof/>
+        </w:rPr>
+        <w:drawing>
+          <wp:inline distT="0" distB="0" distL="0" distR="0" wp14:anchorId="6D3B2602" wp14:editId="5CB97B68">
+            <wp:extent cx="3465830" cy="1449238"/>
+            <wp:effectExtent l="0" t="0" r="0" b="0"/>
+            <wp:docPr id="53" name="Picture"/>
+            <wp:cNvGraphicFramePr/>
+            <a:graphic xmlns:a="http://schemas.openxmlformats.org/drawingml/2006/main">
+              <a:graphicData uri="http://schemas.openxmlformats.org/drawingml/2006/picture">
+                <pic:pic xmlns:pic="http://schemas.openxmlformats.org/drawingml/2006/picture">
+                  <pic:nvPicPr>
+                    <pic:cNvPr id="54" name="Picture" descr="./A_Results/Model02_Andy/Posterior_predictive_dist_mod02_Andy.png"/>
+                    <pic:cNvPicPr>
+                      <a:picLocks noChangeAspect="1" noChangeArrowheads="1"/>
+                    </pic:cNvPicPr>
+                  </pic:nvPicPr>
+                  <pic:blipFill rotWithShape="1">
+                    <a:blip r:embed="rId18"/>
+                    <a:srcRect t="9773" b="29404"/>
+                    <a:stretch>
+                      <a:fillRect/>
+                    </a:stretch>
+                  </pic:blipFill>
+                  <pic:spPr bwMode="auto">
+                    <a:xfrm>
+                      <a:off x="0" y="0"/>
+                      <a:ext cx="3467100" cy="1449769"/>
+                    </a:xfrm>
+                    <a:prstGeom prst="rect">
+                      <a:avLst/>
+                    </a:prstGeom>
+                    <a:noFill/>
+                    <a:ln>
+                      <a:noFill/>
+                    </a:ln>
+                    <a:extLst>
+                      <a:ext uri="{53640926-AAD7-44D8-BBD7-CCE9431645EC}">
+                        <a14:shadowObscured xmlns:a14="http://schemas.microsoft.com/office/drawing/2010/main"/>
+                      </a:ext>
+                    </a:extLst>
+                  </pic:spPr>
+                </pic:pic>
+              </a:graphicData>
+            </a:graphic>
+          </wp:inline>
+        </w:drawing>
+      </w:r>
+      <w:r>
+        <w:rPr>
+          <w:noProof/>
+        </w:rPr>
+        <w:drawing>
+          <wp:inline distT="0" distB="0" distL="0" distR="0" wp14:anchorId="6D3B2604" wp14:editId="218B4B35">
+            <wp:extent cx="3465830" cy="1682151"/>
+            <wp:effectExtent l="0" t="0" r="0" b="0"/>
+            <wp:docPr id="56" name="Picture"/>
+            <wp:cNvGraphicFramePr/>
+            <a:graphic xmlns:a="http://schemas.openxmlformats.org/drawingml/2006/main">
+              <a:graphicData uri="http://schemas.openxmlformats.org/drawingml/2006/picture">
+                <pic:pic xmlns:pic="http://schemas.openxmlformats.org/drawingml/2006/picture">
+                  <pic:nvPicPr>
+                    <pic:cNvPr id="57" name="Picture" descr="./A_Results/Model02_Andy/Posterior_predictive_dist_mod02_Andy_MWinter.png"/>
+                    <pic:cNvPicPr>
+                      <a:picLocks noChangeAspect="1" noChangeArrowheads="1"/>
+                    </pic:cNvPicPr>
+                  </pic:nvPicPr>
+                  <pic:blipFill rotWithShape="1">
+                    <a:blip r:embed="rId19"/>
+                    <a:srcRect t="8959" b="26327"/>
+                    <a:stretch>
+                      <a:fillRect/>
+                    </a:stretch>
+                  </pic:blipFill>
+                  <pic:spPr bwMode="auto">
+                    <a:xfrm>
+                      <a:off x="0" y="0"/>
+                      <a:ext cx="3467100" cy="1682767"/>
+                    </a:xfrm>
+                    <a:prstGeom prst="rect">
+                      <a:avLst/>
+                    </a:prstGeom>
+                    <a:noFill/>
+                    <a:ln>
+                      <a:noFill/>
+                    </a:ln>
+                    <a:extLst>
+                      <a:ext uri="{53640926-AAD7-44D8-BBD7-CCE9431645EC}">
+                        <a14:shadowObscured xmlns:a14="http://schemas.microsoft.com/office/drawing/2010/main"/>
+                      </a:ext>
+                    </a:extLst>
+                  </pic:spPr>
+                </pic:pic>
+              </a:graphicData>
+            </a:graphic>
+          </wp:inline>
+        </w:drawing>
+      </w:r>
+      <w:r>
+        <w:rPr>
+          <w:noProof/>
+        </w:rPr>
+        <w:drawing>
+          <wp:inline distT="0" distB="0" distL="0" distR="0" wp14:anchorId="6D3B2606" wp14:editId="24FC6041">
+            <wp:extent cx="3466255" cy="2384030"/>
+            <wp:effectExtent l="0" t="0" r="0" b="0"/>
+            <wp:docPr id="59" name="Picture"/>
+            <wp:cNvGraphicFramePr/>
+            <a:graphic xmlns:a="http://schemas.openxmlformats.org/drawingml/2006/main">
+              <a:graphicData uri="http://schemas.openxmlformats.org/drawingml/2006/picture">
+                <pic:pic xmlns:pic="http://schemas.openxmlformats.org/drawingml/2006/picture">
+                  <pic:nvPicPr>
+                    <pic:cNvPr id="60" name="Picture" descr="./A_Results/Model02_SSMU/Posterior_predictive_dist_mod02_SSMU.png"/>
+                    <pic:cNvPicPr>
+                      <a:picLocks noChangeAspect="1" noChangeArrowheads="1"/>
+                    </pic:cNvPicPr>
+                  </pic:nvPicPr>
+                  <pic:blipFill rotWithShape="1">
+                    <a:blip r:embed="rId20"/>
+                    <a:srcRect t="8296"/>
+                    <a:stretch>
+                      <a:fillRect/>
+                    </a:stretch>
+                  </pic:blipFill>
+                  <pic:spPr bwMode="auto">
+                    <a:xfrm>
+                      <a:off x="0" y="0"/>
+                      <a:ext cx="3467100" cy="2384611"/>
+                    </a:xfrm>
+                    <a:prstGeom prst="rect">
+                      <a:avLst/>
+                    </a:prstGeom>
+                    <a:noFill/>
+                    <a:ln>
+                      <a:noFill/>
+                    </a:ln>
+                    <a:extLst>
+                      <a:ext uri="{53640926-AAD7-44D8-BBD7-CCE9431645EC}">
+                        <a14:shadowObscured xmlns:a14="http://schemas.microsoft.com/office/drawing/2010/main"/>
+                      </a:ext>
+                    </a:extLst>
+                  </pic:spPr>
+                </pic:pic>
+              </a:graphicData>
+            </a:graphic>
+          </wp:inline>
+        </w:drawing>
+      </w:r>
+    </w:p>
+    <w:p>
+      <w:pPr>
+        <w:pStyle w:val="Textoindependiente"/>
+      </w:pPr>
+      <w:r>
+        <w:t>Figure S8. Posterior predictive distributions (boxplots) and jittered observations (colored circles) of penguin 76 performance. A) Watters model. B) Andy spatial. C) Andy SApatial, MArch = winter. D) Spatial and temporal SSMUs.</w:t>
+      </w:r>
+    </w:p>
+    <w:p>
+      <w:pPr>
+        <w:pStyle w:val="Ttulo1"/>
+      </w:pPr>
+      <w:bookmarkStart w:id="4" w:name="X439ee4f604c236a304670473e60baf80fa8e5c3"/>
+      <w:bookmarkEnd w:id="3"/>
+      <w:r>
         <w:lastRenderedPageBreak/>
-        <w:t>region, unlike patterns reported for other penguin species during severe starvation events (Vianna et al. 2014, Crawford et al. 2025). In this context, summer survey estimates below 1 million tonnes for each gSSMU are inconsistent with observed predator dynamics and likely underestimate krill availability.</w:t>
+        <w:t>E. Krill consumption by main predator taxa</w:t>
+      </w:r>
+    </w:p>
+    <w:p>
+      <w:pPr>
+        <w:pStyle w:val="FirstParagraph"/>
+      </w:pPr>
+      <w:r>
+        <w:t>Estimates of krill consumption by major predator groups during the study period have been previously summarized by Hill et al. (2007). During summer, fish accounted for the largest proportion of krill consumption, with estimated removals of 1,425,193 in the Bransfield Strait (gSMSMU #1: APBSW + APBSE) and 845,772 in the Drake Passage (gSSMU #2: APDPW + APDPE). Combined summer consumption by penguins and whales was estimated at 444,674 in the Bransfield Strait and 328,774 in the Drake Passage. Total summer krill consumption therefore exceeded 1 Mt in both gSSMU 1 and gSSMU 2.</w:t>
+      </w:r>
+    </w:p>
+    <w:p>
+      <w:pPr>
+        <w:pStyle w:val="Textoindependiente"/>
+      </w:pPr>
+      <w:r>
+        <w:t>Watters et al. (2020) noted “krill biomass in the Antarctic Peninsula is generally sufficient to support penguin production.” Consistent with this, no evidence of acute adult penguin mortality or complete lack of bird attending nesting grounds has been documented in the region, unlike patterns reported for other penguin species during severe starvation events (Vianna et al. 2014, Crawford et al. 2025). In this context, summer survey estimates below 1 million tonnes for each gSSMU are inconsistent with observed predator dynamics and likely underestimate krill availability.</w:t>
       </w:r>
     </w:p>
     <w:p>
@@ -7049,9 +7777,10 @@
       <w:pPr>
         <w:pStyle w:val="Ttulo1"/>
       </w:pPr>
-      <w:bookmarkStart w:id="4" w:name="citations"/>
-      <w:bookmarkEnd w:id="3"/>
+      <w:bookmarkStart w:id="5" w:name="citations"/>
+      <w:bookmarkEnd w:id="4"/>
       <w:r>
+        <w:lastRenderedPageBreak/>
         <w:t>Citations</w:t>
       </w:r>
     </w:p>
@@ -7078,7 +7807,7 @@
       <w:r>
         <w:t xml:space="preserve">Watters, George M., Jefferson T. Hinke, and Christian S. Reiss. 2020. “Long-Term Observations from Antarctica Demonstrate That Mismatched Scales of Fisheries Management and Predator-Prey Interaction Lead to Erroneous Conclusions about Precaution.” Scientific Reports 10 (1). </w:t>
       </w:r>
-      <w:hyperlink r:id="rId15">
+      <w:hyperlink r:id="rId21">
         <w:r>
           <w:rPr>
             <w:rStyle w:val="Hipervnculo"/>
@@ -7089,7 +7818,7 @@
       <w:r>
         <w:t>.</w:t>
       </w:r>
-      <w:bookmarkEnd w:id="4"/>
+      <w:bookmarkEnd w:id="5"/>
     </w:p>
     <w:sectPr>
       <w:pgSz w:w="12240" w:h="15840"/>
@@ -7149,7 +7878,7 @@
   <w:abstractNum w:abstractNumId="0" w15:restartNumberingAfterBreak="0">
     <w:nsid w:val="0000A990"/>
     <w:multiLevelType w:val="multilevel"/>
-    <w:tmpl w:val="A7C01178"/>
+    <w:tmpl w:val="21F400EC"/>
     <w:lvl w:ilvl="0">
       <w:numFmt w:val="bullet"/>
       <w:lvlText w:val=" "/>
@@ -7223,7 +7952,7 @@
       </w:pPr>
     </w:lvl>
   </w:abstractNum>
-  <w:num w:numId="1" w16cid:durableId="1687754099">
+  <w:num w:numId="1" w16cid:durableId="377900203">
     <w:abstractNumId w:val="0"/>
   </w:num>
 </w:numbering>

</xml_diff>

<commit_message>
Javier review, 17 March
</commit_message>
<xml_diff>
--- a/Watters_Rebutt_Suppl_Mat.docx
+++ b/Watters_Rebutt_Suppl_Mat.docx
@@ -6,13 +6,8 @@
       <w:pPr>
         <w:pStyle w:val="Ttulo"/>
       </w:pPr>
-      <w:proofErr w:type="spellStart"/>
       <w:r>
-        <w:t>Supplemtary</w:t>
-      </w:r>
-      <w:proofErr w:type="spellEnd"/>
-      <w:r>
-        <w:t xml:space="preserve"> material: A Rebuttal to Watters et al. (2020): Misinterpretation of Predator-Prey Dynamics leading to erroneous Precautionary Management in Antarctic Krill Fisheries</w:t>
+        <w:t>Supplementary material: A Rebuttal to Watters et al. (2020): Misinterpretation of Predator-Prey Dynamics leading to erroneous Precautionary Management in Antarctic Krill Fisheries</w:t>
       </w:r>
     </w:p>
     <w:p>
@@ -20,7 +15,7 @@
         <w:pStyle w:val="Fecha"/>
       </w:pPr>
       <w:r>
-        <w:t>2026-01-29</w:t>
+        <w:t>2026-03-17</w:t>
       </w:r>
     </w:p>
     <w:p>
@@ -37,23 +32,7 @@
         <w:pStyle w:val="FirstParagraph"/>
       </w:pPr>
       <w:r>
-        <w:t xml:space="preserve">Survey coverage, expressed as nautical miles surveyed within each </w:t>
-      </w:r>
-      <w:proofErr w:type="spellStart"/>
-      <w:r>
-        <w:t>gSSMU</w:t>
-      </w:r>
-      <w:proofErr w:type="spellEnd"/>
-      <w:r>
-        <w:t xml:space="preserve"> and survey leg, varied among years and between legs. In most years, two survey legs were conducted. Watters et al. (2020) proposed excluding surveys with transect coverage of 80 nm or </w:t>
-      </w:r>
-      <w:proofErr w:type="gramStart"/>
-      <w:r>
-        <w:t>less, but</w:t>
-      </w:r>
-      <w:proofErr w:type="gramEnd"/>
-      <w:r>
-        <w:t xml:space="preserve"> did not apply this criterion.</w:t>
+        <w:t>Survey coverage, expressed as nautical miles surveyed within each gSSMU and survey leg, varied among years and between legs. In most years, two survey legs were conducted. Watters et al. (2020) proposed excluding surveys with transect coverage of 80 nm or less, but did not apply this criterion.</w:t>
       </w:r>
     </w:p>
     <w:p>
@@ -61,31 +40,7 @@
         <w:pStyle w:val="Textoindependiente"/>
       </w:pPr>
       <w:r>
-        <w:t xml:space="preserve">Rather than applying a fixed threshold, we examined the frequency distribution of surveyed transect lengths for </w:t>
-      </w:r>
-      <w:proofErr w:type="spellStart"/>
-      <w:r>
-        <w:t>gSSMUs</w:t>
-      </w:r>
-      <w:proofErr w:type="spellEnd"/>
-      <w:r>
-        <w:t xml:space="preserve"> 1 and 2 separately and excluded surveys falling below the lower 10th percentile. This approach resulted in the exclusion of three survey legs in </w:t>
-      </w:r>
-      <w:proofErr w:type="spellStart"/>
-      <w:r>
-        <w:t>gSSMU</w:t>
-      </w:r>
-      <w:proofErr w:type="spellEnd"/>
-      <w:r>
-        <w:t xml:space="preserve"> 1 (≤10 nm; 1996, 1999, 2010, and 2012) and three survey legs in </w:t>
-      </w:r>
-      <w:proofErr w:type="spellStart"/>
-      <w:r>
-        <w:t>gSSMU</w:t>
-      </w:r>
-      <w:proofErr w:type="spellEnd"/>
-      <w:r>
-        <w:t xml:space="preserve"> 2 (≤200 nm; 2010, 2011 and 2012) (Figure S1).</w:t>
+        <w:t>Rather than applying a fixed threshold, we examined the frequency distribution of surveyed transect lengths for gSSMUs 1 and 2 separately and excluded surveys falling below the lower 10th percentile. This approach resulted in the exclusion of four survey legs in gSSMU 1 (≤10 nm; 1996, 1999, 2010, and 2012) and three survey legs in gSSMU 2 (≤200 nm; 2010, 2011 and 2012) (Figure S1).</w:t>
       </w:r>
     </w:p>
     <w:p>
@@ -98,7 +53,7 @@
         </w:rPr>
         <w:lastRenderedPageBreak/>
         <w:drawing>
-          <wp:inline distT="0" distB="0" distL="0" distR="0" wp14:anchorId="6D3B25F0" wp14:editId="6D3B25F1">
+          <wp:inline distT="0" distB="0" distL="0" distR="0" wp14:anchorId="1776D551" wp14:editId="1776D552">
             <wp:extent cx="4267200" cy="2560320"/>
             <wp:effectExtent l="0" t="0" r="0" b="0"/>
             <wp:docPr id="21" name="Picture"/>
@@ -144,7 +99,7 @@
           <w:noProof/>
         </w:rPr>
         <w:drawing>
-          <wp:inline distT="0" distB="0" distL="0" distR="0" wp14:anchorId="6D3B25F2" wp14:editId="6D3B25F3">
+          <wp:inline distT="0" distB="0" distL="0" distR="0" wp14:anchorId="1776D553" wp14:editId="1776D554">
             <wp:extent cx="4267200" cy="2560320"/>
             <wp:effectExtent l="0" t="0" r="0" b="0"/>
             <wp:docPr id="24" name="Picture"/>
@@ -191,15 +146,7 @@
         <w:pStyle w:val="Textoindependiente"/>
       </w:pPr>
       <w:r>
-        <w:t xml:space="preserve">Figure S1. Annual survey coverage (total transect length surveyed) by </w:t>
-      </w:r>
-      <w:proofErr w:type="spellStart"/>
-      <w:r>
-        <w:t>gSSMU</w:t>
-      </w:r>
-      <w:proofErr w:type="spellEnd"/>
-      <w:r>
-        <w:t>, year and survey leg [top panel]. Frequency distribution of summed transect lengths across all surveys, with the 10th percentile marked by the dashed line [bottom panel].</w:t>
+        <w:t>Figure S1. Annual survey coverage (total transect length surveyed) by gSSMU, year and survey leg [top panel]. Frequency distribution of summed transect lengths across all surveys, with the 10th percentile marked by the dashed line [bottom panel].</w:t>
       </w:r>
     </w:p>
     <w:p>
@@ -215,11 +162,7 @@
       <w:bookmarkEnd w:id="0"/>
       <w:r>
         <w:lastRenderedPageBreak/>
-        <w:t xml:space="preserve">B. Distribution of observed vs imputed summer </w:t>
-      </w:r>
-      <w:proofErr w:type="spellStart"/>
-      <w:r>
-        <w:t>ln</w:t>
+        <w:t>B. Distribution of observed vs imputed summer ln</w:t>
       </w:r>
       <w:r>
         <w:rPr>
@@ -228,7 +171,6 @@
         </w:rPr>
         <w:t>LKB</w:t>
       </w:r>
-      <w:proofErr w:type="spellEnd"/>
       <w:r>
         <w:t xml:space="preserve"> values</w:t>
       </w:r>
@@ -238,11 +180,7 @@
         <w:pStyle w:val="FirstParagraph"/>
       </w:pPr>
       <w:r>
-        <w:t xml:space="preserve">We evaluated the procedure used to impute LKB values in years without survey data. First, we assessed whether </w:t>
-      </w:r>
-      <w:proofErr w:type="spellStart"/>
-      <w:r>
-        <w:t>ln</w:t>
+        <w:t>We evaluated the procedure used to impute LKB values in years without survey data. First, we assessed whether ln</w:t>
       </w:r>
       <w:r>
         <w:rPr>
@@ -251,13 +189,8 @@
         </w:rPr>
         <w:t>LKB</w:t>
       </w:r>
-      <w:proofErr w:type="spellEnd"/>
       <w:r>
-        <w:t xml:space="preserve"> from survey observations followed an appropriate parametric distribution. We then generated imputed </w:t>
-      </w:r>
-      <w:proofErr w:type="spellStart"/>
-      <w:r>
-        <w:t>ln</w:t>
+        <w:t xml:space="preserve"> from survey observations followed an appropriate parametric distribution. We then generated imputed ln</w:t>
       </w:r>
       <w:r>
         <w:rPr>
@@ -266,7 +199,6 @@
         </w:rPr>
         <w:t>LKB</w:t>
       </w:r>
-      <w:proofErr w:type="spellEnd"/>
       <w:r>
         <w:t xml:space="preserve"> values following equations (1) and (2) of Watters et al. (2020) and compared the resulting distributions with the empirical distribution of observed data.</w:t>
       </w:r>
@@ -276,11 +208,7 @@
         <w:pStyle w:val="Textoindependiente"/>
       </w:pPr>
       <w:r>
-        <w:t xml:space="preserve">We fitted a log-normal distribution to the survey-based LKB data and assessed normality of </w:t>
-      </w:r>
-      <w:proofErr w:type="spellStart"/>
-      <w:r>
-        <w:t>ln</w:t>
+        <w:t>We fitted a log-normal distribution to the survey-based LKB data and assessed normality of ln</w:t>
       </w:r>
       <w:r>
         <w:rPr>
@@ -289,13 +217,8 @@
         </w:rPr>
         <w:t>LKB</w:t>
       </w:r>
-      <w:proofErr w:type="spellEnd"/>
       <w:r>
-        <w:t xml:space="preserve"> using the Shapiro–Wilk test. Using the same parameterization, we generated 100,000 imputed </w:t>
-      </w:r>
-      <w:proofErr w:type="spellStart"/>
-      <w:r>
-        <w:t>ln</w:t>
+        <w:t xml:space="preserve"> using the Shapiro–Wilk test. Using the same parameterization, we generated 100,000 imputed ln</w:t>
       </w:r>
       <w:r>
         <w:rPr>
@@ -304,13 +227,8 @@
         </w:rPr>
         <w:t>LKB</w:t>
       </w:r>
-      <w:proofErr w:type="spellEnd"/>
       <w:r>
-        <w:t xml:space="preserve"> values from equations (1) and (2), applying lower and upper bounds of 10,000 t and 1 × 10⁹ t, respectively, as defined in Supplementary Material S1. Normality of the imputed </w:t>
-      </w:r>
-      <w:proofErr w:type="spellStart"/>
-      <w:r>
-        <w:t>ln</w:t>
+        <w:t xml:space="preserve"> values from equations (1) and (2), applying lower and upper bounds of 10,000 t and 1 × 10⁹ t, respectively, as defined in Supplementary Material S1. Normality of the imputed ln</w:t>
       </w:r>
       <w:r>
         <w:rPr>
@@ -319,7 +237,6 @@
         </w:rPr>
         <w:t>LKB</w:t>
       </w:r>
-      <w:proofErr w:type="spellEnd"/>
       <w:r>
         <w:t xml:space="preserve"> distribution was then re-evaluated using the Shapiro–Wilk test.</w:t>
       </w:r>
@@ -329,39 +246,7 @@
         <w:pStyle w:val="Textoindependiente"/>
       </w:pPr>
       <w:r>
-        <w:t xml:space="preserve">Observed survey-based LKB distributions for all </w:t>
-      </w:r>
-      <w:proofErr w:type="spellStart"/>
-      <w:r>
-        <w:t>gSSMU</w:t>
-      </w:r>
-      <w:proofErr w:type="spellEnd"/>
-      <w:r>
-        <w:t xml:space="preserve">–SAM combinations were well described by a log-normal distribution (Supplementary Material, Table S1; Figure S2). In contrast, </w:t>
-      </w:r>
-      <w:proofErr w:type="gramStart"/>
-      <w:r>
-        <w:t>ln(</w:t>
-      </w:r>
-      <w:proofErr w:type="gramEnd"/>
-      <w:r>
-        <w:t xml:space="preserve">LKB) values generated through the imputation procedure of Watters et al. (2020) were concentrated toward the upper bound of the imposed limits, with mean </w:t>
-      </w:r>
-      <w:proofErr w:type="gramStart"/>
-      <w:r>
-        <w:t>ln(</w:t>
-      </w:r>
-      <w:proofErr w:type="gramEnd"/>
-      <w:r>
-        <w:t>LKB) values of 17.5–17.7 (approximately 44 Mt</w:t>
-      </w:r>
-      <w:proofErr w:type="gramStart"/>
-      <w:r>
-        <w:t>), and</w:t>
-      </w:r>
-      <w:proofErr w:type="gramEnd"/>
-      <w:r>
-        <w:t xml:space="preserve"> did not conform to a log-normal distribution (Supplementary Material, Table S2; Figure S3).</w:t>
+        <w:t>Observed survey-based LKB distributions for all gSSMU–SAM combinations were well described by a log-normal distribution (Supplementary Material, Table S1; Figure S2). In contrast, ln(LKB) values generated through the imputation procedure of Watters et al. (2020) were concentrated toward the upper bound of the imposed limits, with mean ln(LKB) values of 17.5–17.7 (approximately 44 Mt), and did not conform to a log-normal distribution (Supplementary Material, Table S2; Figure S3).</w:t>
       </w:r>
     </w:p>
     <w:p>
@@ -369,15 +254,7 @@
         <w:pStyle w:val="Textoindependiente"/>
       </w:pPr>
       <w:r>
-        <w:t xml:space="preserve">Table S1. Shapiro–Wilk test results for normality of observed log-transformed LKB values, reported by </w:t>
-      </w:r>
-      <w:proofErr w:type="spellStart"/>
-      <w:r>
-        <w:t>gSSMU</w:t>
-      </w:r>
-      <w:proofErr w:type="spellEnd"/>
-      <w:r>
-        <w:t xml:space="preserve"> and SAM sign. Columns show sample size (n), p-value, and W-statistic.</w:t>
+        <w:t>Table S1. Shapiro–Wilk test results for normality of observed log-transformed LKB values, reported by gSSMU and SAM sign. Columns show sample size (n), p-value, and W-statistic.</w:t>
       </w:r>
     </w:p>
     <w:tbl>
@@ -406,28 +283,22 @@
             <w:pPr>
               <w:pStyle w:val="Compact"/>
             </w:pPr>
-            <w:proofErr w:type="spellStart"/>
             <w:r>
               <w:t>gSSMU</w:t>
             </w:r>
-            <w:proofErr w:type="spellEnd"/>
-          </w:p>
-        </w:tc>
-        <w:tc>
-          <w:tcPr>
-            <w:tcW w:w="0" w:type="auto"/>
-          </w:tcPr>
-          <w:p>
-            <w:pPr>
-              <w:pStyle w:val="Compact"/>
-            </w:pPr>
-            <w:proofErr w:type="spellStart"/>
-            <w:proofErr w:type="gramStart"/>
+          </w:p>
+        </w:tc>
+        <w:tc>
+          <w:tcPr>
+            <w:tcW w:w="0" w:type="auto"/>
+          </w:tcPr>
+          <w:p>
+            <w:pPr>
+              <w:pStyle w:val="Compact"/>
+            </w:pPr>
             <w:r>
               <w:t>sam.sign</w:t>
             </w:r>
-            <w:proofErr w:type="spellEnd"/>
-            <w:proofErr w:type="gramEnd"/>
           </w:p>
         </w:tc>
         <w:tc>
@@ -453,11 +324,9 @@
               <w:pStyle w:val="Compact"/>
               <w:jc w:val="right"/>
             </w:pPr>
-            <w:proofErr w:type="spellStart"/>
             <w:r>
               <w:t>p_value</w:t>
             </w:r>
-            <w:proofErr w:type="spellEnd"/>
           </w:p>
         </w:tc>
         <w:tc>
@@ -761,31 +630,7 @@
         <w:pStyle w:val="Textoindependiente"/>
       </w:pPr>
       <w:r>
-        <w:t>Table S2. Shapiro–Wilk test results for normality of imputed log-transformed LKB values. The table reports the total number of imputations generated (</w:t>
-      </w:r>
-      <w:proofErr w:type="spellStart"/>
-      <w:r>
-        <w:t>n_total</w:t>
-      </w:r>
-      <w:proofErr w:type="spellEnd"/>
-      <w:r>
-        <w:t>), the subsample used for the test (</w:t>
-      </w:r>
-      <w:proofErr w:type="spellStart"/>
-      <w:r>
-        <w:t>n_used</w:t>
-      </w:r>
-      <w:proofErr w:type="spellEnd"/>
-      <w:r>
-        <w:t xml:space="preserve">), and the corresponding W and p values for each </w:t>
-      </w:r>
-      <w:proofErr w:type="spellStart"/>
-      <w:r>
-        <w:t>gSSMU</w:t>
-      </w:r>
-      <w:proofErr w:type="spellEnd"/>
-      <w:r>
-        <w:t xml:space="preserve"> and SAM sign.</w:t>
+        <w:t>Table S2. Shapiro–Wilk test results for normality of imputed log-transformed LKB values. The table reports the total number of imputations generated (n_total), the subsample used for the test (n_used), and the corresponding W and p values for each gSSMU and SAM sign.</w:t>
       </w:r>
     </w:p>
     <w:tbl>
@@ -815,60 +660,50 @@
             <w:pPr>
               <w:pStyle w:val="Compact"/>
             </w:pPr>
-            <w:proofErr w:type="spellStart"/>
             <w:r>
               <w:t>gSSMU</w:t>
             </w:r>
-            <w:proofErr w:type="spellEnd"/>
-          </w:p>
-        </w:tc>
-        <w:tc>
-          <w:tcPr>
-            <w:tcW w:w="0" w:type="auto"/>
-          </w:tcPr>
-          <w:p>
-            <w:pPr>
-              <w:pStyle w:val="Compact"/>
-            </w:pPr>
-            <w:proofErr w:type="spellStart"/>
-            <w:proofErr w:type="gramStart"/>
+          </w:p>
+        </w:tc>
+        <w:tc>
+          <w:tcPr>
+            <w:tcW w:w="0" w:type="auto"/>
+          </w:tcPr>
+          <w:p>
+            <w:pPr>
+              <w:pStyle w:val="Compact"/>
+            </w:pPr>
             <w:r>
               <w:t>sam.sign</w:t>
             </w:r>
-            <w:proofErr w:type="spellEnd"/>
-            <w:proofErr w:type="gramEnd"/>
-          </w:p>
-        </w:tc>
-        <w:tc>
-          <w:tcPr>
-            <w:tcW w:w="0" w:type="auto"/>
-          </w:tcPr>
-          <w:p>
-            <w:pPr>
-              <w:pStyle w:val="Compact"/>
-              <w:jc w:val="right"/>
-            </w:pPr>
-            <w:proofErr w:type="spellStart"/>
+          </w:p>
+        </w:tc>
+        <w:tc>
+          <w:tcPr>
+            <w:tcW w:w="0" w:type="auto"/>
+          </w:tcPr>
+          <w:p>
+            <w:pPr>
+              <w:pStyle w:val="Compact"/>
+              <w:jc w:val="right"/>
+            </w:pPr>
             <w:r>
               <w:t>n_total</w:t>
             </w:r>
-            <w:proofErr w:type="spellEnd"/>
-          </w:p>
-        </w:tc>
-        <w:tc>
-          <w:tcPr>
-            <w:tcW w:w="0" w:type="auto"/>
-          </w:tcPr>
-          <w:p>
-            <w:pPr>
-              <w:pStyle w:val="Compact"/>
-              <w:jc w:val="right"/>
-            </w:pPr>
-            <w:proofErr w:type="spellStart"/>
+          </w:p>
+        </w:tc>
+        <w:tc>
+          <w:tcPr>
+            <w:tcW w:w="0" w:type="auto"/>
+          </w:tcPr>
+          <w:p>
+            <w:pPr>
+              <w:pStyle w:val="Compact"/>
+              <w:jc w:val="right"/>
+            </w:pPr>
             <w:r>
               <w:t>n_used</w:t>
             </w:r>
-            <w:proofErr w:type="spellEnd"/>
           </w:p>
         </w:tc>
         <w:tc>
@@ -894,11 +729,9 @@
               <w:pStyle w:val="Compact"/>
               <w:jc w:val="right"/>
             </w:pPr>
-            <w:proofErr w:type="spellStart"/>
             <w:r>
               <w:t>p_value</w:t>
             </w:r>
-            <w:proofErr w:type="spellEnd"/>
           </w:p>
         </w:tc>
       </w:tr>
@@ -1249,7 +1082,7 @@
         </w:rPr>
         <w:lastRenderedPageBreak/>
         <w:drawing>
-          <wp:inline distT="0" distB="0" distL="0" distR="0" wp14:anchorId="6D3B25F4" wp14:editId="6D3B25F5">
+          <wp:inline distT="0" distB="0" distL="0" distR="0" wp14:anchorId="1776D555" wp14:editId="1776D556">
             <wp:extent cx="4267200" cy="2983706"/>
             <wp:effectExtent l="0" t="0" r="0" b="0"/>
             <wp:docPr id="28" name="Picture"/>
@@ -1296,31 +1129,7 @@
         <w:pStyle w:val="Textoindependiente"/>
       </w:pPr>
       <w:r>
-        <w:t>Figure S2. Distribution of ln-transformed acoustic biomass (</w:t>
-      </w:r>
-      <w:proofErr w:type="spellStart"/>
-      <w:r>
-        <w:t>LnSurvey</w:t>
-      </w:r>
-      <w:proofErr w:type="spellEnd"/>
-      <w:r>
-        <w:t xml:space="preserve">) shown as histograms stratified by </w:t>
-      </w:r>
-      <w:proofErr w:type="spellStart"/>
-      <w:r>
-        <w:t>gSSMU</w:t>
-      </w:r>
-      <w:proofErr w:type="spellEnd"/>
-      <w:r>
-        <w:t xml:space="preserve"> (1, 2) and SAM sign (Neg, Pos). The solid curve in each panel shows the </w:t>
-      </w:r>
-      <w:proofErr w:type="gramStart"/>
-      <w:r>
-        <w:t>log</w:t>
-      </w:r>
-      <w:proofErr w:type="gramEnd"/>
-      <w:r>
-        <w:t>-normal density fitted to the observed survey values.</w:t>
+        <w:t>Figure S2. Distribution of ln-transformed acoustic biomass (LnSurvey) shown as histograms stratified by gSSMU (1, 2) and SAM sign (Neg, Pos). The solid curve in each panel shows the log-normal density fitted to the observed survey values.</w:t>
       </w:r>
     </w:p>
     <w:p>
@@ -1332,7 +1141,7 @@
           <w:noProof/>
         </w:rPr>
         <w:drawing>
-          <wp:inline distT="0" distB="0" distL="0" distR="0" wp14:anchorId="6D3B25F6" wp14:editId="6D3B25F7">
+          <wp:inline distT="0" distB="0" distL="0" distR="0" wp14:anchorId="1776D557" wp14:editId="1776D558">
             <wp:extent cx="4267200" cy="2769576"/>
             <wp:effectExtent l="0" t="0" r="0" b="0"/>
             <wp:docPr id="31" name="Picture"/>
@@ -1379,31 +1188,7 @@
         <w:pStyle w:val="Textoindependiente"/>
       </w:pPr>
       <w:r>
-        <w:t>Figure S3. Distribution of ln-transformed imputed biomass (</w:t>
-      </w:r>
-      <w:proofErr w:type="spellStart"/>
-      <w:r>
-        <w:t>LnSurvey</w:t>
-      </w:r>
-      <w:proofErr w:type="spellEnd"/>
-      <w:r>
-        <w:t xml:space="preserve">) shown as histograms stratified by </w:t>
-      </w:r>
-      <w:proofErr w:type="spellStart"/>
-      <w:r>
-        <w:t>gSSMU</w:t>
-      </w:r>
-      <w:proofErr w:type="spellEnd"/>
-      <w:r>
-        <w:t xml:space="preserve"> (1, 2) and SAM sign (Neg, Pos). The solid curve in each panel shows the </w:t>
-      </w:r>
-      <w:proofErr w:type="gramStart"/>
-      <w:r>
-        <w:t>log</w:t>
-      </w:r>
-      <w:proofErr w:type="gramEnd"/>
-      <w:r>
-        <w:t>-normal density fitted to the observed survey values.</w:t>
+        <w:t>Figure S3. Distribution of ln-transformed imputed biomass (LnSurvey) shown as histograms stratified by gSSMU (1, 2) and SAM sign (Neg, Pos). The solid curve in each panel shows the log-normal density fitted to the observed survey values.</w:t>
       </w:r>
     </w:p>
     <w:p>
@@ -1422,15 +1207,7 @@
         <w:pStyle w:val="FirstParagraph"/>
       </w:pPr>
       <w:r>
-        <w:t>Penguin performance and posterior predictive distributions were re-</w:t>
-      </w:r>
-      <w:proofErr w:type="spellStart"/>
-      <w:r>
-        <w:t>analysed</w:t>
-      </w:r>
-      <w:proofErr w:type="spellEnd"/>
-      <w:r>
-        <w:t xml:space="preserve"> after excluding surveys with low spatial coverage. In this initial sensitivity analysis, missing summer LKB values were not imputed (Figures S4–S5). These analyses are directly comparable to Supplementary Figures S7–S8 of Watters et al. (2020). We then repeated the analysis with missing summer LKB values imputed using the median summer LKB derived from surveyed years (Table 1; Figures S6–S7).</w:t>
+        <w:t>Penguin performance and posterior predictive distributions were re-analysed after excluding surveys with low spatial coverage. In this initial sensitivity analysis, missing summer LKB values were not imputed (Figures S4–S5). These analyses are directly comparable to Supplementary Figures S7–S8 of Watters et al. (2020). We then repeated the analysis with missing summer LKB values imputed using the median summer LKB derived from surveyed years (Table 1; Figures S6–S7).</w:t>
       </w:r>
     </w:p>
     <w:p>
@@ -1462,15 +1239,7 @@
         <w:pStyle w:val="Textoindependiente"/>
       </w:pPr>
       <w:r>
-        <w:t>Posterior expectations of penguin performance after filtering for survey coverage (Figure S5) were broadly similar to those reported by Watters et al. (2020, Supplementary Figure S8</w:t>
-      </w:r>
-      <w:proofErr w:type="gramStart"/>
-      <w:r>
-        <w:t>), but</w:t>
-      </w:r>
-      <w:proofErr w:type="gramEnd"/>
-      <w:r>
-        <w:t xml:space="preserve"> differed in three key respects. First, the nominal “worst case” scenario no longer produced the lowest expected performance and instead lay close to the long-term mean. Second, scenarios with high harvest rates (LHR ≥0.10) exhibited median performance comparable to the “best case.” Third, the lowest median performance was associated with intermediate harvest rates (0.01 &lt; LHR &lt; 0.10; equivalent to case 3), followed by intermediate ONI conditions (equivalent to case 7; Figure S5). These patterns were maintained, and further accentuated, when missing summer LKB values were imputed (Figure S7). Consistent with Watters et al. (2020), variation in LKB (&lt;1 Mt versus &gt;1 Mt) exhibited the weakest association with penguin performance.</w:t>
+        <w:t>Posterior expectations of penguin performance after filtering for survey coverage (Figure S5) were broadly similar to those reported by Watters et al. (2020, Supplementary Figure S8), but differed in three key respects. First, the nominal “worst case” scenario no longer produced the lowest expected performance and instead lay close to the long-term mean. Second, scenarios with high harvest rates (LHR ≥0.10) exhibited median performance comparable to the “best case.” Third, the lowest median performance was associated with intermediate harvest rates (0.01 &lt; LHR &lt; 0.10; equivalent to case 3), followed by intermediate ONI conditions (equivalent to case 7; Figure S5). These patterns were maintained, and further accentuated, when missing summer LKB values were imputed (Figure S7). Consistent with Watters et al. (2020), variation in LKB (&lt;1 Mt versus &gt;1 Mt) exhibited the weakest association with penguin performance.</w:t>
       </w:r>
     </w:p>
     <w:p>
@@ -1490,23 +1259,7 @@
         <w:pStyle w:val="Textoindependiente"/>
       </w:pPr>
       <w:r>
-        <w:t xml:space="preserve">Table S3. The posterior predictive distributions </w:t>
-      </w:r>
-      <w:proofErr w:type="gramStart"/>
-      <w:r>
-        <w:t>shows</w:t>
-      </w:r>
-      <w:proofErr w:type="gramEnd"/>
-      <w:r>
-        <w:t xml:space="preserve"> that only some of the potential combinations have actual data (Fig. S4). Specifically, most data </w:t>
-      </w:r>
-      <w:proofErr w:type="gramStart"/>
-      <w:r>
-        <w:t>comes</w:t>
-      </w:r>
-      <w:proofErr w:type="gramEnd"/>
-      <w:r>
-        <w:t xml:space="preserve"> from the following combinations:</w:t>
+        <w:t>Table S3. The posterior predictive distributions shows that only some of the potential combinations have actual data (Fig. S4). Specifically, most data comes from the following combinations:</w:t>
       </w:r>
     </w:p>
     <w:tbl>
@@ -1603,15 +1356,7 @@
               <w:pStyle w:val="Compact"/>
             </w:pPr>
             <w:r>
-              <w:t xml:space="preserve">Case </w:t>
-            </w:r>
-            <w:proofErr w:type="gramStart"/>
-            <w:r>
-              <w:t>1 (‘</w:t>
-            </w:r>
-            <w:proofErr w:type="gramEnd"/>
-            <w:r>
-              <w:t>best’)</w:t>
+              <w:t>Case 1 (‘best’)</w:t>
             </w:r>
           </w:p>
         </w:tc>
@@ -2147,7 +1892,7 @@
           <w:noProof/>
         </w:rPr>
         <w:drawing>
-          <wp:inline distT="0" distB="0" distL="0" distR="0" wp14:anchorId="6D3B25F8" wp14:editId="6D3B25F9">
+          <wp:inline distT="0" distB="0" distL="0" distR="0" wp14:anchorId="1776D559" wp14:editId="1776D55A">
             <wp:extent cx="5334000" cy="4000499"/>
             <wp:effectExtent l="0" t="0" r="0" b="0"/>
             <wp:docPr id="35" name="Picture"/>
@@ -2210,7 +1955,7 @@
           <w:noProof/>
         </w:rPr>
         <w:drawing>
-          <wp:inline distT="0" distB="0" distL="0" distR="0" wp14:anchorId="6D3B25FA" wp14:editId="6D3B25FB">
+          <wp:inline distT="0" distB="0" distL="0" distR="0" wp14:anchorId="1776D55B" wp14:editId="1776D55C">
             <wp:extent cx="5334000" cy="4000499"/>
             <wp:effectExtent l="0" t="0" r="0" b="0"/>
             <wp:docPr id="38" name="Picture"/>
@@ -2270,7 +2015,7 @@
         </w:rPr>
         <w:lastRenderedPageBreak/>
         <w:drawing>
-          <wp:inline distT="0" distB="0" distL="0" distR="0" wp14:anchorId="6D3B25FC" wp14:editId="6D3B25FD">
+          <wp:inline distT="0" distB="0" distL="0" distR="0" wp14:anchorId="1776D55D" wp14:editId="1776D55E">
             <wp:extent cx="5334000" cy="4000499"/>
             <wp:effectExtent l="0" t="0" r="0" b="0"/>
             <wp:docPr id="41" name="Picture"/>
@@ -2330,7 +2075,7 @@
         </w:rPr>
         <w:lastRenderedPageBreak/>
         <w:drawing>
-          <wp:inline distT="0" distB="0" distL="0" distR="0" wp14:anchorId="6D3B25FE" wp14:editId="6D3B25FF">
+          <wp:inline distT="0" distB="0" distL="0" distR="0" wp14:anchorId="1776D55F" wp14:editId="1776D560">
             <wp:extent cx="5334000" cy="4000499"/>
             <wp:effectExtent l="0" t="0" r="0" b="0"/>
             <wp:docPr id="44" name="Picture"/>
@@ -2382,27 +2127,11 @@
     </w:p>
     <w:p>
       <w:pPr>
-        <w:rPr>
-          <w:rFonts w:asciiTheme="majorHAnsi" w:eastAsiaTheme="majorEastAsia" w:hAnsiTheme="majorHAnsi" w:cstheme="majorBidi"/>
-          <w:b/>
-          <w:bCs/>
-          <w:color w:val="4F81BD" w:themeColor="accent1"/>
-          <w:sz w:val="32"/>
-          <w:szCs w:val="32"/>
-        </w:rPr>
+        <w:pStyle w:val="Ttulo1"/>
       </w:pPr>
       <w:bookmarkStart w:id="3" w:name="X19f95fdfba7755b8a0aa9c8458ecd24d9376a21"/>
       <w:bookmarkEnd w:id="2"/>
       <w:r>
-        <w:br w:type="page"/>
-      </w:r>
-    </w:p>
-    <w:p>
-      <w:pPr>
-        <w:pStyle w:val="Ttulo1"/>
-      </w:pPr>
-      <w:r>
-        <w:lastRenderedPageBreak/>
         <w:t>D. Continuing spatial and temporal mismatches</w:t>
       </w:r>
     </w:p>
@@ -2475,46 +2204,37 @@
               <w:pStyle w:val="Compact"/>
               <w:jc w:val="right"/>
             </w:pPr>
-            <w:proofErr w:type="gramStart"/>
-            <w:r>
-              <w:t>Area..</w:t>
-            </w:r>
-            <w:proofErr w:type="gramEnd"/>
-            <w:r>
-              <w:t>km2.</w:t>
-            </w:r>
-          </w:p>
-        </w:tc>
-        <w:tc>
-          <w:tcPr>
-            <w:tcW w:w="0" w:type="auto"/>
-          </w:tcPr>
-          <w:p>
-            <w:pPr>
-              <w:pStyle w:val="Compact"/>
-              <w:jc w:val="right"/>
-            </w:pPr>
-            <w:proofErr w:type="spellStart"/>
+            <w:r>
+              <w:t>Area..km2.</w:t>
+            </w:r>
+          </w:p>
+        </w:tc>
+        <w:tc>
+          <w:tcPr>
+            <w:tcW w:w="0" w:type="auto"/>
+          </w:tcPr>
+          <w:p>
+            <w:pPr>
+              <w:pStyle w:val="Compact"/>
+              <w:jc w:val="right"/>
+            </w:pPr>
             <w:r>
               <w:t>gSSMU</w:t>
             </w:r>
-            <w:proofErr w:type="spellEnd"/>
-          </w:p>
-        </w:tc>
-        <w:tc>
-          <w:tcPr>
-            <w:tcW w:w="0" w:type="auto"/>
-          </w:tcPr>
-          <w:p>
-            <w:pPr>
-              <w:pStyle w:val="Compact"/>
-              <w:jc w:val="right"/>
-            </w:pPr>
-            <w:proofErr w:type="spellStart"/>
+          </w:p>
+        </w:tc>
+        <w:tc>
+          <w:tcPr>
+            <w:tcW w:w="0" w:type="auto"/>
+          </w:tcPr>
+          <w:p>
+            <w:pPr>
+              <w:pStyle w:val="Compact"/>
+              <w:jc w:val="right"/>
+            </w:pPr>
             <w:r>
               <w:t>Area.fraction</w:t>
             </w:r>
-            <w:proofErr w:type="spellEnd"/>
           </w:p>
         </w:tc>
       </w:tr>
@@ -2699,6 +2419,7 @@
               <w:pStyle w:val="Compact"/>
             </w:pPr>
             <w:r>
+              <w:lastRenderedPageBreak/>
               <w:t>APDPE</w:t>
             </w:r>
           </w:p>
@@ -2980,20 +2701,7 @@
         <w:pStyle w:val="Textoindependiente"/>
       </w:pPr>
       <w:r>
-        <w:t xml:space="preserve">Effect of Spatial and temporal mismatches </w:t>
-      </w:r>
-      <w:proofErr w:type="gramStart"/>
-      <w:r>
-        <w:t>in</w:t>
-      </w:r>
-      <w:proofErr w:type="gramEnd"/>
-      <w:r>
-        <w:t xml:space="preserve"> penguin performance.</w:t>
-      </w:r>
-    </w:p>
-    <w:p>
-      <w:r>
-        <w:br w:type="page"/>
+        <w:t>Effect of Spatial and temporal mismatches in penguin performance.</w:t>
       </w:r>
     </w:p>
     <w:p>
@@ -3004,10 +2712,9 @@
         <w:rPr>
           <w:noProof/>
         </w:rPr>
-        <w:lastRenderedPageBreak/>
         <w:drawing>
-          <wp:inline distT="0" distB="0" distL="0" distR="0" wp14:anchorId="6D3B2600" wp14:editId="01143BB1">
-            <wp:extent cx="3465830" cy="1906176"/>
+          <wp:inline distT="0" distB="0" distL="0" distR="0" wp14:anchorId="1776D561" wp14:editId="1776D562">
+            <wp:extent cx="3467100" cy="2600324"/>
             <wp:effectExtent l="0" t="0" r="0" b="0"/>
             <wp:docPr id="50" name="Picture"/>
             <wp:cNvGraphicFramePr/>
@@ -3020,9 +2727,8 @@
                       <a:picLocks noChangeAspect="1" noChangeArrowheads="1"/>
                     </pic:cNvPicPr>
                   </pic:nvPicPr>
-                  <pic:blipFill rotWithShape="1">
+                  <pic:blipFill>
                     <a:blip r:embed="rId17"/>
-                    <a:srcRect t="8960" b="17707"/>
                     <a:stretch>
                       <a:fillRect/>
                     </a:stretch>
@@ -3030,20 +2736,17 @@
                   <pic:spPr bwMode="auto">
                     <a:xfrm>
                       <a:off x="0" y="0"/>
-                      <a:ext cx="3467100" cy="1906874"/>
+                      <a:ext cx="3467100" cy="2600324"/>
                     </a:xfrm>
                     <a:prstGeom prst="rect">
                       <a:avLst/>
                     </a:prstGeom>
                     <a:noFill/>
-                    <a:ln>
+                    <a:ln w="9525">
                       <a:noFill/>
+                      <a:headEnd/>
+                      <a:tailEnd/>
                     </a:ln>
-                    <a:extLst>
-                      <a:ext uri="{53640926-AAD7-44D8-BBD7-CCE9431645EC}">
-                        <a14:shadowObscured xmlns:a14="http://schemas.microsoft.com/office/drawing/2010/main"/>
-                      </a:ext>
-                    </a:extLst>
                   </pic:spPr>
                 </pic:pic>
               </a:graphicData>
@@ -3056,8 +2759,8 @@
           <w:noProof/>
         </w:rPr>
         <w:drawing>
-          <wp:inline distT="0" distB="0" distL="0" distR="0" wp14:anchorId="6D3B2602" wp14:editId="5CB97B68">
-            <wp:extent cx="3465830" cy="1449238"/>
+          <wp:inline distT="0" distB="0" distL="0" distR="0" wp14:anchorId="1776D563" wp14:editId="1776D564">
+            <wp:extent cx="3467100" cy="2383631"/>
             <wp:effectExtent l="0" t="0" r="0" b="0"/>
             <wp:docPr id="53" name="Picture"/>
             <wp:cNvGraphicFramePr/>
@@ -3070,9 +2773,8 @@
                       <a:picLocks noChangeAspect="1" noChangeArrowheads="1"/>
                     </pic:cNvPicPr>
                   </pic:nvPicPr>
-                  <pic:blipFill rotWithShape="1">
+                  <pic:blipFill>
                     <a:blip r:embed="rId18"/>
-                    <a:srcRect t="9773" b="29404"/>
                     <a:stretch>
                       <a:fillRect/>
                     </a:stretch>
@@ -3080,20 +2782,64 @@
                   <pic:spPr bwMode="auto">
                     <a:xfrm>
                       <a:off x="0" y="0"/>
-                      <a:ext cx="3467100" cy="1449769"/>
+                      <a:ext cx="3467100" cy="2383631"/>
                     </a:xfrm>
                     <a:prstGeom prst="rect">
                       <a:avLst/>
                     </a:prstGeom>
                     <a:noFill/>
-                    <a:ln>
+                    <a:ln w="9525">
                       <a:noFill/>
+                      <a:headEnd/>
+                      <a:tailEnd/>
                     </a:ln>
-                    <a:extLst>
-                      <a:ext uri="{53640926-AAD7-44D8-BBD7-CCE9431645EC}">
-                        <a14:shadowObscured xmlns:a14="http://schemas.microsoft.com/office/drawing/2010/main"/>
-                      </a:ext>
-                    </a:extLst>
+                  </pic:spPr>
+                </pic:pic>
+              </a:graphicData>
+            </a:graphic>
+          </wp:inline>
+        </w:drawing>
+      </w:r>
+      <w:r>
+        <w:rPr>
+          <w:noProof/>
+        </w:rPr>
+        <w:lastRenderedPageBreak/>
+        <w:drawing>
+          <wp:inline distT="0" distB="0" distL="0" distR="0" wp14:anchorId="1776D565" wp14:editId="1776D566">
+            <wp:extent cx="3467100" cy="2600324"/>
+            <wp:effectExtent l="0" t="0" r="0" b="0"/>
+            <wp:docPr id="56" name="Picture"/>
+            <wp:cNvGraphicFramePr/>
+            <a:graphic xmlns:a="http://schemas.openxmlformats.org/drawingml/2006/main">
+              <a:graphicData uri="http://schemas.openxmlformats.org/drawingml/2006/picture">
+                <pic:pic xmlns:pic="http://schemas.openxmlformats.org/drawingml/2006/picture">
+                  <pic:nvPicPr>
+                    <pic:cNvPr id="57" name="Picture" descr="./A_Results/Model02_Andy/Posterior_predictive_dist_mod02_Andy_MWinter.png"/>
+                    <pic:cNvPicPr>
+                      <a:picLocks noChangeAspect="1" noChangeArrowheads="1"/>
+                    </pic:cNvPicPr>
+                  </pic:nvPicPr>
+                  <pic:blipFill>
+                    <a:blip r:embed="rId19"/>
+                    <a:stretch>
+                      <a:fillRect/>
+                    </a:stretch>
+                  </pic:blipFill>
+                  <pic:spPr bwMode="auto">
+                    <a:xfrm>
+                      <a:off x="0" y="0"/>
+                      <a:ext cx="3467100" cy="2600324"/>
+                    </a:xfrm>
+                    <a:prstGeom prst="rect">
+                      <a:avLst/>
+                    </a:prstGeom>
+                    <a:noFill/>
+                    <a:ln w="9525">
+                      <a:noFill/>
+                      <a:headEnd/>
+                      <a:tailEnd/>
+                    </a:ln>
                   </pic:spPr>
                 </pic:pic>
               </a:graphicData>
@@ -3106,58 +2852,8 @@
           <w:noProof/>
         </w:rPr>
         <w:drawing>
-          <wp:inline distT="0" distB="0" distL="0" distR="0" wp14:anchorId="6D3B2604" wp14:editId="218B4B35">
-            <wp:extent cx="3465830" cy="1682151"/>
-            <wp:effectExtent l="0" t="0" r="0" b="0"/>
-            <wp:docPr id="56" name="Picture"/>
-            <wp:cNvGraphicFramePr/>
-            <a:graphic xmlns:a="http://schemas.openxmlformats.org/drawingml/2006/main">
-              <a:graphicData uri="http://schemas.openxmlformats.org/drawingml/2006/picture">
-                <pic:pic xmlns:pic="http://schemas.openxmlformats.org/drawingml/2006/picture">
-                  <pic:nvPicPr>
-                    <pic:cNvPr id="57" name="Picture" descr="./A_Results/Model02_Andy/Posterior_predictive_dist_mod02_Andy_MWinter.png"/>
-                    <pic:cNvPicPr>
-                      <a:picLocks noChangeAspect="1" noChangeArrowheads="1"/>
-                    </pic:cNvPicPr>
-                  </pic:nvPicPr>
-                  <pic:blipFill rotWithShape="1">
-                    <a:blip r:embed="rId19"/>
-                    <a:srcRect t="8959" b="26327"/>
-                    <a:stretch>
-                      <a:fillRect/>
-                    </a:stretch>
-                  </pic:blipFill>
-                  <pic:spPr bwMode="auto">
-                    <a:xfrm>
-                      <a:off x="0" y="0"/>
-                      <a:ext cx="3467100" cy="1682767"/>
-                    </a:xfrm>
-                    <a:prstGeom prst="rect">
-                      <a:avLst/>
-                    </a:prstGeom>
-                    <a:noFill/>
-                    <a:ln>
-                      <a:noFill/>
-                    </a:ln>
-                    <a:extLst>
-                      <a:ext uri="{53640926-AAD7-44D8-BBD7-CCE9431645EC}">
-                        <a14:shadowObscured xmlns:a14="http://schemas.microsoft.com/office/drawing/2010/main"/>
-                      </a:ext>
-                    </a:extLst>
-                  </pic:spPr>
-                </pic:pic>
-              </a:graphicData>
-            </a:graphic>
-          </wp:inline>
-        </w:drawing>
-      </w:r>
-      <w:r>
-        <w:rPr>
-          <w:noProof/>
-        </w:rPr>
-        <w:drawing>
-          <wp:inline distT="0" distB="0" distL="0" distR="0" wp14:anchorId="6D3B2606" wp14:editId="24FC6041">
-            <wp:extent cx="3466255" cy="2384030"/>
+          <wp:inline distT="0" distB="0" distL="0" distR="0" wp14:anchorId="1776D567" wp14:editId="1776D568">
+            <wp:extent cx="3467100" cy="2600324"/>
             <wp:effectExtent l="0" t="0" r="0" b="0"/>
             <wp:docPr id="59" name="Picture"/>
             <wp:cNvGraphicFramePr/>
@@ -3170,9 +2866,8 @@
                       <a:picLocks noChangeAspect="1" noChangeArrowheads="1"/>
                     </pic:cNvPicPr>
                   </pic:nvPicPr>
-                  <pic:blipFill rotWithShape="1">
+                  <pic:blipFill>
                     <a:blip r:embed="rId20"/>
-                    <a:srcRect t="8296"/>
                     <a:stretch>
                       <a:fillRect/>
                     </a:stretch>
@@ -3180,20 +2875,17 @@
                   <pic:spPr bwMode="auto">
                     <a:xfrm>
                       <a:off x="0" y="0"/>
-                      <a:ext cx="3467100" cy="2384611"/>
+                      <a:ext cx="3467100" cy="2600324"/>
                     </a:xfrm>
                     <a:prstGeom prst="rect">
                       <a:avLst/>
                     </a:prstGeom>
                     <a:noFill/>
-                    <a:ln>
+                    <a:ln w="9525">
                       <a:noFill/>
+                      <a:headEnd/>
+                      <a:tailEnd/>
                     </a:ln>
-                    <a:extLst>
-                      <a:ext uri="{53640926-AAD7-44D8-BBD7-CCE9431645EC}">
-                        <a14:shadowObscured xmlns:a14="http://schemas.microsoft.com/office/drawing/2010/main"/>
-                      </a:ext>
-                    </a:extLst>
                   </pic:spPr>
                 </pic:pic>
               </a:graphicData>
@@ -3207,23 +2899,7 @@
         <w:pStyle w:val="Textoindependiente"/>
       </w:pPr>
       <w:r>
-        <w:t xml:space="preserve">Figure S8. Posterior predictive distributions (boxplots) and jittered observations (colored circles) of penguin 76 performance. A) Watters model. B) Andy spatial. C) Andy </w:t>
-      </w:r>
-      <w:proofErr w:type="spellStart"/>
-      <w:r>
-        <w:t>SApatial</w:t>
-      </w:r>
-      <w:proofErr w:type="spellEnd"/>
-      <w:r>
-        <w:t xml:space="preserve">, </w:t>
-      </w:r>
-      <w:proofErr w:type="spellStart"/>
-      <w:r>
-        <w:t>MArch</w:t>
-      </w:r>
-      <w:proofErr w:type="spellEnd"/>
-      <w:r>
-        <w:t xml:space="preserve"> = winter. D) Spatial and temporal SSMUs.</w:t>
+        <w:t>Figure S8. Posterior predictive distributions (boxplots) and jittered observations (colored circles) of penguin 76 performance. A) Watters model. B) Andy spatial. C) Andy SApatial, MArch = winter. D) Spatial and temporal SSMUs.</w:t>
       </w:r>
     </w:p>
     <w:p>
@@ -3233,7 +2909,6 @@
       <w:bookmarkStart w:id="4" w:name="X439ee4f604c236a304670473e60baf80fa8e5c3"/>
       <w:bookmarkEnd w:id="3"/>
       <w:r>
-        <w:lastRenderedPageBreak/>
         <w:t>E. Krill consumption by main predator taxa</w:t>
       </w:r>
     </w:p>
@@ -3242,47 +2917,7 @@
         <w:pStyle w:val="FirstParagraph"/>
       </w:pPr>
       <w:r>
-        <w:t>Estimates of krill consumption by major predator groups during the study period have been previously summarized by Hill et al. (2007). During summer, fish accounted for the largest proportion of krill consumption, with estimated removals of 1,425,193 in the Bransfield Strait (</w:t>
-      </w:r>
-      <w:proofErr w:type="spellStart"/>
-      <w:r>
-        <w:t>gSMSMU</w:t>
-      </w:r>
-      <w:proofErr w:type="spellEnd"/>
-      <w:r>
-        <w:t xml:space="preserve"> #1: APBSW + APBSE) and 845,772 in the Drake Passage (</w:t>
-      </w:r>
-      <w:proofErr w:type="spellStart"/>
-      <w:r>
-        <w:t>gSSMU</w:t>
-      </w:r>
-      <w:proofErr w:type="spellEnd"/>
-      <w:r>
-        <w:t xml:space="preserve"> #2: APDPW + APDPE). Combined summer consumption by penguins and whales was estimated at 444,674 in </w:t>
-      </w:r>
-      <w:proofErr w:type="gramStart"/>
-      <w:r>
-        <w:t>the Bransfield</w:t>
-      </w:r>
-      <w:proofErr w:type="gramEnd"/>
-      <w:r>
-        <w:t xml:space="preserve"> Strait and 328,774 in the Drake Passage. Total summer krill consumption therefore exceeded 1 Mt in both </w:t>
-      </w:r>
-      <w:proofErr w:type="spellStart"/>
-      <w:r>
-        <w:t>gSSMU</w:t>
-      </w:r>
-      <w:proofErr w:type="spellEnd"/>
-      <w:r>
-        <w:t xml:space="preserve"> 1 and </w:t>
-      </w:r>
-      <w:proofErr w:type="spellStart"/>
-      <w:r>
-        <w:t>gSSMU</w:t>
-      </w:r>
-      <w:proofErr w:type="spellEnd"/>
-      <w:r>
-        <w:t xml:space="preserve"> 2.</w:t>
+        <w:t>Estimates of krill consumption by major predator groups during the study period have been previously summarized by Hill et al. (2007). During summer, fish accounted for the largest proportion of krill consumption, with estimated removals of 1,425,193 in the Bransfield Strait (gSMSMU #1: APBSW + APBSE) and 845,772 in the Drake Passage (gSSMU #2: APDPW + APDPE). Combined summer consumption by penguins and whales was estimated at 444,674 in the Bransfield Strait and 328,774 in the Drake Passage. Total summer krill consumption therefore exceeded 1 Mt in both gSSMU 1 and gSSMU 2.</w:t>
       </w:r>
     </w:p>
     <w:p>
@@ -3290,15 +2925,8 @@
         <w:pStyle w:val="Textoindependiente"/>
       </w:pPr>
       <w:r>
-        <w:t xml:space="preserve">Watters et al. (2020) noted “krill biomass in the Antarctic Peninsula is generally sufficient to support penguin production.” Consistent with this, no evidence of acute adult penguin mortality or complete lack of bird attending nesting grounds has been documented in the region, unlike patterns reported for other penguin species during severe starvation events (Vianna et al. 2014, Crawford et al. 2025). In this context, summer survey estimates below 1 million tonnes for each </w:t>
-      </w:r>
-      <w:proofErr w:type="spellStart"/>
-      <w:r>
-        <w:t>gSSMU</w:t>
-      </w:r>
-      <w:proofErr w:type="spellEnd"/>
-      <w:r>
-        <w:t xml:space="preserve"> are inconsistent with observed predator dynamics and likely underestimate krill availability.</w:t>
+        <w:lastRenderedPageBreak/>
+        <w:t>Watters et al. (2020) noted “krill biomass in the Antarctic Peninsula is generally sufficient to support penguin production.” Consistent with this, no evidence of acute adult penguin mortality or complete lack of bird attending nesting grounds has been documented in the region, unlike patterns reported for other penguin species during severe starvation events (Vianna et al. 2014, Crawford et al. 2025). In this context, summer survey estimates below 1 million tonnes for each gSSMU are inconsistent with observed predator dynamics and likely underestimate krill availability.</w:t>
       </w:r>
     </w:p>
     <w:p>
@@ -3306,55 +2934,7 @@
         <w:pStyle w:val="Textoindependiente"/>
       </w:pPr>
       <w:r>
-        <w:t xml:space="preserve">As Watters et al. (2020) indicates, “krill biomass in the AP is generally sufficient to support penguin production.” As no </w:t>
-      </w:r>
-      <w:proofErr w:type="spellStart"/>
-      <w:r>
-        <w:t>evidene</w:t>
-      </w:r>
-      <w:proofErr w:type="spellEnd"/>
-      <w:r>
-        <w:t xml:space="preserve"> of </w:t>
-      </w:r>
-      <w:proofErr w:type="spellStart"/>
-      <w:r>
-        <w:t>accute</w:t>
-      </w:r>
-      <w:proofErr w:type="spellEnd"/>
-      <w:r>
-        <w:t xml:space="preserve"> adult penguin mortality has been recorded for the region (as is the case for other penguin species during </w:t>
-      </w:r>
-      <w:proofErr w:type="spellStart"/>
-      <w:r>
-        <w:t>accute</w:t>
-      </w:r>
-      <w:proofErr w:type="spellEnd"/>
-      <w:r>
-        <w:t xml:space="preserve"> starvation; Crawford et al. 2025), summer survey estimates below 1 </w:t>
-      </w:r>
-      <w:proofErr w:type="gramStart"/>
-      <w:r>
-        <w:t>Million</w:t>
-      </w:r>
-      <w:proofErr w:type="gramEnd"/>
-      <w:r>
-        <w:t xml:space="preserve"> tonnes for each </w:t>
-      </w:r>
-      <w:proofErr w:type="spellStart"/>
-      <w:r>
-        <w:t>gSSMU</w:t>
-      </w:r>
-      <w:proofErr w:type="spellEnd"/>
-      <w:r>
-        <w:t xml:space="preserve"> should be considered as gross </w:t>
-      </w:r>
-      <w:proofErr w:type="spellStart"/>
-      <w:r>
-        <w:t>subestimations</w:t>
-      </w:r>
-      <w:proofErr w:type="spellEnd"/>
-      <w:r>
-        <w:t xml:space="preserve"> of krill availability.</w:t>
+        <w:t>As Watters et al. (2020) indicates, “krill biomass in the AP is generally sufficient to support penguin production.” As no evidene of accute adult penguin mortality has been recorded for the region (as is the case for other penguin species during accute starvation; Crawford et al. 2025), summer survey estimates below 1 Million tonnes for each gSSMU should be considered as gross subestimations of krill availability.</w:t>
       </w:r>
     </w:p>
     <w:p>
@@ -3362,31 +2942,7 @@
         <w:pStyle w:val="Textoindependiente"/>
       </w:pPr>
       <w:r>
-        <w:t xml:space="preserve">Winter consumption estimates were lower but more uncertain. Hill et al. (2007) estimated fish consumption of 255,990 in </w:t>
-      </w:r>
-      <w:proofErr w:type="gramStart"/>
-      <w:r>
-        <w:t>the Bransfield</w:t>
-      </w:r>
-      <w:proofErr w:type="gramEnd"/>
-      <w:r>
-        <w:t xml:space="preserve"> Strait and 147,440 in </w:t>
-      </w:r>
-      <w:proofErr w:type="gramStart"/>
-      <w:r>
-        <w:t>the Drake</w:t>
-      </w:r>
-      <w:proofErr w:type="gramEnd"/>
-      <w:r>
-        <w:t xml:space="preserve"> Passage. Penguin consumption during winter was estimated at 306,416 in the Bransfield Strait and 239,435 in the Drake Passage. Combined winter consumption by fish and penguins therefore exceeded 500,000 t and 350,000 for </w:t>
-      </w:r>
-      <w:proofErr w:type="spellStart"/>
-      <w:r>
-        <w:t>gSSMU</w:t>
-      </w:r>
-      <w:proofErr w:type="spellEnd"/>
-      <w:r>
-        <w:t xml:space="preserve"> #1 and #2. respectively.</w:t>
+        <w:t>Winter consumption estimates were lower but more uncertain. Hill et al. (2007) estimated fish consumption of 255,990 in the Bransfield Strait and 147,440 in the Drake Passage. Penguin consumption during winter was estimated at 306,416 in the Bransfield Strait and 239,435 in the Drake Passage. Combined winter consumption by fish and penguins therefore exceeded 500,000 t and 350,000 for gSSMU #1 and #2. respectively.</w:t>
       </w:r>
     </w:p>
     <w:p>
@@ -3505,7 +3061,6 @@
                 <w:szCs w:val="16"/>
               </w:rPr>
             </w:pPr>
-            <w:proofErr w:type="spellStart"/>
             <w:r>
               <w:rPr>
                 <w:rFonts w:ascii="Arial" w:eastAsia="Arial" w:hAnsi="Arial" w:cs="Arial"/>
@@ -3515,7 +3070,6 @@
               </w:rPr>
               <w:t>No_Fish</w:t>
             </w:r>
-            <w:proofErr w:type="spellEnd"/>
           </w:p>
         </w:tc>
         <w:tc>
@@ -3554,7 +3108,6 @@
                 <w:szCs w:val="16"/>
               </w:rPr>
             </w:pPr>
-            <w:proofErr w:type="spellStart"/>
             <w:r>
               <w:rPr>
                 <w:rFonts w:ascii="Arial" w:eastAsia="Arial" w:hAnsi="Arial" w:cs="Arial"/>
@@ -3564,7 +3117,6 @@
               </w:rPr>
               <w:t>No_Whales</w:t>
             </w:r>
-            <w:proofErr w:type="spellEnd"/>
           </w:p>
         </w:tc>
         <w:tc>
@@ -3603,7 +3155,6 @@
                 <w:szCs w:val="16"/>
               </w:rPr>
             </w:pPr>
-            <w:proofErr w:type="spellStart"/>
             <w:r>
               <w:rPr>
                 <w:rFonts w:ascii="Arial" w:eastAsia="Arial" w:hAnsi="Arial" w:cs="Arial"/>
@@ -3613,7 +3164,6 @@
               </w:rPr>
               <w:t>No_Penguins</w:t>
             </w:r>
-            <w:proofErr w:type="spellEnd"/>
           </w:p>
         </w:tc>
         <w:tc>
@@ -3652,7 +3202,6 @@
                 <w:szCs w:val="16"/>
               </w:rPr>
             </w:pPr>
-            <w:proofErr w:type="spellStart"/>
             <w:r>
               <w:rPr>
                 <w:rFonts w:ascii="Arial" w:eastAsia="Arial" w:hAnsi="Arial" w:cs="Arial"/>
@@ -3662,7 +3211,6 @@
               </w:rPr>
               <w:t>Fish_Qsummer_g</w:t>
             </w:r>
-            <w:proofErr w:type="spellEnd"/>
           </w:p>
         </w:tc>
         <w:tc>
@@ -3701,7 +3249,6 @@
                 <w:szCs w:val="16"/>
               </w:rPr>
             </w:pPr>
-            <w:proofErr w:type="spellStart"/>
             <w:r>
               <w:rPr>
                 <w:rFonts w:ascii="Arial" w:eastAsia="Arial" w:hAnsi="Arial" w:cs="Arial"/>
@@ -3711,7 +3258,6 @@
               </w:rPr>
               <w:t>Whale_Qsummer_g</w:t>
             </w:r>
-            <w:proofErr w:type="spellEnd"/>
           </w:p>
         </w:tc>
         <w:tc>
@@ -3750,7 +3296,6 @@
                 <w:szCs w:val="16"/>
               </w:rPr>
             </w:pPr>
-            <w:proofErr w:type="spellStart"/>
             <w:r>
               <w:rPr>
                 <w:rFonts w:ascii="Arial" w:eastAsia="Arial" w:hAnsi="Arial" w:cs="Arial"/>
@@ -3760,7 +3305,6 @@
               </w:rPr>
               <w:t>Penguin_Qsummer_g</w:t>
             </w:r>
-            <w:proofErr w:type="spellEnd"/>
           </w:p>
         </w:tc>
         <w:tc>
@@ -3799,7 +3343,6 @@
                 <w:szCs w:val="16"/>
               </w:rPr>
             </w:pPr>
-            <w:proofErr w:type="spellStart"/>
             <w:r>
               <w:rPr>
                 <w:rFonts w:ascii="Arial" w:eastAsia="Arial" w:hAnsi="Arial" w:cs="Arial"/>
@@ -3809,7 +3352,6 @@
               </w:rPr>
               <w:t>Fish_Krill_ton</w:t>
             </w:r>
-            <w:proofErr w:type="spellEnd"/>
           </w:p>
         </w:tc>
         <w:tc>
@@ -3848,7 +3390,6 @@
                 <w:szCs w:val="16"/>
               </w:rPr>
             </w:pPr>
-            <w:proofErr w:type="spellStart"/>
             <w:r>
               <w:rPr>
                 <w:rFonts w:ascii="Arial" w:eastAsia="Arial" w:hAnsi="Arial" w:cs="Arial"/>
@@ -3858,7 +3399,6 @@
               </w:rPr>
               <w:t>Whale_Krill_ton</w:t>
             </w:r>
-            <w:proofErr w:type="spellEnd"/>
           </w:p>
         </w:tc>
         <w:tc>
@@ -3897,7 +3437,6 @@
                 <w:szCs w:val="16"/>
               </w:rPr>
             </w:pPr>
-            <w:proofErr w:type="spellStart"/>
             <w:r>
               <w:rPr>
                 <w:rFonts w:ascii="Arial" w:eastAsia="Arial" w:hAnsi="Arial" w:cs="Arial"/>
@@ -3907,7 +3446,6 @@
               </w:rPr>
               <w:t>Penguin_Krill_ton</w:t>
             </w:r>
-            <w:proofErr w:type="spellEnd"/>
           </w:p>
         </w:tc>
       </w:tr>
@@ -5924,7 +5462,6 @@
                 <w:szCs w:val="16"/>
               </w:rPr>
             </w:pPr>
-            <w:proofErr w:type="spellStart"/>
             <w:r>
               <w:rPr>
                 <w:rFonts w:ascii="Arial" w:eastAsia="Arial" w:hAnsi="Arial" w:cs="Arial"/>
@@ -5934,7 +5471,6 @@
               </w:rPr>
               <w:t>No_Fish</w:t>
             </w:r>
-            <w:proofErr w:type="spellEnd"/>
           </w:p>
         </w:tc>
         <w:tc>
@@ -5973,7 +5509,6 @@
                 <w:szCs w:val="16"/>
               </w:rPr>
             </w:pPr>
-            <w:proofErr w:type="spellStart"/>
             <w:r>
               <w:rPr>
                 <w:rFonts w:ascii="Arial" w:eastAsia="Arial" w:hAnsi="Arial" w:cs="Arial"/>
@@ -5983,7 +5518,6 @@
               </w:rPr>
               <w:t>No_Whales</w:t>
             </w:r>
-            <w:proofErr w:type="spellEnd"/>
           </w:p>
         </w:tc>
         <w:tc>
@@ -6022,7 +5556,6 @@
                 <w:szCs w:val="16"/>
               </w:rPr>
             </w:pPr>
-            <w:proofErr w:type="spellStart"/>
             <w:r>
               <w:rPr>
                 <w:rFonts w:ascii="Arial" w:eastAsia="Arial" w:hAnsi="Arial" w:cs="Arial"/>
@@ -6032,7 +5565,6 @@
               </w:rPr>
               <w:t>No_Penguins</w:t>
             </w:r>
-            <w:proofErr w:type="spellEnd"/>
           </w:p>
         </w:tc>
         <w:tc>
@@ -6071,7 +5603,6 @@
                 <w:szCs w:val="16"/>
               </w:rPr>
             </w:pPr>
-            <w:proofErr w:type="spellStart"/>
             <w:r>
               <w:rPr>
                 <w:rFonts w:ascii="Arial" w:eastAsia="Arial" w:hAnsi="Arial" w:cs="Arial"/>
@@ -6081,7 +5612,6 @@
               </w:rPr>
               <w:t>Fish_Qwinter_g</w:t>
             </w:r>
-            <w:proofErr w:type="spellEnd"/>
           </w:p>
         </w:tc>
         <w:tc>
@@ -6119,7 +5649,6 @@
                 <w:szCs w:val="16"/>
               </w:rPr>
             </w:pPr>
-            <w:proofErr w:type="spellStart"/>
             <w:r>
               <w:rPr>
                 <w:rFonts w:ascii="Arial" w:eastAsia="Arial" w:hAnsi="Arial" w:cs="Arial"/>
@@ -6129,7 +5658,6 @@
               </w:rPr>
               <w:t>Whale_Qwinter_g</w:t>
             </w:r>
-            <w:proofErr w:type="spellEnd"/>
           </w:p>
         </w:tc>
         <w:tc>
@@ -6168,7 +5696,6 @@
                 <w:szCs w:val="16"/>
               </w:rPr>
             </w:pPr>
-            <w:proofErr w:type="spellStart"/>
             <w:r>
               <w:rPr>
                 <w:rFonts w:ascii="Arial" w:eastAsia="Arial" w:hAnsi="Arial" w:cs="Arial"/>
@@ -6178,7 +5705,6 @@
               </w:rPr>
               <w:t>Penguin_Qwinter_g</w:t>
             </w:r>
-            <w:proofErr w:type="spellEnd"/>
           </w:p>
         </w:tc>
         <w:tc>
@@ -6217,7 +5743,6 @@
                 <w:szCs w:val="16"/>
               </w:rPr>
             </w:pPr>
-            <w:proofErr w:type="spellStart"/>
             <w:r>
               <w:rPr>
                 <w:rFonts w:ascii="Arial" w:eastAsia="Arial" w:hAnsi="Arial" w:cs="Arial"/>
@@ -6227,7 +5752,6 @@
               </w:rPr>
               <w:t>Fish_Krill_ton</w:t>
             </w:r>
-            <w:proofErr w:type="spellEnd"/>
           </w:p>
         </w:tc>
         <w:tc>
@@ -6265,7 +5789,6 @@
                 <w:szCs w:val="16"/>
               </w:rPr>
             </w:pPr>
-            <w:proofErr w:type="spellStart"/>
             <w:r>
               <w:rPr>
                 <w:rFonts w:ascii="Arial" w:eastAsia="Arial" w:hAnsi="Arial" w:cs="Arial"/>
@@ -6275,7 +5798,6 @@
               </w:rPr>
               <w:t>Whale_Krill_ton</w:t>
             </w:r>
-            <w:proofErr w:type="spellEnd"/>
           </w:p>
         </w:tc>
         <w:tc>
@@ -6314,7 +5836,6 @@
                 <w:szCs w:val="16"/>
               </w:rPr>
             </w:pPr>
-            <w:proofErr w:type="spellStart"/>
             <w:r>
               <w:rPr>
                 <w:rFonts w:ascii="Arial" w:eastAsia="Arial" w:hAnsi="Arial" w:cs="Arial"/>
@@ -6324,7 +5845,6 @@
               </w:rPr>
               <w:t>Penguin_Krill_ton</w:t>
             </w:r>
-            <w:proofErr w:type="spellEnd"/>
           </w:p>
         </w:tc>
       </w:tr>
@@ -8224,7 +7744,6 @@
       <w:bookmarkStart w:id="5" w:name="citations"/>
       <w:bookmarkEnd w:id="4"/>
       <w:r>
-        <w:lastRenderedPageBreak/>
         <w:t>Citations</w:t>
       </w:r>
     </w:p>
@@ -8241,31 +7760,7 @@
         <w:pStyle w:val="Textoindependiente"/>
       </w:pPr>
       <w:r>
-        <w:t xml:space="preserve">Vianna </w:t>
-      </w:r>
-      <w:proofErr w:type="gramStart"/>
-      <w:r>
-        <w:t>J.A. ,</w:t>
-      </w:r>
-      <w:proofErr w:type="gramEnd"/>
-      <w:r>
-        <w:t xml:space="preserve"> M. Cortez, B. Ramos, N. </w:t>
-      </w:r>
-      <w:proofErr w:type="spellStart"/>
-      <w:r>
-        <w:t>Sallaberry-Pincheira</w:t>
-      </w:r>
-      <w:proofErr w:type="spellEnd"/>
-      <w:r>
-        <w:t xml:space="preserve">, D. González-Acuña, G. P. M. Dantas, J. Morgante, A. Simeone, and G. Luna-Jorquera. 2014. Changes in abundance and distribution of Humboldt penguin Spheniscus </w:t>
-      </w:r>
-      <w:proofErr w:type="spellStart"/>
-      <w:r>
-        <w:t>humboldti</w:t>
-      </w:r>
-      <w:proofErr w:type="spellEnd"/>
-      <w:r>
-        <w:t>. Marine Ornithology 42:153-159.</w:t>
+        <w:t>Vianna J.A. , M. Cortez, B. Ramos, N. Sallaberry-Pincheira, D. González-Acuña, G. P. M. Dantas, J. Morgante, A. Simeone, and G. Luna-Jorquera. 2014. Changes in abundance and distribution of Humboldt penguin Spheniscus humboldti. Marine Ornithology 42:153-159.</w:t>
       </w:r>
     </w:p>
     <w:p>
@@ -8273,15 +7768,8 @@
         <w:pStyle w:val="Textoindependiente"/>
       </w:pPr>
       <w:r>
-        <w:t xml:space="preserve">Watters, George M., Jefferson T. Hinke, and Christian S. Reiss. 2020. “Long-Term Observations from Antarctica Demonstrate That Mismatched Scales of Fisheries Management and Predator-Prey Interaction </w:t>
-      </w:r>
-      <w:proofErr w:type="gramStart"/>
-      <w:r>
-        <w:t>Lead</w:t>
-      </w:r>
-      <w:proofErr w:type="gramEnd"/>
-      <w:r>
-        <w:t xml:space="preserve"> to Erroneous Conclusions about Precaution.” Scientific Reports 10 (1). </w:t>
+        <w:lastRenderedPageBreak/>
+        <w:t xml:space="preserve">Watters, George M., Jefferson T. Hinke, and Christian S. Reiss. 2020. “Long-Term Observations from Antarctica Demonstrate That Mismatched Scales of Fisheries Management and Predator-Prey Interaction Lead to Erroneous Conclusions about Precaution.” Scientific Reports 10 (1). </w:t>
       </w:r>
       <w:hyperlink r:id="rId21">
         <w:r>
@@ -8354,7 +7842,7 @@
   <w:abstractNum w:abstractNumId="0" w15:restartNumberingAfterBreak="0">
     <w:nsid w:val="0000A990"/>
     <w:multiLevelType w:val="multilevel"/>
-    <w:tmpl w:val="21F400EC"/>
+    <w:tmpl w:val="970088A8"/>
     <w:lvl w:ilvl="0">
       <w:numFmt w:val="bullet"/>
       <w:lvlText w:val=" "/>
@@ -8428,7 +7916,7 @@
       </w:pPr>
     </w:lvl>
   </w:abstractNum>
-  <w:num w:numId="1" w16cid:durableId="377900203">
+  <w:num w:numId="1" w16cid:durableId="642270551">
     <w:abstractNumId w:val="0"/>
   </w:num>
 </w:numbering>

</xml_diff>

<commit_message>
Update Suppl Materal seccion B - distribution of imputed data
</commit_message>
<xml_diff>
--- a/Watters_Rebutt_Suppl_Mat.docx
+++ b/Watters_Rebutt_Suppl_Mat.docx
@@ -15,7 +15,7 @@
         <w:pStyle w:val="Fecha"/>
       </w:pPr>
       <w:r>
-        <w:t>2026-03-19</w:t>
+        <w:t>2026-03-20</w:t>
       </w:r>
     </w:p>
     <w:p>
@@ -53,7 +53,7 @@
         </w:rPr>
         <w:lastRenderedPageBreak/>
         <w:drawing>
-          <wp:inline distT="0" distB="0" distL="0" distR="0" wp14:anchorId="35198597" wp14:editId="35198598">
+          <wp:inline distT="0" distB="0" distL="0" distR="0" wp14:anchorId="65ED6E44" wp14:editId="65ED6E45">
             <wp:extent cx="4267200" cy="2560320"/>
             <wp:effectExtent l="0" t="0" r="0" b="0"/>
             <wp:docPr id="21" name="Picture"/>
@@ -99,7 +99,7 @@
           <w:noProof/>
         </w:rPr>
         <w:drawing>
-          <wp:inline distT="0" distB="0" distL="0" distR="0" wp14:anchorId="35198599" wp14:editId="3519859A">
+          <wp:inline distT="0" distB="0" distL="0" distR="0" wp14:anchorId="65ED6E46" wp14:editId="65ED6E47">
             <wp:extent cx="4267200" cy="2560320"/>
             <wp:effectExtent l="0" t="0" r="0" b="0"/>
             <wp:docPr id="24" name="Picture"/>
@@ -250,10 +250,606 @@
       </w:r>
     </w:p>
     <w:p>
+      <w:r>
+        <w:br w:type="page"/>
+      </w:r>
+    </w:p>
+    <w:p>
+      <w:pPr>
+        <w:pStyle w:val="Textoindependiente"/>
+      </w:pPr>
+      <w:r>
+        <w:rPr>
+          <w:noProof/>
+        </w:rPr>
+        <w:lastRenderedPageBreak/>
+        <w:drawing>
+          <wp:inline distT="0" distB="0" distL="0" distR="0" wp14:anchorId="65ED6E48" wp14:editId="65ED6E49">
+            <wp:extent cx="2933700" cy="2200275"/>
+            <wp:effectExtent l="0" t="0" r="0" b="0"/>
+            <wp:docPr id="28" name="Picture"/>
+            <wp:cNvGraphicFramePr/>
+            <a:graphic xmlns:a="http://schemas.openxmlformats.org/drawingml/2006/main">
+              <a:graphicData uri="http://schemas.openxmlformats.org/drawingml/2006/picture">
+                <pic:pic xmlns:pic="http://schemas.openxmlformats.org/drawingml/2006/picture">
+                  <pic:nvPicPr>
+                    <pic:cNvPr id="29" name="Picture" descr="./A_Results/Watters_model/Imputed/freq_dist_summer_biomass.png"/>
+                    <pic:cNvPicPr>
+                      <a:picLocks noChangeAspect="1" noChangeArrowheads="1"/>
+                    </pic:cNvPicPr>
+                  </pic:nvPicPr>
+                  <pic:blipFill>
+                    <a:blip r:embed="rId9"/>
+                    <a:stretch>
+                      <a:fillRect/>
+                    </a:stretch>
+                  </pic:blipFill>
+                  <pic:spPr bwMode="auto">
+                    <a:xfrm>
+                      <a:off x="0" y="0"/>
+                      <a:ext cx="2933700" cy="2200275"/>
+                    </a:xfrm>
+                    <a:prstGeom prst="rect">
+                      <a:avLst/>
+                    </a:prstGeom>
+                    <a:noFill/>
+                    <a:ln w="9525">
+                      <a:noFill/>
+                      <a:headEnd/>
+                      <a:tailEnd/>
+                    </a:ln>
+                  </pic:spPr>
+                </pic:pic>
+              </a:graphicData>
+            </a:graphic>
+          </wp:inline>
+        </w:drawing>
+      </w:r>
+      <w:r>
+        <w:rPr>
+          <w:noProof/>
+        </w:rPr>
+        <w:drawing>
+          <wp:inline distT="0" distB="0" distL="0" distR="0" wp14:anchorId="65ED6E4A" wp14:editId="65ED6E4B">
+            <wp:extent cx="2933700" cy="2200275"/>
+            <wp:effectExtent l="0" t="0" r="0" b="0"/>
+            <wp:docPr id="31" name="Picture"/>
+            <wp:cNvGraphicFramePr/>
+            <a:graphic xmlns:a="http://schemas.openxmlformats.org/drawingml/2006/main">
+              <a:graphicData uri="http://schemas.openxmlformats.org/drawingml/2006/picture">
+                <pic:pic xmlns:pic="http://schemas.openxmlformats.org/drawingml/2006/picture">
+                  <pic:nvPicPr>
+                    <pic:cNvPr id="32" name="Picture" descr="./A_Results/Watters_model/Imputed/freq_dist_summer_hr.png"/>
+                    <pic:cNvPicPr>
+                      <a:picLocks noChangeAspect="1" noChangeArrowheads="1"/>
+                    </pic:cNvPicPr>
+                  </pic:nvPicPr>
+                  <pic:blipFill>
+                    <a:blip r:embed="rId10"/>
+                    <a:stretch>
+                      <a:fillRect/>
+                    </a:stretch>
+                  </pic:blipFill>
+                  <pic:spPr bwMode="auto">
+                    <a:xfrm>
+                      <a:off x="0" y="0"/>
+                      <a:ext cx="2933700" cy="2200275"/>
+                    </a:xfrm>
+                    <a:prstGeom prst="rect">
+                      <a:avLst/>
+                    </a:prstGeom>
+                    <a:noFill/>
+                    <a:ln w="9525">
+                      <a:noFill/>
+                      <a:headEnd/>
+                      <a:tailEnd/>
+                    </a:ln>
+                  </pic:spPr>
+                </pic:pic>
+              </a:graphicData>
+            </a:graphic>
+          </wp:inline>
+        </w:drawing>
+      </w:r>
+      <w:r>
+        <w:rPr>
+          <w:noProof/>
+        </w:rPr>
+        <w:drawing>
+          <wp:inline distT="0" distB="0" distL="0" distR="0" wp14:anchorId="65ED6E4C" wp14:editId="65ED6E4D">
+            <wp:extent cx="2933700" cy="2200275"/>
+            <wp:effectExtent l="0" t="0" r="0" b="0"/>
+            <wp:docPr id="34" name="Picture"/>
+            <wp:cNvGraphicFramePr/>
+            <a:graphic xmlns:a="http://schemas.openxmlformats.org/drawingml/2006/main">
+              <a:graphicData uri="http://schemas.openxmlformats.org/drawingml/2006/picture">
+                <pic:pic xmlns:pic="http://schemas.openxmlformats.org/drawingml/2006/picture">
+                  <pic:nvPicPr>
+                    <pic:cNvPr id="35" name="Picture" descr="./A_Results/Watters_model/Imputed/obs_freq_dist_summer_biomass.png"/>
+                    <pic:cNvPicPr>
+                      <a:picLocks noChangeAspect="1" noChangeArrowheads="1"/>
+                    </pic:cNvPicPr>
+                  </pic:nvPicPr>
+                  <pic:blipFill>
+                    <a:blip r:embed="rId11"/>
+                    <a:stretch>
+                      <a:fillRect/>
+                    </a:stretch>
+                  </pic:blipFill>
+                  <pic:spPr bwMode="auto">
+                    <a:xfrm>
+                      <a:off x="0" y="0"/>
+                      <a:ext cx="2933700" cy="2200275"/>
+                    </a:xfrm>
+                    <a:prstGeom prst="rect">
+                      <a:avLst/>
+                    </a:prstGeom>
+                    <a:noFill/>
+                    <a:ln w="9525">
+                      <a:noFill/>
+                      <a:headEnd/>
+                      <a:tailEnd/>
+                    </a:ln>
+                  </pic:spPr>
+                </pic:pic>
+              </a:graphicData>
+            </a:graphic>
+          </wp:inline>
+        </w:drawing>
+      </w:r>
+      <w:r>
+        <w:rPr>
+          <w:noProof/>
+        </w:rPr>
+        <w:drawing>
+          <wp:inline distT="0" distB="0" distL="0" distR="0" wp14:anchorId="65ED6E4E" wp14:editId="65ED6E4F">
+            <wp:extent cx="2933700" cy="2200275"/>
+            <wp:effectExtent l="0" t="0" r="0" b="0"/>
+            <wp:docPr id="37" name="Picture"/>
+            <wp:cNvGraphicFramePr/>
+            <a:graphic xmlns:a="http://schemas.openxmlformats.org/drawingml/2006/main">
+              <a:graphicData uri="http://schemas.openxmlformats.org/drawingml/2006/picture">
+                <pic:pic xmlns:pic="http://schemas.openxmlformats.org/drawingml/2006/picture">
+                  <pic:nvPicPr>
+                    <pic:cNvPr id="38" name="Picture" descr="./A_Results/Watters_model/Imputed/obs_freq_dist_summer_hr.png"/>
+                    <pic:cNvPicPr>
+                      <a:picLocks noChangeAspect="1" noChangeArrowheads="1"/>
+                    </pic:cNvPicPr>
+                  </pic:nvPicPr>
+                  <pic:blipFill>
+                    <a:blip r:embed="rId12"/>
+                    <a:stretch>
+                      <a:fillRect/>
+                    </a:stretch>
+                  </pic:blipFill>
+                  <pic:spPr bwMode="auto">
+                    <a:xfrm>
+                      <a:off x="0" y="0"/>
+                      <a:ext cx="2933700" cy="2200275"/>
+                    </a:xfrm>
+                    <a:prstGeom prst="rect">
+                      <a:avLst/>
+                    </a:prstGeom>
+                    <a:noFill/>
+                    <a:ln w="9525">
+                      <a:noFill/>
+                      <a:headEnd/>
+                      <a:tailEnd/>
+                    </a:ln>
+                  </pic:spPr>
+                </pic:pic>
+              </a:graphicData>
+            </a:graphic>
+          </wp:inline>
+        </w:drawing>
+      </w:r>
+      <w:r>
+        <w:rPr>
+          <w:noProof/>
+        </w:rPr>
+        <w:drawing>
+          <wp:inline distT="0" distB="0" distL="0" distR="0" wp14:anchorId="65ED6E50" wp14:editId="65ED6E51">
+            <wp:extent cx="2933700" cy="2200275"/>
+            <wp:effectExtent l="0" t="0" r="0" b="0"/>
+            <wp:docPr id="40" name="Picture"/>
+            <wp:cNvGraphicFramePr/>
+            <a:graphic xmlns:a="http://schemas.openxmlformats.org/drawingml/2006/main">
+              <a:graphicData uri="http://schemas.openxmlformats.org/drawingml/2006/picture">
+                <pic:pic xmlns:pic="http://schemas.openxmlformats.org/drawingml/2006/picture">
+                  <pic:nvPicPr>
+                    <pic:cNvPr id="41" name="Picture" descr="./A_Results/Model02_SSMU/obs_freq_dist_summer_biomass.png"/>
+                    <pic:cNvPicPr>
+                      <a:picLocks noChangeAspect="1" noChangeArrowheads="1"/>
+                    </pic:cNvPicPr>
+                  </pic:nvPicPr>
+                  <pic:blipFill>
+                    <a:blip r:embed="rId13"/>
+                    <a:stretch>
+                      <a:fillRect/>
+                    </a:stretch>
+                  </pic:blipFill>
+                  <pic:spPr bwMode="auto">
+                    <a:xfrm>
+                      <a:off x="0" y="0"/>
+                      <a:ext cx="2933700" cy="2200275"/>
+                    </a:xfrm>
+                    <a:prstGeom prst="rect">
+                      <a:avLst/>
+                    </a:prstGeom>
+                    <a:noFill/>
+                    <a:ln w="9525">
+                      <a:noFill/>
+                      <a:headEnd/>
+                      <a:tailEnd/>
+                    </a:ln>
+                  </pic:spPr>
+                </pic:pic>
+              </a:graphicData>
+            </a:graphic>
+          </wp:inline>
+        </w:drawing>
+      </w:r>
+      <w:r>
+        <w:rPr>
+          <w:noProof/>
+        </w:rPr>
+        <w:drawing>
+          <wp:inline distT="0" distB="0" distL="0" distR="0" wp14:anchorId="65ED6E52" wp14:editId="65ED6E53">
+            <wp:extent cx="2933700" cy="2200275"/>
+            <wp:effectExtent l="0" t="0" r="0" b="0"/>
+            <wp:docPr id="43" name="Picture"/>
+            <wp:cNvGraphicFramePr/>
+            <a:graphic xmlns:a="http://schemas.openxmlformats.org/drawingml/2006/main">
+              <a:graphicData uri="http://schemas.openxmlformats.org/drawingml/2006/picture">
+                <pic:pic xmlns:pic="http://schemas.openxmlformats.org/drawingml/2006/picture">
+                  <pic:nvPicPr>
+                    <pic:cNvPr id="44" name="Picture" descr="./A_Results/Model02_SSMU/obs_freq_dist_summer_hr.png"/>
+                    <pic:cNvPicPr>
+                      <a:picLocks noChangeAspect="1" noChangeArrowheads="1"/>
+                    </pic:cNvPicPr>
+                  </pic:nvPicPr>
+                  <pic:blipFill>
+                    <a:blip r:embed="rId14"/>
+                    <a:stretch>
+                      <a:fillRect/>
+                    </a:stretch>
+                  </pic:blipFill>
+                  <pic:spPr bwMode="auto">
+                    <a:xfrm>
+                      <a:off x="0" y="0"/>
+                      <a:ext cx="2933700" cy="2200275"/>
+                    </a:xfrm>
+                    <a:prstGeom prst="rect">
+                      <a:avLst/>
+                    </a:prstGeom>
+                    <a:noFill/>
+                    <a:ln w="9525">
+                      <a:noFill/>
+                      <a:headEnd/>
+                      <a:tailEnd/>
+                    </a:ln>
+                  </pic:spPr>
+                </pic:pic>
+              </a:graphicData>
+            </a:graphic>
+          </wp:inline>
+        </w:drawing>
+      </w:r>
+    </w:p>
+    <w:p>
+      <w:pPr>
+        <w:pStyle w:val="Textoindependiente"/>
+      </w:pPr>
+      <w:r>
+        <w:t>Figure S2. Frequency distribution of summer krill biomass, LKB (left), and summer harvest rate, LHR (right). Watter’s model imputed (top; blue) and observed (middle; red) data, and Model SSMU (this paper; bottom; green), separated by SAM phase and gSSMU.</w:t>
+      </w:r>
+    </w:p>
+    <w:p>
+      <w:r>
+        <w:br w:type="page"/>
+      </w:r>
+    </w:p>
+    <w:p>
+      <w:pPr>
+        <w:pStyle w:val="Textoindependiente"/>
+      </w:pPr>
+      <w:r>
+        <w:rPr>
+          <w:noProof/>
+        </w:rPr>
+        <w:lastRenderedPageBreak/>
+        <w:drawing>
+          <wp:inline distT="0" distB="0" distL="0" distR="0" wp14:anchorId="65ED6E54" wp14:editId="65ED6E55">
+            <wp:extent cx="2933700" cy="2200275"/>
+            <wp:effectExtent l="0" t="0" r="0" b="0"/>
+            <wp:docPr id="46" name="Picture"/>
+            <wp:cNvGraphicFramePr/>
+            <a:graphic xmlns:a="http://schemas.openxmlformats.org/drawingml/2006/main">
+              <a:graphicData uri="http://schemas.openxmlformats.org/drawingml/2006/picture">
+                <pic:pic xmlns:pic="http://schemas.openxmlformats.org/drawingml/2006/picture">
+                  <pic:nvPicPr>
+                    <pic:cNvPr id="47" name="Picture" descr="./A_Results/Watters_model/Imputed/freq_dist_bclass.png"/>
+                    <pic:cNvPicPr>
+                      <a:picLocks noChangeAspect="1" noChangeArrowheads="1"/>
+                    </pic:cNvPicPr>
+                  </pic:nvPicPr>
+                  <pic:blipFill>
+                    <a:blip r:embed="rId15"/>
+                    <a:stretch>
+                      <a:fillRect/>
+                    </a:stretch>
+                  </pic:blipFill>
+                  <pic:spPr bwMode="auto">
+                    <a:xfrm>
+                      <a:off x="0" y="0"/>
+                      <a:ext cx="2933700" cy="2200275"/>
+                    </a:xfrm>
+                    <a:prstGeom prst="rect">
+                      <a:avLst/>
+                    </a:prstGeom>
+                    <a:noFill/>
+                    <a:ln w="9525">
+                      <a:noFill/>
+                      <a:headEnd/>
+                      <a:tailEnd/>
+                    </a:ln>
+                  </pic:spPr>
+                </pic:pic>
+              </a:graphicData>
+            </a:graphic>
+          </wp:inline>
+        </w:drawing>
+      </w:r>
+      <w:r>
+        <w:rPr>
+          <w:noProof/>
+        </w:rPr>
+        <w:drawing>
+          <wp:inline distT="0" distB="0" distL="0" distR="0" wp14:anchorId="65ED6E56" wp14:editId="65ED6E57">
+            <wp:extent cx="2933700" cy="2200275"/>
+            <wp:effectExtent l="0" t="0" r="0" b="0"/>
+            <wp:docPr id="49" name="Picture"/>
+            <wp:cNvGraphicFramePr/>
+            <a:graphic xmlns:a="http://schemas.openxmlformats.org/drawingml/2006/main">
+              <a:graphicData uri="http://schemas.openxmlformats.org/drawingml/2006/picture">
+                <pic:pic xmlns:pic="http://schemas.openxmlformats.org/drawingml/2006/picture">
+                  <pic:nvPicPr>
+                    <pic:cNvPr id="50" name="Picture" descr="./A_Results/Watters_model/Imputed/freq_dist_hrclass.png"/>
+                    <pic:cNvPicPr>
+                      <a:picLocks noChangeAspect="1" noChangeArrowheads="1"/>
+                    </pic:cNvPicPr>
+                  </pic:nvPicPr>
+                  <pic:blipFill>
+                    <a:blip r:embed="rId16"/>
+                    <a:stretch>
+                      <a:fillRect/>
+                    </a:stretch>
+                  </pic:blipFill>
+                  <pic:spPr bwMode="auto">
+                    <a:xfrm>
+                      <a:off x="0" y="0"/>
+                      <a:ext cx="2933700" cy="2200275"/>
+                    </a:xfrm>
+                    <a:prstGeom prst="rect">
+                      <a:avLst/>
+                    </a:prstGeom>
+                    <a:noFill/>
+                    <a:ln w="9525">
+                      <a:noFill/>
+                      <a:headEnd/>
+                      <a:tailEnd/>
+                    </a:ln>
+                  </pic:spPr>
+                </pic:pic>
+              </a:graphicData>
+            </a:graphic>
+          </wp:inline>
+        </w:drawing>
+      </w:r>
+      <w:r>
+        <w:rPr>
+          <w:noProof/>
+        </w:rPr>
+        <w:drawing>
+          <wp:inline distT="0" distB="0" distL="0" distR="0" wp14:anchorId="65ED6E58" wp14:editId="65ED6E59">
+            <wp:extent cx="2933700" cy="2200275"/>
+            <wp:effectExtent l="0" t="0" r="0" b="0"/>
+            <wp:docPr id="52" name="Picture"/>
+            <wp:cNvGraphicFramePr/>
+            <a:graphic xmlns:a="http://schemas.openxmlformats.org/drawingml/2006/main">
+              <a:graphicData uri="http://schemas.openxmlformats.org/drawingml/2006/picture">
+                <pic:pic xmlns:pic="http://schemas.openxmlformats.org/drawingml/2006/picture">
+                  <pic:nvPicPr>
+                    <pic:cNvPr id="53" name="Picture" descr="./A_Results/Watters_model/Imputed/obs_freq_dist_bclass.png"/>
+                    <pic:cNvPicPr>
+                      <a:picLocks noChangeAspect="1" noChangeArrowheads="1"/>
+                    </pic:cNvPicPr>
+                  </pic:nvPicPr>
+                  <pic:blipFill>
+                    <a:blip r:embed="rId17"/>
+                    <a:stretch>
+                      <a:fillRect/>
+                    </a:stretch>
+                  </pic:blipFill>
+                  <pic:spPr bwMode="auto">
+                    <a:xfrm>
+                      <a:off x="0" y="0"/>
+                      <a:ext cx="2933700" cy="2200275"/>
+                    </a:xfrm>
+                    <a:prstGeom prst="rect">
+                      <a:avLst/>
+                    </a:prstGeom>
+                    <a:noFill/>
+                    <a:ln w="9525">
+                      <a:noFill/>
+                      <a:headEnd/>
+                      <a:tailEnd/>
+                    </a:ln>
+                  </pic:spPr>
+                </pic:pic>
+              </a:graphicData>
+            </a:graphic>
+          </wp:inline>
+        </w:drawing>
+      </w:r>
+      <w:r>
+        <w:rPr>
+          <w:noProof/>
+        </w:rPr>
+        <w:drawing>
+          <wp:inline distT="0" distB="0" distL="0" distR="0" wp14:anchorId="65ED6E5A" wp14:editId="65ED6E5B">
+            <wp:extent cx="2933700" cy="2200275"/>
+            <wp:effectExtent l="0" t="0" r="0" b="0"/>
+            <wp:docPr id="55" name="Picture"/>
+            <wp:cNvGraphicFramePr/>
+            <a:graphic xmlns:a="http://schemas.openxmlformats.org/drawingml/2006/main">
+              <a:graphicData uri="http://schemas.openxmlformats.org/drawingml/2006/picture">
+                <pic:pic xmlns:pic="http://schemas.openxmlformats.org/drawingml/2006/picture">
+                  <pic:nvPicPr>
+                    <pic:cNvPr id="56" name="Picture" descr="./A_Results/Watters_model/Imputed/obs_freq_dist_hrclass.png"/>
+                    <pic:cNvPicPr>
+                      <a:picLocks noChangeAspect="1" noChangeArrowheads="1"/>
+                    </pic:cNvPicPr>
+                  </pic:nvPicPr>
+                  <pic:blipFill>
+                    <a:blip r:embed="rId18"/>
+                    <a:stretch>
+                      <a:fillRect/>
+                    </a:stretch>
+                  </pic:blipFill>
+                  <pic:spPr bwMode="auto">
+                    <a:xfrm>
+                      <a:off x="0" y="0"/>
+                      <a:ext cx="2933700" cy="2200275"/>
+                    </a:xfrm>
+                    <a:prstGeom prst="rect">
+                      <a:avLst/>
+                    </a:prstGeom>
+                    <a:noFill/>
+                    <a:ln w="9525">
+                      <a:noFill/>
+                      <a:headEnd/>
+                      <a:tailEnd/>
+                    </a:ln>
+                  </pic:spPr>
+                </pic:pic>
+              </a:graphicData>
+            </a:graphic>
+          </wp:inline>
+        </w:drawing>
+      </w:r>
+      <w:r>
+        <w:rPr>
+          <w:noProof/>
+        </w:rPr>
+        <w:drawing>
+          <wp:inline distT="0" distB="0" distL="0" distR="0" wp14:anchorId="65ED6E5C" wp14:editId="65ED6E5D">
+            <wp:extent cx="2933700" cy="2200275"/>
+            <wp:effectExtent l="0" t="0" r="0" b="0"/>
+            <wp:docPr id="58" name="Picture"/>
+            <wp:cNvGraphicFramePr/>
+            <a:graphic xmlns:a="http://schemas.openxmlformats.org/drawingml/2006/main">
+              <a:graphicData uri="http://schemas.openxmlformats.org/drawingml/2006/picture">
+                <pic:pic xmlns:pic="http://schemas.openxmlformats.org/drawingml/2006/picture">
+                  <pic:nvPicPr>
+                    <pic:cNvPr id="59" name="Picture" descr="./A_Results/Model02_SSMU/obs_freq_dist_bclass.png"/>
+                    <pic:cNvPicPr>
+                      <a:picLocks noChangeAspect="1" noChangeArrowheads="1"/>
+                    </pic:cNvPicPr>
+                  </pic:nvPicPr>
+                  <pic:blipFill>
+                    <a:blip r:embed="rId19"/>
+                    <a:stretch>
+                      <a:fillRect/>
+                    </a:stretch>
+                  </pic:blipFill>
+                  <pic:spPr bwMode="auto">
+                    <a:xfrm>
+                      <a:off x="0" y="0"/>
+                      <a:ext cx="2933700" cy="2200275"/>
+                    </a:xfrm>
+                    <a:prstGeom prst="rect">
+                      <a:avLst/>
+                    </a:prstGeom>
+                    <a:noFill/>
+                    <a:ln w="9525">
+                      <a:noFill/>
+                      <a:headEnd/>
+                      <a:tailEnd/>
+                    </a:ln>
+                  </pic:spPr>
+                </pic:pic>
+              </a:graphicData>
+            </a:graphic>
+          </wp:inline>
+        </w:drawing>
+      </w:r>
+      <w:r>
+        <w:rPr>
+          <w:noProof/>
+        </w:rPr>
+        <w:drawing>
+          <wp:inline distT="0" distB="0" distL="0" distR="0" wp14:anchorId="65ED6E5E" wp14:editId="65ED6E5F">
+            <wp:extent cx="2933700" cy="2200275"/>
+            <wp:effectExtent l="0" t="0" r="0" b="0"/>
+            <wp:docPr id="61" name="Picture"/>
+            <wp:cNvGraphicFramePr/>
+            <a:graphic xmlns:a="http://schemas.openxmlformats.org/drawingml/2006/main">
+              <a:graphicData uri="http://schemas.openxmlformats.org/drawingml/2006/picture">
+                <pic:pic xmlns:pic="http://schemas.openxmlformats.org/drawingml/2006/picture">
+                  <pic:nvPicPr>
+                    <pic:cNvPr id="62" name="Picture" descr="./A_Results/Model02_SSMU/obs_freq_dist_hrclass.png"/>
+                    <pic:cNvPicPr>
+                      <a:picLocks noChangeAspect="1" noChangeArrowheads="1"/>
+                    </pic:cNvPicPr>
+                  </pic:nvPicPr>
+                  <pic:blipFill>
+                    <a:blip r:embed="rId20"/>
+                    <a:stretch>
+                      <a:fillRect/>
+                    </a:stretch>
+                  </pic:blipFill>
+                  <pic:spPr bwMode="auto">
+                    <a:xfrm>
+                      <a:off x="0" y="0"/>
+                      <a:ext cx="2933700" cy="2200275"/>
+                    </a:xfrm>
+                    <a:prstGeom prst="rect">
+                      <a:avLst/>
+                    </a:prstGeom>
+                    <a:noFill/>
+                    <a:ln w="9525">
+                      <a:noFill/>
+                      <a:headEnd/>
+                      <a:tailEnd/>
+                    </a:ln>
+                  </pic:spPr>
+                </pic:pic>
+              </a:graphicData>
+            </a:graphic>
+          </wp:inline>
+        </w:drawing>
+      </w:r>
+    </w:p>
+    <w:p>
+      <w:pPr>
+        <w:pStyle w:val="Textoindependiente"/>
+      </w:pPr>
+      <w:r>
+        <w:t>Figure S3. Frequency distribution of LKB categories (left) and LHR categories (right). Watter’s model imputed (top; blue) and observed (middle; red) data, and model SSMU (this paper; bottom; green), separated by SAM phase and gSSMU.</w:t>
+      </w:r>
+    </w:p>
+    <w:p>
+      <w:r>
+        <w:br w:type="page"/>
+      </w:r>
+    </w:p>
+    <w:p>
       <w:pPr>
         <w:pStyle w:val="TableCaption"/>
       </w:pPr>
       <w:r>
+        <w:lastRenderedPageBreak/>
         <w:t>Table S1. Shapiro–Wilk test results for normality of observed log-transformed LKB values, reported by gSSMU and SAM sign. Columns show sample size (n), p-value, and W-statistic.</w:t>
       </w:r>
     </w:p>
@@ -1093,24 +1689,23 @@
         <w:rPr>
           <w:noProof/>
         </w:rPr>
-        <w:lastRenderedPageBreak/>
         <w:drawing>
-          <wp:inline distT="0" distB="0" distL="0" distR="0" wp14:anchorId="3519859B" wp14:editId="3519859C">
+          <wp:inline distT="0" distB="0" distL="0" distR="0" wp14:anchorId="65ED6E60" wp14:editId="65ED6E61">
             <wp:extent cx="4267200" cy="2983706"/>
             <wp:effectExtent l="0" t="0" r="0" b="0"/>
-            <wp:docPr id="28" name="Picture"/>
+            <wp:docPr id="64" name="Picture"/>
             <wp:cNvGraphicFramePr/>
             <a:graphic xmlns:a="http://schemas.openxmlformats.org/drawingml/2006/main">
               <a:graphicData uri="http://schemas.openxmlformats.org/drawingml/2006/picture">
                 <pic:pic xmlns:pic="http://schemas.openxmlformats.org/drawingml/2006/picture">
                   <pic:nvPicPr>
-                    <pic:cNvPr id="29" name="Picture" descr="Watters_Rebutt_Suppl_Mat_files/figure-docx/Survey%20histogram-1.png"/>
+                    <pic:cNvPr id="65" name="Picture" descr="Watters_Rebutt_Suppl_Mat_files/figure-docx/Survey%20histogram-1.png"/>
                     <pic:cNvPicPr>
                       <a:picLocks noChangeAspect="1" noChangeArrowheads="1"/>
                     </pic:cNvPicPr>
                   </pic:nvPicPr>
                   <pic:blipFill>
-                    <a:blip r:embed="rId9"/>
+                    <a:blip r:embed="rId21"/>
                     <a:stretch>
                       <a:fillRect/>
                     </a:stretch>
@@ -1146,62 +1741,8 @@
       </w:r>
     </w:p>
     <w:p>
-      <w:pPr>
-        <w:pStyle w:val="Textoindependiente"/>
-      </w:pPr>
       <w:r>
-        <w:rPr>
-          <w:noProof/>
-        </w:rPr>
-        <w:drawing>
-          <wp:inline distT="0" distB="0" distL="0" distR="0" wp14:anchorId="3519859D" wp14:editId="3519859E">
-            <wp:extent cx="4267200" cy="2769576"/>
-            <wp:effectExtent l="0" t="0" r="0" b="0"/>
-            <wp:docPr id="31" name="Picture"/>
-            <wp:cNvGraphicFramePr/>
-            <a:graphic xmlns:a="http://schemas.openxmlformats.org/drawingml/2006/main">
-              <a:graphicData uri="http://schemas.openxmlformats.org/drawingml/2006/picture">
-                <pic:pic xmlns:pic="http://schemas.openxmlformats.org/drawingml/2006/picture">
-                  <pic:nvPicPr>
-                    <pic:cNvPr id="32" name="Picture" descr="Watters_Rebutt_Suppl_Mat_files/figure-docx/Imputed%20Survey-1.png"/>
-                    <pic:cNvPicPr>
-                      <a:picLocks noChangeAspect="1" noChangeArrowheads="1"/>
-                    </pic:cNvPicPr>
-                  </pic:nvPicPr>
-                  <pic:blipFill>
-                    <a:blip r:embed="rId10"/>
-                    <a:stretch>
-                      <a:fillRect/>
-                    </a:stretch>
-                  </pic:blipFill>
-                  <pic:spPr bwMode="auto">
-                    <a:xfrm>
-                      <a:off x="0" y="0"/>
-                      <a:ext cx="4267200" cy="2769576"/>
-                    </a:xfrm>
-                    <a:prstGeom prst="rect">
-                      <a:avLst/>
-                    </a:prstGeom>
-                    <a:noFill/>
-                    <a:ln w="9525">
-                      <a:noFill/>
-                      <a:headEnd/>
-                      <a:tailEnd/>
-                    </a:ln>
-                  </pic:spPr>
-                </pic:pic>
-              </a:graphicData>
-            </a:graphic>
-          </wp:inline>
-        </w:drawing>
-      </w:r>
-    </w:p>
-    <w:p>
-      <w:pPr>
-        <w:pStyle w:val="Textoindependiente"/>
-      </w:pPr>
-      <w:r>
-        <w:t>Figure S3. Distribution of ln-transformed imputed biomass (LnSurvey) shown as histograms stratified by gSSMU (1, 2) and SAM sign (Neg, Pos). The solid curve in each panel shows the log-normal density fitted to the observed survey values.</w:t>
+        <w:br w:type="page"/>
       </w:r>
     </w:p>
     <w:p>
@@ -1905,22 +2446,22 @@
           <w:noProof/>
         </w:rPr>
         <w:drawing>
-          <wp:inline distT="0" distB="0" distL="0" distR="0" wp14:anchorId="3519859F" wp14:editId="351985A0">
+          <wp:inline distT="0" distB="0" distL="0" distR="0" wp14:anchorId="65ED6E62" wp14:editId="65ED6E63">
             <wp:extent cx="5334000" cy="4000499"/>
             <wp:effectExtent l="0" t="0" r="0" b="0"/>
-            <wp:docPr id="35" name="Picture"/>
+            <wp:docPr id="68" name="Picture"/>
             <wp:cNvGraphicFramePr/>
             <a:graphic xmlns:a="http://schemas.openxmlformats.org/drawingml/2006/main">
               <a:graphicData uri="http://schemas.openxmlformats.org/drawingml/2006/picture">
                 <pic:pic xmlns:pic="http://schemas.openxmlformats.org/drawingml/2006/picture">
                   <pic:nvPicPr>
-                    <pic:cNvPr id="36" name="Picture" descr="./A_Results_Suppl/Model01_filtered/Posterior_predictive_dist_mod01.png"/>
+                    <pic:cNvPr id="69" name="Picture" descr="./A_Results_Suppl/Model01_filtered/Posterior_predictive_dist_mod01.png"/>
                     <pic:cNvPicPr>
                       <a:picLocks noChangeAspect="1" noChangeArrowheads="1"/>
                     </pic:cNvPicPr>
                   </pic:nvPicPr>
                   <pic:blipFill>
-                    <a:blip r:embed="rId11"/>
+                    <a:blip r:embed="rId22"/>
                     <a:stretch>
                       <a:fillRect/>
                     </a:stretch>
@@ -1968,22 +2509,22 @@
           <w:noProof/>
         </w:rPr>
         <w:drawing>
-          <wp:inline distT="0" distB="0" distL="0" distR="0" wp14:anchorId="351985A1" wp14:editId="351985A2">
+          <wp:inline distT="0" distB="0" distL="0" distR="0" wp14:anchorId="65ED6E64" wp14:editId="65ED6E65">
             <wp:extent cx="5334000" cy="4000499"/>
             <wp:effectExtent l="0" t="0" r="0" b="0"/>
-            <wp:docPr id="38" name="Picture"/>
+            <wp:docPr id="71" name="Picture"/>
             <wp:cNvGraphicFramePr/>
             <a:graphic xmlns:a="http://schemas.openxmlformats.org/drawingml/2006/main">
               <a:graphicData uri="http://schemas.openxmlformats.org/drawingml/2006/picture">
                 <pic:pic xmlns:pic="http://schemas.openxmlformats.org/drawingml/2006/picture">
                   <pic:nvPicPr>
-                    <pic:cNvPr id="39" name="Picture" descr="./A_Results_Suppl/Model01_filtered/Penguin_performance_mod01.png"/>
+                    <pic:cNvPr id="72" name="Picture" descr="./A_Results_Suppl/Model01_filtered/Penguin_performance_mod01.png"/>
                     <pic:cNvPicPr>
                       <a:picLocks noChangeAspect="1" noChangeArrowheads="1"/>
                     </pic:cNvPicPr>
                   </pic:nvPicPr>
                   <pic:blipFill>
-                    <a:blip r:embed="rId12"/>
+                    <a:blip r:embed="rId23"/>
                     <a:stretch>
                       <a:fillRect/>
                     </a:stretch>
@@ -2028,22 +2569,22 @@
         </w:rPr>
         <w:lastRenderedPageBreak/>
         <w:drawing>
-          <wp:inline distT="0" distB="0" distL="0" distR="0" wp14:anchorId="351985A3" wp14:editId="351985A4">
+          <wp:inline distT="0" distB="0" distL="0" distR="0" wp14:anchorId="65ED6E66" wp14:editId="65ED6E67">
             <wp:extent cx="5334000" cy="4000499"/>
             <wp:effectExtent l="0" t="0" r="0" b="0"/>
-            <wp:docPr id="41" name="Picture"/>
+            <wp:docPr id="74" name="Picture"/>
             <wp:cNvGraphicFramePr/>
             <a:graphic xmlns:a="http://schemas.openxmlformats.org/drawingml/2006/main">
               <a:graphicData uri="http://schemas.openxmlformats.org/drawingml/2006/picture">
                 <pic:pic xmlns:pic="http://schemas.openxmlformats.org/drawingml/2006/picture">
                   <pic:nvPicPr>
-                    <pic:cNvPr id="42" name="Picture" descr="./A_Results_Suppl/Model01_imputed1/Posterior_predictive_dist_mod01imp.png"/>
+                    <pic:cNvPr id="75" name="Picture" descr="./A_Results_Suppl/Model01_imputed1/Posterior_predictive_dist_mod01imp.png"/>
                     <pic:cNvPicPr>
                       <a:picLocks noChangeAspect="1" noChangeArrowheads="1"/>
                     </pic:cNvPicPr>
                   </pic:nvPicPr>
                   <pic:blipFill>
-                    <a:blip r:embed="rId13"/>
+                    <a:blip r:embed="rId24"/>
                     <a:stretch>
                       <a:fillRect/>
                     </a:stretch>
@@ -2088,22 +2629,22 @@
         </w:rPr>
         <w:lastRenderedPageBreak/>
         <w:drawing>
-          <wp:inline distT="0" distB="0" distL="0" distR="0" wp14:anchorId="351985A5" wp14:editId="351985A6">
+          <wp:inline distT="0" distB="0" distL="0" distR="0" wp14:anchorId="65ED6E68" wp14:editId="65ED6E69">
             <wp:extent cx="5334000" cy="4000499"/>
             <wp:effectExtent l="0" t="0" r="0" b="0"/>
-            <wp:docPr id="44" name="Picture"/>
+            <wp:docPr id="77" name="Picture"/>
             <wp:cNvGraphicFramePr/>
             <a:graphic xmlns:a="http://schemas.openxmlformats.org/drawingml/2006/main">
               <a:graphicData uri="http://schemas.openxmlformats.org/drawingml/2006/picture">
                 <pic:pic xmlns:pic="http://schemas.openxmlformats.org/drawingml/2006/picture">
                   <pic:nvPicPr>
-                    <pic:cNvPr id="45" name="Picture" descr="./A_Results_Suppl/Model01_imputed1/Penguin_performance_mod01imp.png"/>
+                    <pic:cNvPr id="78" name="Picture" descr="./A_Results_Suppl/Model01_imputed1/Penguin_performance_mod01imp.png"/>
                     <pic:cNvPicPr>
                       <a:picLocks noChangeAspect="1" noChangeArrowheads="1"/>
                     </pic:cNvPicPr>
                   </pic:nvPicPr>
                   <pic:blipFill>
-                    <a:blip r:embed="rId14"/>
+                    <a:blip r:embed="rId25"/>
                     <a:stretch>
                       <a:fillRect/>
                     </a:stretch>
@@ -2161,7 +2702,7 @@
       <w:r>
         <w:t>Table S4. Size of SSMUs for Subarea 48.1 and its relative size to the gSSMU where they are located. CCAMLR Small-Scale Management Units (SSMUs) were download from CCAMLR Public repository (</w:t>
       </w:r>
-      <w:hyperlink r:id="rId15">
+      <w:hyperlink r:id="rId26">
         <w:r>
           <w:rPr>
             <w:rStyle w:val="Hipervnculo"/>
@@ -2172,7 +2713,7 @@
       <w:r>
         <w:t xml:space="preserve">). CCAMLR. 2022. Geographical data layer: CCAMLR Fishery Small-Scale Management Units. Version 0.9, URL: </w:t>
       </w:r>
-      <w:hyperlink r:id="rId16">
+      <w:hyperlink r:id="rId27">
         <w:r>
           <w:rPr>
             <w:rStyle w:val="Hipervnculo"/>
@@ -2733,22 +3274,22 @@
         </w:rPr>
         <w:lastRenderedPageBreak/>
         <w:drawing>
-          <wp:inline distT="0" distB="0" distL="0" distR="0" wp14:anchorId="351985A7" wp14:editId="351985A8">
+          <wp:inline distT="0" distB="0" distL="0" distR="0" wp14:anchorId="65ED6E6A" wp14:editId="65ED6E6B">
             <wp:extent cx="3467100" cy="2600324"/>
             <wp:effectExtent l="0" t="0" r="0" b="0"/>
-            <wp:docPr id="50" name="Picture"/>
+            <wp:docPr id="83" name="Picture"/>
             <wp:cNvGraphicFramePr/>
             <a:graphic xmlns:a="http://schemas.openxmlformats.org/drawingml/2006/main">
               <a:graphicData uri="http://schemas.openxmlformats.org/drawingml/2006/picture">
                 <pic:pic xmlns:pic="http://schemas.openxmlformats.org/drawingml/2006/picture">
                   <pic:nvPicPr>
-                    <pic:cNvPr id="51" name="Picture" descr="./A_Results/Watters_model/Imputed/Watters_Posterior_predictive_dist_imputed.png"/>
+                    <pic:cNvPr id="84" name="Picture" descr="./A_Results/Watters_model/Imputed/Watters_Posterior_predictive_dist_imputed.png"/>
                     <pic:cNvPicPr>
                       <a:picLocks noChangeAspect="1" noChangeArrowheads="1"/>
                     </pic:cNvPicPr>
                   </pic:nvPicPr>
                   <pic:blipFill>
-                    <a:blip r:embed="rId17"/>
+                    <a:blip r:embed="rId28"/>
                     <a:stretch>
                       <a:fillRect/>
                     </a:stretch>
@@ -2779,22 +3320,22 @@
           <w:noProof/>
         </w:rPr>
         <w:drawing>
-          <wp:inline distT="0" distB="0" distL="0" distR="0" wp14:anchorId="351985A9" wp14:editId="351985AA">
+          <wp:inline distT="0" distB="0" distL="0" distR="0" wp14:anchorId="65ED6E6C" wp14:editId="65ED6E6D">
             <wp:extent cx="3467100" cy="2383631"/>
             <wp:effectExtent l="0" t="0" r="0" b="0"/>
-            <wp:docPr id="53" name="Picture"/>
+            <wp:docPr id="86" name="Picture"/>
             <wp:cNvGraphicFramePr/>
             <a:graphic xmlns:a="http://schemas.openxmlformats.org/drawingml/2006/main">
               <a:graphicData uri="http://schemas.openxmlformats.org/drawingml/2006/picture">
                 <pic:pic xmlns:pic="http://schemas.openxmlformats.org/drawingml/2006/picture">
                   <pic:nvPicPr>
-                    <pic:cNvPr id="54" name="Picture" descr="./A_Results/Model02_Andy/Posterior_predictive_dist_mod02_Andy.png"/>
+                    <pic:cNvPr id="87" name="Picture" descr="./A_Results/Model02_Andy/Posterior_predictive_dist_mod02_Andy.png"/>
                     <pic:cNvPicPr>
                       <a:picLocks noChangeAspect="1" noChangeArrowheads="1"/>
                     </pic:cNvPicPr>
                   </pic:nvPicPr>
                   <pic:blipFill>
-                    <a:blip r:embed="rId18"/>
+                    <a:blip r:embed="rId29"/>
                     <a:stretch>
                       <a:fillRect/>
                     </a:stretch>
@@ -2826,22 +3367,22 @@
         </w:rPr>
         <w:lastRenderedPageBreak/>
         <w:drawing>
-          <wp:inline distT="0" distB="0" distL="0" distR="0" wp14:anchorId="351985AB" wp14:editId="351985AC">
+          <wp:inline distT="0" distB="0" distL="0" distR="0" wp14:anchorId="65ED6E6E" wp14:editId="65ED6E6F">
             <wp:extent cx="3467100" cy="2600324"/>
             <wp:effectExtent l="0" t="0" r="0" b="0"/>
-            <wp:docPr id="56" name="Picture"/>
+            <wp:docPr id="89" name="Picture"/>
             <wp:cNvGraphicFramePr/>
             <a:graphic xmlns:a="http://schemas.openxmlformats.org/drawingml/2006/main">
               <a:graphicData uri="http://schemas.openxmlformats.org/drawingml/2006/picture">
                 <pic:pic xmlns:pic="http://schemas.openxmlformats.org/drawingml/2006/picture">
                   <pic:nvPicPr>
-                    <pic:cNvPr id="57" name="Picture" descr="./A_Results/Model02_Andy/Posterior_predictive_dist_mod02_Andy_MWinter.png"/>
+                    <pic:cNvPr id="90" name="Picture" descr="./A_Results/Model02_Andy/Posterior_predictive_dist_mod02_Andy_MWinter.png"/>
                     <pic:cNvPicPr>
                       <a:picLocks noChangeAspect="1" noChangeArrowheads="1"/>
                     </pic:cNvPicPr>
                   </pic:nvPicPr>
                   <pic:blipFill>
-                    <a:blip r:embed="rId19"/>
+                    <a:blip r:embed="rId30"/>
                     <a:stretch>
                       <a:fillRect/>
                     </a:stretch>
@@ -2872,22 +3413,22 @@
           <w:noProof/>
         </w:rPr>
         <w:drawing>
-          <wp:inline distT="0" distB="0" distL="0" distR="0" wp14:anchorId="351985AD" wp14:editId="351985AE">
+          <wp:inline distT="0" distB="0" distL="0" distR="0" wp14:anchorId="65ED6E70" wp14:editId="65ED6E71">
             <wp:extent cx="3467100" cy="2600324"/>
             <wp:effectExtent l="0" t="0" r="0" b="0"/>
-            <wp:docPr id="59" name="Picture"/>
+            <wp:docPr id="92" name="Picture"/>
             <wp:cNvGraphicFramePr/>
             <a:graphic xmlns:a="http://schemas.openxmlformats.org/drawingml/2006/main">
               <a:graphicData uri="http://schemas.openxmlformats.org/drawingml/2006/picture">
                 <pic:pic xmlns:pic="http://schemas.openxmlformats.org/drawingml/2006/picture">
                   <pic:nvPicPr>
-                    <pic:cNvPr id="60" name="Picture" descr="./A_Results/Model02_SSMU/Posterior_predictive_dist_mod02_SSMU.png"/>
+                    <pic:cNvPr id="93" name="Picture" descr="./A_Results/Model02_SSMU/Posterior_predictive_dist_mod02_SSMU.png"/>
                     <pic:cNvPicPr>
                       <a:picLocks noChangeAspect="1" noChangeArrowheads="1"/>
                     </pic:cNvPicPr>
                   </pic:nvPicPr>
                   <pic:blipFill>
-                    <a:blip r:embed="rId20"/>
+                    <a:blip r:embed="rId31"/>
                     <a:stretch>
                       <a:fillRect/>
                     </a:stretch>
@@ -11207,7 +11748,7 @@
   <w:abstractNum w:abstractNumId="0" w15:restartNumberingAfterBreak="0">
     <w:nsid w:val="0000A990"/>
     <w:multiLevelType w:val="multilevel"/>
-    <w:tmpl w:val="63AE7EC6"/>
+    <w:tmpl w:val="C0D649B0"/>
     <w:lvl w:ilvl="0">
       <w:numFmt w:val="bullet"/>
       <w:lvlText w:val=" "/>
@@ -11281,7 +11822,7 @@
       </w:pPr>
     </w:lvl>
   </w:abstractNum>
-  <w:num w:numId="1" w16cid:durableId="1905987442">
+  <w:num w:numId="1" w16cid:durableId="1482968975">
     <w:abstractNumId w:val="0"/>
   </w:num>
 </w:numbering>

</xml_diff>